<commit_message>
Deploying to gh-pages from  @ ae7acebeab5d3e72c917bdbd3524359666bb6933 🚀
</commit_message>
<xml_diff>
--- a/assets/resume/Resume_Vivek_Bhat.docx
+++ b/assets/resume/Resume_Vivek_Bhat.docx
@@ -1,6 +1,6 @@
 
 <file path=word/document.xml><?xml version="1.0" encoding="utf-8"?>
-<w:document xmlns:wpc="http://schemas.microsoft.com/office/word/2010/wordprocessingCanvas" xmlns:cx="http://schemas.microsoft.com/office/drawing/2014/chartex" xmlns:cx1="http://schemas.microsoft.com/office/drawing/2015/9/8/chartex" xmlns:cx2="http://schemas.microsoft.com/office/drawing/2015/10/21/chartex" xmlns:cx3="http://schemas.microsoft.com/office/drawing/2016/5/9/chartex" xmlns:cx4="http://schemas.microsoft.com/office/drawing/2016/5/10/chartex" xmlns:cx5="http://schemas.microsoft.com/office/drawing/2016/5/11/chartex" xmlns:cx6="http://schemas.microsoft.com/office/drawing/2016/5/12/chartex" xmlns:cx7="http://schemas.microsoft.com/office/drawing/2016/5/13/chartex" xmlns:cx8="http://schemas.microsoft.com/office/drawing/2016/5/14/chartex" xmlns:mc="http://schemas.openxmlformats.org/markup-compatibility/2006" xmlns:aink="http://schemas.microsoft.com/office/drawing/2016/ink" xmlns:am3d="http://schemas.microsoft.com/office/drawing/2017/model3d" xmlns:o="urn:schemas-microsoft-com:office:office" xmlns:r="http://schemas.openxmlformats.org/officeDocument/2006/relationships" xmlns:m="http://schemas.openxmlformats.org/officeDocument/2006/math" xmlns:v="urn:schemas-microsoft-com:vml" xmlns:wp14="http://schemas.microsoft.com/office/word/2010/wordprocessingDrawing" xmlns:wp="http://schemas.openxmlformats.org/drawingml/2006/wordprocessingDrawing" xmlns:w10="urn:schemas-microsoft-com:office:word" xmlns:w="http://schemas.openxmlformats.org/wordprocessingml/2006/main" xmlns:w14="http://schemas.microsoft.com/office/word/2010/wordml" xmlns:w15="http://schemas.microsoft.com/office/word/2012/wordml" xmlns:w16cex="http://schemas.microsoft.com/office/word/2018/wordml/cex" xmlns:w16cid="http://schemas.microsoft.com/office/word/2016/wordml/cid" xmlns:w16="http://schemas.microsoft.com/office/word/2018/wordml" xmlns:w16sdtdh="http://schemas.microsoft.com/office/word/2020/wordml/sdtdatahash" xmlns:w16se="http://schemas.microsoft.com/office/word/2015/wordml/symex" xmlns:wpg="http://schemas.microsoft.com/office/word/2010/wordprocessingGroup" xmlns:wpi="http://schemas.microsoft.com/office/word/2010/wordprocessingInk" xmlns:wne="http://schemas.microsoft.com/office/word/2006/wordml" xmlns:wps="http://schemas.microsoft.com/office/word/2010/wordprocessingShape" mc:Ignorable="w14 w15 w16se w16cid w16 w16cex w16sdtdh wp14">
+<w:document xmlns:wpc="http://schemas.microsoft.com/office/word/2010/wordprocessingCanvas" xmlns:cx="http://schemas.microsoft.com/office/drawing/2014/chartex" xmlns:cx1="http://schemas.microsoft.com/office/drawing/2015/9/8/chartex" xmlns:cx2="http://schemas.microsoft.com/office/drawing/2015/10/21/chartex" xmlns:cx3="http://schemas.microsoft.com/office/drawing/2016/5/9/chartex" xmlns:cx4="http://schemas.microsoft.com/office/drawing/2016/5/10/chartex" xmlns:cx5="http://schemas.microsoft.com/office/drawing/2016/5/11/chartex" xmlns:cx6="http://schemas.microsoft.com/office/drawing/2016/5/12/chartex" xmlns:cx7="http://schemas.microsoft.com/office/drawing/2016/5/13/chartex" xmlns:cx8="http://schemas.microsoft.com/office/drawing/2016/5/14/chartex" xmlns:mc="http://schemas.openxmlformats.org/markup-compatibility/2006" xmlns:aink="http://schemas.microsoft.com/office/drawing/2016/ink" xmlns:am3d="http://schemas.microsoft.com/office/drawing/2017/model3d" xmlns:o="urn:schemas-microsoft-com:office:office" xmlns:oel="http://schemas.microsoft.com/office/2019/extlst" xmlns:r="http://schemas.openxmlformats.org/officeDocument/2006/relationships" xmlns:m="http://schemas.openxmlformats.org/officeDocument/2006/math" xmlns:v="urn:schemas-microsoft-com:vml" xmlns:wp14="http://schemas.microsoft.com/office/word/2010/wordprocessingDrawing" xmlns:wp="http://schemas.openxmlformats.org/drawingml/2006/wordprocessingDrawing" xmlns:w10="urn:schemas-microsoft-com:office:word" xmlns:w="http://schemas.openxmlformats.org/wordprocessingml/2006/main" xmlns:w14="http://schemas.microsoft.com/office/word/2010/wordml" xmlns:w15="http://schemas.microsoft.com/office/word/2012/wordml" xmlns:w16cex="http://schemas.microsoft.com/office/word/2018/wordml/cex" xmlns:w16cid="http://schemas.microsoft.com/office/word/2016/wordml/cid" xmlns:w16="http://schemas.microsoft.com/office/word/2018/wordml" xmlns:w16sdtdh="http://schemas.microsoft.com/office/word/2020/wordml/sdtdatahash" xmlns:w16se="http://schemas.microsoft.com/office/word/2015/wordml/symex" xmlns:wpg="http://schemas.microsoft.com/office/word/2010/wordprocessingGroup" xmlns:wpi="http://schemas.microsoft.com/office/word/2010/wordprocessingInk" xmlns:wne="http://schemas.microsoft.com/office/word/2006/wordml" xmlns:wps="http://schemas.microsoft.com/office/word/2010/wordprocessingShape" mc:Ignorable="w14 w15 w16se w16cid w16 w16cex w16sdtdh wp14">
   <w:body>
     <w:p>
       <w:pPr>
@@ -9,8 +9,8 @@
           <w:rFonts w:ascii="Times" w:hAnsi="Times" w:cs="Times New Roman"/>
           <w:smallCaps/>
           <w:color w:val="auto"/>
-          <w:sz w:val="96"/>
-          <w:szCs w:val="96"/>
+          <w:sz w:val="80"/>
+          <w:szCs w:val="80"/>
           <w:u w:val="none"/>
         </w:rPr>
       </w:pPr>
@@ -18,8 +18,8 @@
         <w:rPr>
           <w:rFonts w:ascii="Times" w:hAnsi="Times" w:cs="Times New Roman"/>
           <w:smallCaps/>
-          <w:sz w:val="72"/>
-          <w:szCs w:val="72"/>
+          <w:sz w:val="80"/>
+          <w:szCs w:val="80"/>
         </w:rPr>
         <w:t>V</w:t>
       </w:r>
@@ -27,8 +27,8 @@
         <w:rPr>
           <w:rFonts w:ascii="Times" w:hAnsi="Times" w:cs="Times New Roman"/>
           <w:smallCaps/>
-          <w:sz w:val="56"/>
-          <w:szCs w:val="56"/>
+          <w:sz w:val="80"/>
+          <w:szCs w:val="80"/>
         </w:rPr>
         <w:t xml:space="preserve">IVEK </w:t>
       </w:r>
@@ -36,8 +36,8 @@
         <w:rPr>
           <w:rFonts w:ascii="Times" w:hAnsi="Times" w:cs="Times New Roman"/>
           <w:smallCaps/>
-          <w:sz w:val="72"/>
-          <w:szCs w:val="72"/>
+          <w:sz w:val="80"/>
+          <w:szCs w:val="80"/>
         </w:rPr>
         <w:t>B</w:t>
       </w:r>
@@ -45,10 +45,19 @@
         <w:rPr>
           <w:rFonts w:ascii="Times" w:hAnsi="Times" w:cs="Times New Roman"/>
           <w:smallCaps/>
-          <w:sz w:val="56"/>
-          <w:szCs w:val="56"/>
+          <w:sz w:val="80"/>
+          <w:szCs w:val="80"/>
         </w:rPr>
         <w:t>HAT</w:t>
+      </w:r>
+      <w:r>
+        <w:rPr>
+          <w:rFonts w:ascii="Times" w:hAnsi="Times" w:cs="Times New Roman"/>
+          <w:smallCaps/>
+          <w:sz w:val="80"/>
+          <w:szCs w:val="80"/>
+        </w:rPr>
+        <w:t xml:space="preserve">           </w:t>
       </w:r>
     </w:p>
     <w:p>
@@ -92,20 +101,13 @@
           <w:szCs w:val="20"/>
           <w:u w:val="none"/>
         </w:rPr>
-        <w:t>vbhat@ncsu.edu</w:t>
+        <w:t>bhatvivek93@gmail.com</w:t>
       </w:r>
     </w:p>
     <w:p>
       <w:pPr>
         <w:ind w:left="274"/>
         <w:jc w:val="right"/>
-        <w:rPr>
-          <w:color w:val="000000" w:themeColor="text1"/>
-          <w:sz w:val="20"/>
-          <w:szCs w:val="20"/>
-        </w:rPr>
-      </w:pPr>
-      <w:r>
         <w:rPr>
           <w:rStyle w:val="Hyperlink"/>
           <w:color w:val="000000" w:themeColor="text1"/>
@@ -113,10 +115,7 @@
           <w:szCs w:val="20"/>
           <w:u w:val="none"/>
         </w:rPr>
-        <w:t>https://</w:t>
-      </w:r>
-      <w:bookmarkStart w:id="0" w:name="EXPERIENCE"/>
-      <w:bookmarkEnd w:id="0"/>
+      </w:pPr>
       <w:r>
         <w:rPr>
           <w:rStyle w:val="Hyperlink"/>
@@ -125,15 +124,27 @@
           <w:szCs w:val="20"/>
           <w:u w:val="none"/>
         </w:rPr>
-        <w:t>bhatvivek.com</w:t>
-      </w:r>
-      <w:r>
-        <w:rPr>
+        <w:t>+1 (919) 945</w:t>
+      </w:r>
+      <w:r>
+        <w:rPr>
+          <w:rStyle w:val="Hyperlink"/>
           <w:color w:val="000000" w:themeColor="text1"/>
           <w:sz w:val="20"/>
           <w:szCs w:val="20"/>
-        </w:rPr>
-        <w:t xml:space="preserve">   </w:t>
+          <w:u w:val="none"/>
+        </w:rPr>
+        <w:t>-</w:t>
+      </w:r>
+      <w:r>
+        <w:rPr>
+          <w:rStyle w:val="Hyperlink"/>
+          <w:color w:val="000000" w:themeColor="text1"/>
+          <w:sz w:val="20"/>
+          <w:szCs w:val="20"/>
+          <w:u w:val="none"/>
+        </w:rPr>
+        <w:t>6947</w:t>
       </w:r>
     </w:p>
     <w:p>
@@ -141,47 +152,41 @@
         <w:ind w:left="274"/>
         <w:jc w:val="right"/>
         <w:rPr>
+          <w:rStyle w:val="Hyperlink"/>
+          <w:color w:val="000000" w:themeColor="text1"/>
           <w:sz w:val="20"/>
           <w:szCs w:val="20"/>
-        </w:rPr>
-      </w:pPr>
-      <w:hyperlink r:id="rId11" w:history="1">
-        <w:r>
-          <w:rPr>
-            <w:rStyle w:val="Hyperlink"/>
-            <w:color w:val="auto"/>
-            <w:sz w:val="20"/>
-            <w:szCs w:val="20"/>
-            <w:u w:val="none"/>
-          </w:rPr>
-          <w:t>github.com/</w:t>
-        </w:r>
-        <w:proofErr w:type="spellStart"/>
-        <w:r>
-          <w:rPr>
-            <w:rStyle w:val="Hyperlink"/>
-            <w:color w:val="auto"/>
-            <w:sz w:val="20"/>
-            <w:szCs w:val="20"/>
-            <w:u w:val="none"/>
-          </w:rPr>
-          <w:t>VivekBhat</w:t>
-        </w:r>
-        <w:proofErr w:type="spellEnd"/>
-      </w:hyperlink>
-      <w:r>
-        <w:rPr>
+          <w:u w:val="none"/>
+        </w:rPr>
+      </w:pPr>
+      <w:r>
+        <w:rPr>
+          <w:rStyle w:val="Hyperlink"/>
+          <w:color w:val="000000" w:themeColor="text1"/>
           <w:sz w:val="20"/>
           <w:szCs w:val="20"/>
-        </w:rPr>
-        <w:t xml:space="preserve"> </w:t>
-      </w:r>
-      <w:r>
-        <w:rPr>
+          <w:u w:val="none"/>
+        </w:rPr>
+        <w:t>bhatvivek.com</w:t>
+      </w:r>
+    </w:p>
+    <w:p>
+      <w:pPr>
+        <w:ind w:left="274"/>
+        <w:jc w:val="right"/>
+        <w:rPr>
+          <w:color w:val="000000" w:themeColor="text1"/>
           <w:sz w:val="20"/>
           <w:szCs w:val="20"/>
         </w:rPr>
-        <w:t xml:space="preserve">  </w:t>
+      </w:pPr>
+      <w:r>
+        <w:rPr>
+          <w:color w:val="000000" w:themeColor="text1"/>
+          <w:sz w:val="20"/>
+          <w:szCs w:val="20"/>
+        </w:rPr>
+        <w:t>github.com/vivekbhat</w:t>
       </w:r>
     </w:p>
     <w:p>
@@ -193,6 +198,7 @@
           <w:szCs w:val="20"/>
         </w:rPr>
         <w:sectPr>
+          <w:headerReference w:type="default" r:id="rId11"/>
           <w:type w:val="continuous"/>
           <w:pgSz w:w="11910" w:h="16840"/>
           <w:pgMar w:top="520" w:right="570" w:bottom="630" w:left="540" w:header="250" w:footer="720" w:gutter="0"/>
@@ -205,17 +211,8 @@
             <w:sz w:val="20"/>
             <w:szCs w:val="20"/>
           </w:rPr>
-          <w:t>linkedin.com/in/</w:t>
+          <w:t>linkedin.com/in/vivek-bhat</w:t>
         </w:r>
-        <w:proofErr w:type="spellStart"/>
-        <w:r>
-          <w:rPr>
-            <w:sz w:val="20"/>
-            <w:szCs w:val="20"/>
-          </w:rPr>
-          <w:t>vivek-bhat</w:t>
-        </w:r>
-        <w:proofErr w:type="spellEnd"/>
       </w:hyperlink>
     </w:p>
     <w:p>
@@ -239,53 +236,8 @@
           <w:b/>
           <w:bCs/>
           <w:smallCaps/>
-          <w:sz w:val="24"/>
-          <w:szCs w:val="24"/>
-        </w:rPr>
-      </w:pPr>
-      <w:r>
-        <w:rPr>
-          <w:b/>
-          <w:bCs/>
-          <w:smallCaps/>
-          <w:sz w:val="24"/>
-          <w:szCs w:val="24"/>
-        </w:rPr>
-        <w:t>S</w:t>
-      </w:r>
-      <w:r>
-        <w:rPr>
-          <w:b/>
-          <w:bCs/>
-          <w:smallCaps/>
-          <w:sz w:val="24"/>
-          <w:szCs w:val="24"/>
-        </w:rPr>
-        <w:t>um</w:t>
-      </w:r>
-      <w:r>
-        <w:rPr>
-          <w:b/>
-          <w:bCs/>
-          <w:smallCaps/>
-          <w:sz w:val="24"/>
-          <w:szCs w:val="24"/>
-        </w:rPr>
-        <w:t>mary</w:t>
-      </w:r>
-    </w:p>
-    <w:p>
-      <w:pPr>
-        <w:pBdr>
-          <w:bottom w:val="single" w:sz="6" w:space="1" w:color="auto"/>
-        </w:pBdr>
-        <w:spacing w:before="120"/>
-        <w:rPr>
-          <w:b/>
-          <w:bCs/>
-          <w:smallCaps/>
-          <w:sz w:val="24"/>
-          <w:szCs w:val="24"/>
+          <w:sz w:val="28"/>
+          <w:szCs w:val="28"/>
         </w:rPr>
         <w:sectPr>
           <w:type w:val="continuous"/>
@@ -294,40 +246,83 @@
           <w:cols w:space="720"/>
         </w:sectPr>
       </w:pPr>
-    </w:p>
-    <w:p>
-      <w:pPr>
+      <w:r>
+        <w:rPr>
+          <w:b/>
+          <w:bCs/>
+          <w:smallCaps/>
+          <w:sz w:val="28"/>
+          <w:szCs w:val="28"/>
+        </w:rPr>
+        <w:t>S</w:t>
+      </w:r>
+      <w:r>
+        <w:rPr>
+          <w:b/>
+          <w:bCs/>
+          <w:smallCaps/>
+          <w:sz w:val="28"/>
+          <w:szCs w:val="28"/>
+        </w:rPr>
+        <w:t>um</w:t>
+      </w:r>
+      <w:r>
+        <w:rPr>
+          <w:b/>
+          <w:bCs/>
+          <w:smallCaps/>
+          <w:sz w:val="28"/>
+          <w:szCs w:val="28"/>
+        </w:rPr>
+        <w:t>mary</w:t>
+      </w:r>
+    </w:p>
+    <w:p>
+      <w:pPr>
+        <w:spacing w:before="60"/>
         <w:jc w:val="both"/>
       </w:pPr>
       <w:r>
-        <w:t xml:space="preserve">Certified AWS Solutions Architect and Developer. </w:t>
-      </w:r>
-      <w:r>
-        <w:t>E</w:t>
-      </w:r>
-      <w:r>
-        <w:t>xperience</w:t>
-      </w:r>
-      <w:r>
-        <w:t xml:space="preserve">d </w:t>
-      </w:r>
-      <w:r>
-        <w:t xml:space="preserve">software </w:t>
-      </w:r>
-      <w:r>
-        <w:t xml:space="preserve">engineer, avid clean coder, adept at rapid prototyping, designing, </w:t>
-      </w:r>
-      <w:r>
-        <w:t>developing,</w:t>
-      </w:r>
-      <w:r>
-        <w:t xml:space="preserve"> and deploying AI and Big Data </w:t>
-      </w:r>
-      <w:r>
-        <w:t xml:space="preserve">solutions </w:t>
-      </w:r>
-      <w:r>
-        <w:t>in an Agile environment.</w:t>
+        <w:t xml:space="preserve">Dynamic and certified AWS Solutions Architect and Developer with over </w:t>
+      </w:r>
+      <w:r>
+        <w:t xml:space="preserve">6 </w:t>
+      </w:r>
+      <w:r>
+        <w:t xml:space="preserve">years of </w:t>
+      </w:r>
+      <w:r>
+        <w:t xml:space="preserve">professional </w:t>
+      </w:r>
+      <w:r>
+        <w:t xml:space="preserve">experience in spearheading software development projects in globally recognized organizations. </w:t>
+      </w:r>
+      <w:r>
+        <w:rPr>
+          <w:bCs/>
+        </w:rPr>
+        <w:t xml:space="preserve">Recognized </w:t>
+      </w:r>
+      <w:r>
+        <w:t xml:space="preserve">for </w:t>
+      </w:r>
+      <w:r>
+        <w:t>ownership</w:t>
+      </w:r>
+      <w:r>
+        <w:t xml:space="preserve">, </w:t>
+      </w:r>
+      <w:r>
+        <w:t xml:space="preserve">deep dive, </w:t>
+      </w:r>
+      <w:r>
+        <w:t xml:space="preserve">rapid prototyping, and deploying </w:t>
+      </w:r>
+      <w:r>
+        <w:t xml:space="preserve">clean and </w:t>
+      </w:r>
+      <w:r>
+        <w:t>robust software solutions aligned with Agile methodologies.</w:t>
       </w:r>
     </w:p>
     <w:p>
@@ -340,8 +335,8 @@
           <w:b/>
           <w:bCs/>
           <w:smallCaps/>
-          <w:sz w:val="24"/>
-          <w:szCs w:val="24"/>
+          <w:sz w:val="28"/>
+          <w:szCs w:val="28"/>
         </w:rPr>
       </w:pPr>
       <w:r>
@@ -349,10 +344,69 @@
           <w:b/>
           <w:bCs/>
           <w:smallCaps/>
-          <w:sz w:val="24"/>
-          <w:szCs w:val="24"/>
+          <w:sz w:val="28"/>
+          <w:szCs w:val="28"/>
         </w:rPr>
         <w:t>Core Technical Competencies</w:t>
+      </w:r>
+    </w:p>
+    <w:p>
+      <w:pPr>
+        <w:pStyle w:val="ListParagraph"/>
+        <w:spacing w:before="60"/>
+        <w:ind w:left="2160" w:hanging="2160"/>
+        <w:jc w:val="both"/>
+      </w:pPr>
+      <w:r>
+        <w:rPr>
+          <w:b/>
+        </w:rPr>
+        <w:t>P</w:t>
+      </w:r>
+      <w:r>
+        <w:rPr>
+          <w:b/>
+        </w:rPr>
+        <w:t>rogramming</w:t>
+      </w:r>
+      <w:r>
+        <w:rPr>
+          <w:b/>
+        </w:rPr>
+        <w:tab/>
+      </w:r>
+      <w:r>
+        <w:t>Java</w:t>
+      </w:r>
+      <w:r>
+        <w:t>, Java</w:t>
+      </w:r>
+      <w:r>
+        <w:t xml:space="preserve">Script, </w:t>
+      </w:r>
+      <w:r>
+        <w:t xml:space="preserve">TypeScript, Angular, </w:t>
+      </w:r>
+      <w:r>
+        <w:t xml:space="preserve">Python, </w:t>
+      </w:r>
+      <w:r>
+        <w:t>Flask</w:t>
+      </w:r>
+      <w:r>
+        <w:t>,</w:t>
+      </w:r>
+      <w:r>
+        <w:t xml:space="preserve"> Ansible,</w:t>
+      </w:r>
+      <w:r>
+        <w:t xml:space="preserve"> NodeJS, </w:t>
+      </w:r>
+      <w:r>
+        <w:t xml:space="preserve">ReactJS, </w:t>
+      </w:r>
+      <w:r>
+        <w:t>SQL</w:t>
       </w:r>
     </w:p>
     <w:p>
@@ -366,13 +420,13 @@
         <w:rPr>
           <w:b/>
         </w:rPr>
-        <w:t>P</w:t>
+        <w:t>T</w:t>
       </w:r>
       <w:r>
         <w:rPr>
           <w:b/>
         </w:rPr>
-        <w:t>rogramming</w:t>
+        <w:t>ools &amp; Utilities</w:t>
       </w:r>
       <w:r>
         <w:rPr>
@@ -381,93 +435,46 @@
         <w:tab/>
       </w:r>
       <w:r>
-        <w:t>Java</w:t>
+        <w:t>AWS</w:t>
+      </w:r>
+      <w:r>
+        <w:t>, Azure</w:t>
+      </w:r>
+      <w:r>
+        <w:t>,</w:t>
+      </w:r>
+      <w:r>
+        <w:t xml:space="preserve"> </w:t>
+      </w:r>
+      <w:r>
+        <w:t xml:space="preserve">Spring Boot, </w:t>
+      </w:r>
+      <w:r>
+        <w:t xml:space="preserve">Rally, </w:t>
+      </w:r>
+      <w:r>
+        <w:t xml:space="preserve">Git, </w:t>
+      </w:r>
+      <w:r>
+        <w:t>Docker</w:t>
       </w:r>
       <w:r>
         <w:t xml:space="preserve">, </w:t>
       </w:r>
       <w:r>
-        <w:t xml:space="preserve">C#, </w:t>
-      </w:r>
-      <w:r>
-        <w:t>Java</w:t>
-      </w:r>
-      <w:r>
-        <w:t xml:space="preserve">Script, </w:t>
-      </w:r>
-      <w:r>
-        <w:t xml:space="preserve">TypeScript, Angular, </w:t>
-      </w:r>
-      <w:r>
-        <w:t xml:space="preserve">Python, </w:t>
-      </w:r>
-      <w:r>
-        <w:t>Flask</w:t>
-      </w:r>
-      <w:r>
-        <w:t>,</w:t>
-      </w:r>
-      <w:r>
-        <w:t xml:space="preserve"> Ansible,</w:t>
-      </w:r>
-      <w:r>
-        <w:t xml:space="preserve"> NodeJS, </w:t>
-      </w:r>
-      <w:r>
-        <w:t>SQL</w:t>
-      </w:r>
-    </w:p>
-    <w:p>
-      <w:pPr>
-        <w:pStyle w:val="ListParagraph"/>
-        <w:spacing w:before="0"/>
-        <w:ind w:left="2160" w:hanging="2160"/>
-        <w:jc w:val="both"/>
-      </w:pPr>
-      <w:r>
-        <w:rPr>
-          <w:b/>
-        </w:rPr>
-        <w:t>T</w:t>
-      </w:r>
-      <w:r>
-        <w:rPr>
-          <w:b/>
-        </w:rPr>
-        <w:t>ools &amp; Utilities</w:t>
-      </w:r>
-      <w:r>
-        <w:rPr>
-          <w:b/>
-        </w:rPr>
-        <w:tab/>
-      </w:r>
-      <w:r>
-        <w:t>AWS</w:t>
-      </w:r>
-      <w:r>
-        <w:t>, Azure</w:t>
-      </w:r>
-      <w:r>
-        <w:t>,</w:t>
-      </w:r>
-      <w:r>
-        <w:t xml:space="preserve"> </w:t>
-      </w:r>
-      <w:r>
-        <w:t xml:space="preserve">Spring Boot, </w:t>
-      </w:r>
-      <w:r>
-        <w:t xml:space="preserve">Rally, </w:t>
-      </w:r>
-      <w:r>
-        <w:t xml:space="preserve">Git, </w:t>
-      </w:r>
-      <w:r>
-        <w:t>Docker</w:t>
-      </w:r>
-      <w:r>
-        <w:t>, Elasticsearch, Logstash, Kibana, Maven</w:t>
+        <w:t xml:space="preserve">Kubernetes, </w:t>
+      </w:r>
+      <w:r>
+        <w:t>Elastic</w:t>
+      </w:r>
+      <w:r>
+        <w:t>s</w:t>
+      </w:r>
+      <w:r>
+        <w:t xml:space="preserve">earch, Logstash, Kibana, </w:t>
+      </w:r>
+      <w:r>
+        <w:t>Gradle</w:t>
       </w:r>
     </w:p>
     <w:p>
@@ -518,8 +525,8 @@
           <w:b/>
           <w:bCs/>
           <w:smallCaps/>
-          <w:sz w:val="24"/>
-          <w:szCs w:val="24"/>
+          <w:sz w:val="28"/>
+          <w:szCs w:val="28"/>
         </w:rPr>
       </w:pPr>
       <w:r>
@@ -527,8 +534,8 @@
           <w:b/>
           <w:bCs/>
           <w:smallCaps/>
-          <w:sz w:val="24"/>
-          <w:szCs w:val="24"/>
+          <w:sz w:val="28"/>
+          <w:szCs w:val="28"/>
         </w:rPr>
         <w:t>Professional Experience</w:t>
       </w:r>
@@ -551,21 +558,14 @@
           <w:sz w:val="22"/>
           <w:szCs w:val="22"/>
         </w:rPr>
-        <w:t>Microsoft, Redmond, WA</w:t>
-      </w:r>
-      <w:r>
-        <w:rPr>
-          <w:sz w:val="22"/>
-          <w:szCs w:val="22"/>
-        </w:rPr>
-        <w:t>,</w:t>
-      </w:r>
-      <w:r>
-        <w:rPr>
-          <w:sz w:val="22"/>
-          <w:szCs w:val="22"/>
-        </w:rPr>
-        <w:t xml:space="preserve"> Software </w:t>
+        <w:t>AMAZON</w:t>
+      </w:r>
+      <w:r>
+        <w:rPr>
+          <w:sz w:val="22"/>
+          <w:szCs w:val="22"/>
+        </w:rPr>
+        <w:t xml:space="preserve">, Software </w:t>
       </w:r>
       <w:r>
         <w:rPr>
@@ -579,6 +579,21 @@
           <w:sz w:val="22"/>
           <w:szCs w:val="22"/>
         </w:rPr>
+        <w:t xml:space="preserve"> </w:t>
+      </w:r>
+      <w:r>
+        <w:rPr>
+          <w:sz w:val="22"/>
+          <w:szCs w:val="22"/>
+        </w:rPr>
+        <w:tab/>
+      </w:r>
+      <w:r>
+        <w:rPr>
+          <w:sz w:val="22"/>
+          <w:szCs w:val="22"/>
+        </w:rPr>
+        <w:tab/>
         <w:t xml:space="preserve"> </w:t>
       </w:r>
       <w:r>
@@ -616,7 +631,76 @@
           <w:szCs w:val="22"/>
         </w:rPr>
         <w:tab/>
-        <w:t xml:space="preserve">      </w:t>
+      </w:r>
+      <w:r>
+        <w:rPr>
+          <w:sz w:val="22"/>
+          <w:szCs w:val="22"/>
+        </w:rPr>
+        <w:t xml:space="preserve">     Ju</w:t>
+      </w:r>
+      <w:r>
+        <w:rPr>
+          <w:sz w:val="22"/>
+          <w:szCs w:val="22"/>
+        </w:rPr>
+        <w:t>ne</w:t>
+      </w:r>
+      <w:r>
+        <w:rPr>
+          <w:sz w:val="22"/>
+          <w:szCs w:val="22"/>
+        </w:rPr>
+        <w:t xml:space="preserve"> 202</w:t>
+      </w:r>
+      <w:r>
+        <w:rPr>
+          <w:sz w:val="22"/>
+          <w:szCs w:val="22"/>
+        </w:rPr>
+        <w:t>2</w:t>
+      </w:r>
+      <w:r>
+        <w:rPr>
+          <w:sz w:val="22"/>
+          <w:szCs w:val="22"/>
+        </w:rPr>
+        <w:t xml:space="preserve"> – </w:t>
+      </w:r>
+      <w:r>
+        <w:rPr>
+          <w:sz w:val="22"/>
+          <w:szCs w:val="22"/>
+        </w:rPr>
+        <w:t>Sep 2023</w:t>
+      </w:r>
+    </w:p>
+    <w:p>
+      <w:pPr>
+        <w:pStyle w:val="Heading2"/>
+        <w:spacing w:before="60"/>
+        <w:ind w:left="86"/>
+        <w:rPr>
+          <w:b w:val="0"/>
+          <w:sz w:val="22"/>
+          <w:szCs w:val="22"/>
+        </w:rPr>
+      </w:pPr>
+      <w:r>
+        <w:rPr>
+          <w:sz w:val="22"/>
+          <w:szCs w:val="22"/>
+        </w:rPr>
+        <w:t xml:space="preserve">Project: </w:t>
+      </w:r>
+      <w:r>
+        <w:rPr>
+          <w:b w:val="0"/>
+          <w:bCs w:val="0"/>
+          <w:sz w:val="22"/>
+          <w:szCs w:val="22"/>
+        </w:rPr>
+        <w:t>Amazon</w:t>
       </w:r>
       <w:r>
         <w:rPr>
@@ -627,43 +711,17 @@
       </w:r>
       <w:r>
         <w:rPr>
-          <w:i/>
-          <w:iCs/>
-          <w:sz w:val="22"/>
-          <w:szCs w:val="22"/>
-        </w:rPr>
-        <w:t>June 2021 – Present</w:t>
-      </w:r>
-    </w:p>
-    <w:p>
-      <w:pPr>
-        <w:pStyle w:val="Heading2"/>
-        <w:spacing w:before="0"/>
-        <w:ind w:left="86"/>
-        <w:rPr>
-          <w:b w:val="0"/>
-          <w:sz w:val="22"/>
-          <w:szCs w:val="22"/>
-        </w:rPr>
-      </w:pPr>
-      <w:r>
-        <w:rPr>
-          <w:sz w:val="22"/>
-          <w:szCs w:val="22"/>
-        </w:rPr>
-        <w:t xml:space="preserve">Project: </w:t>
-      </w:r>
-      <w:r>
-        <w:rPr>
           <w:b w:val="0"/>
           <w:bCs w:val="0"/>
           <w:sz w:val="22"/>
           <w:szCs w:val="22"/>
         </w:rPr>
-        <w:t>Azure</w:t>
-      </w:r>
-      <w:r>
-        <w:rPr>
+        <w:t>Same</w:t>
+      </w:r>
+      <w:r>
+        <w:rPr>
+          <w:b w:val="0"/>
+          <w:bCs w:val="0"/>
           <w:sz w:val="22"/>
           <w:szCs w:val="22"/>
         </w:rPr>
@@ -672,103 +730,11 @@
       <w:r>
         <w:rPr>
           <w:b w:val="0"/>
-          <w:sz w:val="22"/>
-          <w:szCs w:val="22"/>
-        </w:rPr>
-        <w:t>WAN WARP</w:t>
-      </w:r>
-      <w:r>
-        <w:rPr>
-          <w:b w:val="0"/>
-          <w:sz w:val="22"/>
-          <w:szCs w:val="22"/>
-        </w:rPr>
-        <w:t xml:space="preserve"> Networking Microservice</w:t>
-      </w:r>
-      <w:r>
-        <w:rPr>
-          <w:b w:val="0"/>
-          <w:sz w:val="22"/>
-          <w:szCs w:val="22"/>
-        </w:rPr>
-        <w:tab/>
-      </w:r>
-      <w:r>
-        <w:rPr>
-          <w:b w:val="0"/>
-          <w:sz w:val="22"/>
-          <w:szCs w:val="22"/>
-        </w:rPr>
-        <w:tab/>
-      </w:r>
-      <w:r>
-        <w:rPr>
-          <w:b w:val="0"/>
-          <w:sz w:val="22"/>
-          <w:szCs w:val="22"/>
-        </w:rPr>
-        <w:tab/>
-      </w:r>
-      <w:r>
-        <w:rPr>
-          <w:b w:val="0"/>
-          <w:sz w:val="22"/>
-          <w:szCs w:val="22"/>
-        </w:rPr>
-        <w:tab/>
-      </w:r>
-      <w:r>
-        <w:rPr>
-          <w:b w:val="0"/>
-          <w:sz w:val="22"/>
-          <w:szCs w:val="22"/>
-        </w:rPr>
-        <w:tab/>
-      </w:r>
-      <w:r>
-        <w:rPr>
-          <w:b w:val="0"/>
-          <w:sz w:val="22"/>
-          <w:szCs w:val="22"/>
-        </w:rPr>
-        <w:tab/>
-      </w:r>
-      <w:r>
-        <w:rPr>
-          <w:b w:val="0"/>
-          <w:sz w:val="22"/>
-          <w:szCs w:val="22"/>
-        </w:rPr>
-        <w:tab/>
-      </w:r>
-    </w:p>
-    <w:p>
-      <w:pPr>
-        <w:pStyle w:val="Heading2"/>
-        <w:spacing w:before="0"/>
-        <w:ind w:left="86"/>
-        <w:rPr>
-          <w:b w:val="0"/>
           <w:bCs w:val="0"/>
           <w:sz w:val="22"/>
           <w:szCs w:val="22"/>
         </w:rPr>
-      </w:pPr>
-      <w:r>
-        <w:rPr>
-          <w:sz w:val="22"/>
-          <w:szCs w:val="22"/>
-        </w:rPr>
-        <w:t xml:space="preserve">Role: </w:t>
-      </w:r>
-      <w:r>
-        <w:rPr>
-          <w:b w:val="0"/>
-          <w:bCs w:val="0"/>
-          <w:sz w:val="22"/>
-          <w:szCs w:val="22"/>
-        </w:rPr>
-        <w:t>Backend Software Engineering</w:t>
+        <w:t>Day Store</w:t>
       </w:r>
     </w:p>
     <w:p>
@@ -793,95 +759,23 @@
           <w:sz w:val="22"/>
           <w:szCs w:val="22"/>
         </w:rPr>
-        <w:t xml:space="preserve">Owner of </w:t>
-      </w:r>
-      <w:r>
-        <w:rPr>
-          <w:b w:val="0"/>
-          <w:sz w:val="22"/>
-          <w:szCs w:val="22"/>
-        </w:rPr>
-        <w:t>a</w:t>
-      </w:r>
-      <w:r>
-        <w:rPr>
-          <w:b w:val="0"/>
-          <w:sz w:val="22"/>
-          <w:szCs w:val="22"/>
-        </w:rPr>
-        <w:t xml:space="preserve"> </w:t>
-      </w:r>
-      <w:r>
-        <w:rPr>
-          <w:b w:val="0"/>
-          <w:sz w:val="22"/>
-          <w:szCs w:val="22"/>
-        </w:rPr>
-        <w:t xml:space="preserve">service </w:t>
-      </w:r>
-      <w:r>
-        <w:rPr>
-          <w:b w:val="0"/>
-          <w:sz w:val="22"/>
-          <w:szCs w:val="22"/>
-        </w:rPr>
-        <w:t xml:space="preserve">that lets </w:t>
-      </w:r>
-      <w:r>
-        <w:rPr>
-          <w:b w:val="0"/>
-          <w:sz w:val="22"/>
-          <w:szCs w:val="22"/>
-        </w:rPr>
-        <w:t xml:space="preserve">users </w:t>
-      </w:r>
-      <w:r>
-        <w:rPr>
-          <w:b w:val="0"/>
-          <w:sz w:val="22"/>
-          <w:szCs w:val="22"/>
-        </w:rPr>
-        <w:t>deploy configuration update</w:t>
-      </w:r>
-      <w:r>
-        <w:rPr>
-          <w:b w:val="0"/>
-          <w:sz w:val="22"/>
-          <w:szCs w:val="22"/>
-        </w:rPr>
-        <w:t>s</w:t>
-      </w:r>
-      <w:r>
-        <w:rPr>
-          <w:b w:val="0"/>
-          <w:sz w:val="22"/>
-          <w:szCs w:val="22"/>
-        </w:rPr>
-        <w:t xml:space="preserve"> </w:t>
-      </w:r>
-      <w:r>
-        <w:rPr>
-          <w:b w:val="0"/>
-          <w:sz w:val="22"/>
-          <w:szCs w:val="22"/>
-        </w:rPr>
-        <w:t xml:space="preserve">and interact with thousands of devices </w:t>
-      </w:r>
-      <w:r>
-        <w:rPr>
-          <w:b w:val="0"/>
-          <w:sz w:val="22"/>
-          <w:szCs w:val="22"/>
-        </w:rPr>
-        <w:t xml:space="preserve">across the </w:t>
-      </w:r>
-      <w:r>
-        <w:rPr>
-          <w:b w:val="0"/>
-          <w:sz w:val="22"/>
-          <w:szCs w:val="22"/>
-        </w:rPr>
-        <w:t>world</w:t>
+        <w:t xml:space="preserve">Led the architecture, development, and deployment of scalable </w:t>
+      </w:r>
+      <w:r>
+        <w:rPr>
+          <w:b w:val="0"/>
+          <w:sz w:val="22"/>
+          <w:szCs w:val="22"/>
+        </w:rPr>
+        <w:t xml:space="preserve">software solutions </w:t>
+      </w:r>
+      <w:r>
+        <w:rPr>
+          <w:b w:val="0"/>
+          <w:sz w:val="22"/>
+          <w:szCs w:val="22"/>
+        </w:rPr>
+        <w:t>and microservices.</w:t>
       </w:r>
     </w:p>
     <w:p>
@@ -906,23 +800,71 @@
           <w:sz w:val="22"/>
           <w:szCs w:val="22"/>
         </w:rPr>
-        <w:t xml:space="preserve">Created a mechanism to run python3 scripts and installing dependencies using pip on the fly for </w:t>
-      </w:r>
-      <w:r>
-        <w:rPr>
-          <w:b w:val="0"/>
-          <w:sz w:val="22"/>
-          <w:szCs w:val="22"/>
-        </w:rPr>
-        <w:t>thousands of</w:t>
-      </w:r>
-      <w:r>
-        <w:rPr>
-          <w:b w:val="0"/>
-          <w:sz w:val="22"/>
-          <w:szCs w:val="22"/>
-        </w:rPr>
-        <w:t xml:space="preserve"> routers</w:t>
+        <w:t xml:space="preserve">Pioneered the “Frequently Bought Together” widget, leveraging </w:t>
+      </w:r>
+      <w:r>
+        <w:rPr>
+          <w:bCs w:val="0"/>
+          <w:sz w:val="22"/>
+          <w:szCs w:val="22"/>
+        </w:rPr>
+        <w:t>AI/ML models</w:t>
+      </w:r>
+      <w:r>
+        <w:rPr>
+          <w:b w:val="0"/>
+          <w:sz w:val="22"/>
+          <w:szCs w:val="22"/>
+        </w:rPr>
+        <w:t xml:space="preserve">, </w:t>
+      </w:r>
+      <w:r>
+        <w:rPr>
+          <w:b w:val="0"/>
+          <w:sz w:val="22"/>
+          <w:szCs w:val="22"/>
+        </w:rPr>
+        <w:t>generating</w:t>
+      </w:r>
+      <w:r>
+        <w:rPr>
+          <w:b w:val="0"/>
+          <w:sz w:val="22"/>
+          <w:szCs w:val="22"/>
+        </w:rPr>
+        <w:t xml:space="preserve"> </w:t>
+      </w:r>
+      <w:r>
+        <w:rPr>
+          <w:bCs w:val="0"/>
+          <w:sz w:val="22"/>
+          <w:szCs w:val="22"/>
+        </w:rPr>
+        <w:t>over $110K</w:t>
+      </w:r>
+      <w:r>
+        <w:rPr>
+          <w:bCs w:val="0"/>
+          <w:sz w:val="22"/>
+          <w:szCs w:val="22"/>
+        </w:rPr>
+        <w:t xml:space="preserve"> </w:t>
+      </w:r>
+      <w:r>
+        <w:rPr>
+          <w:b w:val="0"/>
+          <w:sz w:val="22"/>
+          <w:szCs w:val="22"/>
+        </w:rPr>
+        <w:t>in revenue</w:t>
+      </w:r>
+      <w:r>
+        <w:rPr>
+          <w:bCs w:val="0"/>
+          <w:sz w:val="22"/>
+          <w:szCs w:val="22"/>
+        </w:rPr>
+        <w:t>.</w:t>
       </w:r>
     </w:p>
     <w:p>
@@ -947,31 +889,23 @@
           <w:sz w:val="22"/>
           <w:szCs w:val="22"/>
         </w:rPr>
-        <w:t>Reduced configur</w:t>
-      </w:r>
-      <w:r>
-        <w:rPr>
-          <w:b w:val="0"/>
-          <w:sz w:val="22"/>
-          <w:szCs w:val="22"/>
-        </w:rPr>
-        <w:t>ation</w:t>
-      </w:r>
-      <w:r>
-        <w:rPr>
-          <w:b w:val="0"/>
-          <w:sz w:val="22"/>
-          <w:szCs w:val="22"/>
-        </w:rPr>
-        <w:t xml:space="preserve"> setup time </w:t>
-      </w:r>
-      <w:r>
-        <w:rPr>
-          <w:b w:val="0"/>
-          <w:sz w:val="22"/>
-          <w:szCs w:val="22"/>
-        </w:rPr>
-        <w:t xml:space="preserve">to </w:t>
+        <w:t xml:space="preserve">Spearheaded the </w:t>
+      </w:r>
+      <w:r>
+        <w:rPr>
+          <w:b w:val="0"/>
+          <w:sz w:val="22"/>
+          <w:szCs w:val="22"/>
+        </w:rPr>
+        <w:t>development</w:t>
+      </w:r>
+      <w:r>
+        <w:rPr>
+          <w:b w:val="0"/>
+          <w:sz w:val="22"/>
+          <w:szCs w:val="22"/>
+        </w:rPr>
+        <w:t xml:space="preserve"> of a high-throughput inventory catalog service, slashing ticket numbers </w:t>
       </w:r>
       <w:r>
         <w:rPr>
@@ -979,23 +913,203 @@
           <w:sz w:val="22"/>
           <w:szCs w:val="22"/>
         </w:rPr>
-        <w:t xml:space="preserve">50% </w:t>
-      </w:r>
-      <w:r>
-        <w:rPr>
-          <w:b w:val="0"/>
-          <w:sz w:val="22"/>
-          <w:szCs w:val="22"/>
-        </w:rPr>
-        <w:t>by introducing caching of packages</w:t>
-      </w:r>
-      <w:r>
-        <w:rPr>
-          <w:b w:val="0"/>
-          <w:sz w:val="22"/>
-          <w:szCs w:val="22"/>
-        </w:rPr>
-        <w:t xml:space="preserve"> and hashing out cookies</w:t>
+        <w:t xml:space="preserve">by 20% </w:t>
+      </w:r>
+      <w:r>
+        <w:rPr>
+          <w:b w:val="0"/>
+          <w:sz w:val="22"/>
+          <w:szCs w:val="22"/>
+        </w:rPr>
+        <w:t xml:space="preserve">and improving data freshness by over </w:t>
+      </w:r>
+      <w:r>
+        <w:rPr>
+          <w:bCs w:val="0"/>
+          <w:sz w:val="22"/>
+          <w:szCs w:val="22"/>
+        </w:rPr>
+        <w:t>10 hours.</w:t>
+      </w:r>
+    </w:p>
+    <w:p>
+      <w:pPr>
+        <w:pStyle w:val="Heading2"/>
+        <w:numPr>
+          <w:ilvl w:val="0"/>
+          <w:numId w:val="6"/>
+        </w:numPr>
+        <w:spacing w:before="0"/>
+        <w:ind w:left="273" w:hanging="187"/>
+        <w:jc w:val="both"/>
+        <w:rPr>
+          <w:b w:val="0"/>
+          <w:sz w:val="22"/>
+          <w:szCs w:val="22"/>
+        </w:rPr>
+      </w:pPr>
+      <w:r>
+        <w:rPr>
+          <w:b w:val="0"/>
+          <w:sz w:val="22"/>
+          <w:szCs w:val="22"/>
+        </w:rPr>
+        <w:t>Engineered</w:t>
+      </w:r>
+      <w:r>
+        <w:rPr>
+          <w:b w:val="0"/>
+          <w:sz w:val="22"/>
+          <w:szCs w:val="22"/>
+        </w:rPr>
+        <w:t xml:space="preserve"> CI/CD infrastructure design, complete with monitoring, </w:t>
+      </w:r>
+      <w:r>
+        <w:rPr>
+          <w:bCs w:val="0"/>
+          <w:sz w:val="22"/>
+          <w:szCs w:val="22"/>
+        </w:rPr>
+        <w:t>anomaly detection</w:t>
+      </w:r>
+      <w:r>
+        <w:rPr>
+          <w:b w:val="0"/>
+          <w:sz w:val="22"/>
+          <w:szCs w:val="22"/>
+        </w:rPr>
+        <w:t>, and alarms.</w:t>
+      </w:r>
+    </w:p>
+    <w:p>
+      <w:pPr>
+        <w:pStyle w:val="Heading2"/>
+        <w:numPr>
+          <w:ilvl w:val="0"/>
+          <w:numId w:val="6"/>
+        </w:numPr>
+        <w:spacing w:before="0"/>
+        <w:ind w:left="273" w:hanging="187"/>
+        <w:jc w:val="both"/>
+        <w:rPr>
+          <w:b w:val="0"/>
+          <w:sz w:val="22"/>
+          <w:szCs w:val="22"/>
+        </w:rPr>
+      </w:pPr>
+      <w:r>
+        <w:rPr>
+          <w:b w:val="0"/>
+          <w:sz w:val="22"/>
+          <w:szCs w:val="22"/>
+        </w:rPr>
+        <w:t>Played a pivotal role in 24/7 on-call rotations, addressing cross-team production challenges.</w:t>
+      </w:r>
+    </w:p>
+    <w:p>
+      <w:pPr>
+        <w:pStyle w:val="Heading2"/>
+        <w:numPr>
+          <w:ilvl w:val="0"/>
+          <w:numId w:val="6"/>
+        </w:numPr>
+        <w:spacing w:before="0"/>
+        <w:ind w:left="273" w:hanging="187"/>
+        <w:jc w:val="both"/>
+        <w:rPr>
+          <w:b w:val="0"/>
+          <w:sz w:val="22"/>
+          <w:szCs w:val="22"/>
+        </w:rPr>
+      </w:pPr>
+      <w:r>
+        <w:rPr>
+          <w:b w:val="0"/>
+          <w:sz w:val="22"/>
+          <w:szCs w:val="22"/>
+        </w:rPr>
+        <w:t xml:space="preserve">Oversaw extensive online feature experiments, leveraging feature flags </w:t>
+      </w:r>
+      <w:r>
+        <w:rPr>
+          <w:b w:val="0"/>
+          <w:sz w:val="22"/>
+          <w:szCs w:val="22"/>
+        </w:rPr>
+        <w:t>(A/B tests</w:t>
+      </w:r>
+      <w:r>
+        <w:rPr>
+          <w:b w:val="0"/>
+          <w:sz w:val="22"/>
+          <w:szCs w:val="22"/>
+        </w:rPr>
+        <w:t>)</w:t>
+      </w:r>
+      <w:r>
+        <w:rPr>
+          <w:b w:val="0"/>
+          <w:sz w:val="22"/>
+          <w:szCs w:val="22"/>
+        </w:rPr>
+        <w:t xml:space="preserve"> and production traffic</w:t>
+      </w:r>
+      <w:r>
+        <w:rPr>
+          <w:b w:val="0"/>
+          <w:sz w:val="22"/>
+          <w:szCs w:val="22"/>
+        </w:rPr>
+        <w:t>.</w:t>
+      </w:r>
+    </w:p>
+    <w:p>
+      <w:pPr>
+        <w:pStyle w:val="Heading2"/>
+        <w:numPr>
+          <w:ilvl w:val="0"/>
+          <w:numId w:val="6"/>
+        </w:numPr>
+        <w:spacing w:before="0"/>
+        <w:ind w:left="273" w:hanging="187"/>
+        <w:jc w:val="both"/>
+        <w:rPr>
+          <w:b w:val="0"/>
+          <w:sz w:val="22"/>
+          <w:szCs w:val="22"/>
+        </w:rPr>
+      </w:pPr>
+      <w:r>
+        <w:rPr>
+          <w:b w:val="0"/>
+          <w:sz w:val="22"/>
+          <w:szCs w:val="22"/>
+        </w:rPr>
+        <w:t>Developed</w:t>
+      </w:r>
+      <w:r>
+        <w:rPr>
+          <w:b w:val="0"/>
+          <w:sz w:val="22"/>
+          <w:szCs w:val="22"/>
+        </w:rPr>
+        <w:t xml:space="preserve"> fully automated ETL solution</w:t>
+      </w:r>
+      <w:r>
+        <w:rPr>
+          <w:b w:val="0"/>
+          <w:sz w:val="22"/>
+          <w:szCs w:val="22"/>
+        </w:rPr>
+        <w:t>s</w:t>
+      </w:r>
+      <w:r>
+        <w:rPr>
+          <w:b w:val="0"/>
+          <w:sz w:val="22"/>
+          <w:szCs w:val="22"/>
+        </w:rPr>
+        <w:t>, empowering Amazon widgets with data generated by Machine Learning.</w:t>
       </w:r>
     </w:p>
     <w:p>
@@ -1014,35 +1128,21 @@
           <w:sz w:val="22"/>
           <w:szCs w:val="22"/>
         </w:rPr>
-        <w:t>I</w:t>
-      </w:r>
-      <w:r>
-        <w:rPr>
-          <w:sz w:val="22"/>
-          <w:szCs w:val="22"/>
-        </w:rPr>
-        <w:t>ntel</w:t>
-      </w:r>
-      <w:r>
-        <w:rPr>
-          <w:sz w:val="22"/>
-          <w:szCs w:val="22"/>
-        </w:rPr>
-        <w:t>, Hillsboro, Oregon</w:t>
-      </w:r>
-      <w:r>
-        <w:rPr>
-          <w:sz w:val="22"/>
-          <w:szCs w:val="22"/>
-        </w:rPr>
-        <w:t>, Software Development Engineer</w:t>
-      </w:r>
-      <w:r>
-        <w:rPr>
-          <w:sz w:val="22"/>
-          <w:szCs w:val="22"/>
-        </w:rPr>
-        <w:t xml:space="preserve"> </w:t>
+        <w:t>MICROSOFT</w:t>
+      </w:r>
+      <w:r>
+        <w:rPr>
+          <w:sz w:val="22"/>
+          <w:szCs w:val="22"/>
+        </w:rPr>
+        <w:t xml:space="preserve">, Redmond, WA, Software </w:t>
+      </w:r>
+      <w:r>
+        <w:rPr>
+          <w:sz w:val="22"/>
+          <w:szCs w:val="22"/>
+        </w:rPr>
+        <w:t>Development Engineer</w:t>
       </w:r>
       <w:r>
         <w:rPr>
@@ -1071,6 +1171,291 @@
           <w:szCs w:val="22"/>
         </w:rPr>
         <w:tab/>
+        <w:t xml:space="preserve">      </w:t>
+      </w:r>
+      <w:r>
+        <w:rPr>
+          <w:sz w:val="22"/>
+          <w:szCs w:val="22"/>
+        </w:rPr>
+        <w:tab/>
+        <w:t xml:space="preserve">   </w:t>
+      </w:r>
+      <w:r>
+        <w:rPr>
+          <w:sz w:val="22"/>
+          <w:szCs w:val="22"/>
+        </w:rPr>
+        <w:t xml:space="preserve">June 2021 – </w:t>
+      </w:r>
+      <w:r>
+        <w:rPr>
+          <w:sz w:val="22"/>
+          <w:szCs w:val="22"/>
+        </w:rPr>
+        <w:t>June 2022</w:t>
+      </w:r>
+    </w:p>
+    <w:p>
+      <w:pPr>
+        <w:pStyle w:val="Heading2"/>
+        <w:spacing w:before="60"/>
+        <w:ind w:left="86"/>
+        <w:rPr>
+          <w:b w:val="0"/>
+          <w:sz w:val="22"/>
+          <w:szCs w:val="22"/>
+        </w:rPr>
+      </w:pPr>
+      <w:r>
+        <w:rPr>
+          <w:sz w:val="22"/>
+          <w:szCs w:val="22"/>
+        </w:rPr>
+        <w:t xml:space="preserve">Project: </w:t>
+      </w:r>
+      <w:r>
+        <w:rPr>
+          <w:b w:val="0"/>
+          <w:sz w:val="22"/>
+          <w:szCs w:val="22"/>
+        </w:rPr>
+        <w:t xml:space="preserve">Azure </w:t>
+      </w:r>
+      <w:r>
+        <w:rPr>
+          <w:b w:val="0"/>
+          <w:sz w:val="22"/>
+          <w:szCs w:val="22"/>
+        </w:rPr>
+        <w:t>WAN WARP Networking Microservice</w:t>
+      </w:r>
+    </w:p>
+    <w:p>
+      <w:pPr>
+        <w:pStyle w:val="Heading2"/>
+        <w:numPr>
+          <w:ilvl w:val="0"/>
+          <w:numId w:val="6"/>
+        </w:numPr>
+        <w:spacing w:before="0"/>
+        <w:ind w:left="273" w:hanging="187"/>
+        <w:jc w:val="both"/>
+        <w:rPr>
+          <w:b w:val="0"/>
+          <w:sz w:val="22"/>
+          <w:szCs w:val="22"/>
+        </w:rPr>
+      </w:pPr>
+      <w:r>
+        <w:rPr>
+          <w:b w:val="0"/>
+          <w:sz w:val="22"/>
+          <w:szCs w:val="22"/>
+        </w:rPr>
+        <w:t>Spearheaded the global device management microservice, enhancing seamless device interactions worldwide.</w:t>
+      </w:r>
+    </w:p>
+    <w:p>
+      <w:pPr>
+        <w:pStyle w:val="Heading2"/>
+        <w:numPr>
+          <w:ilvl w:val="0"/>
+          <w:numId w:val="6"/>
+        </w:numPr>
+        <w:spacing w:before="0"/>
+        <w:ind w:left="273" w:hanging="187"/>
+        <w:jc w:val="both"/>
+        <w:rPr>
+          <w:b w:val="0"/>
+          <w:sz w:val="22"/>
+          <w:szCs w:val="22"/>
+        </w:rPr>
+      </w:pPr>
+      <w:r>
+        <w:rPr>
+          <w:b w:val="0"/>
+          <w:sz w:val="22"/>
+          <w:szCs w:val="22"/>
+        </w:rPr>
+        <w:t>Developed and implemented a system to dynamically execute Python3 scripts and manage dependencies for a vast network of routers.</w:t>
+      </w:r>
+    </w:p>
+    <w:p>
+      <w:pPr>
+        <w:pStyle w:val="Heading2"/>
+        <w:numPr>
+          <w:ilvl w:val="0"/>
+          <w:numId w:val="6"/>
+        </w:numPr>
+        <w:spacing w:before="0"/>
+        <w:ind w:left="273" w:hanging="187"/>
+        <w:jc w:val="both"/>
+        <w:rPr>
+          <w:b w:val="0"/>
+          <w:sz w:val="22"/>
+          <w:szCs w:val="22"/>
+        </w:rPr>
+      </w:pPr>
+      <w:r>
+        <w:rPr>
+          <w:b w:val="0"/>
+          <w:sz w:val="22"/>
+          <w:szCs w:val="22"/>
+        </w:rPr>
+        <w:t xml:space="preserve">Established key performance metrics and monitoring tools for emerging services overseeing thousands of devices. </w:t>
+      </w:r>
+    </w:p>
+    <w:p>
+      <w:pPr>
+        <w:pStyle w:val="Heading2"/>
+        <w:numPr>
+          <w:ilvl w:val="0"/>
+          <w:numId w:val="6"/>
+        </w:numPr>
+        <w:spacing w:before="0"/>
+        <w:ind w:left="273" w:hanging="187"/>
+        <w:jc w:val="both"/>
+        <w:rPr>
+          <w:b w:val="0"/>
+          <w:sz w:val="22"/>
+          <w:szCs w:val="22"/>
+        </w:rPr>
+      </w:pPr>
+      <w:r>
+        <w:rPr>
+          <w:b w:val="0"/>
+          <w:sz w:val="22"/>
+          <w:szCs w:val="22"/>
+        </w:rPr>
+        <w:t>Participate</w:t>
+      </w:r>
+      <w:r>
+        <w:rPr>
+          <w:b w:val="0"/>
+          <w:sz w:val="22"/>
+          <w:szCs w:val="22"/>
+        </w:rPr>
+        <w:t>d</w:t>
+      </w:r>
+      <w:r>
+        <w:rPr>
+          <w:b w:val="0"/>
+          <w:sz w:val="22"/>
+          <w:szCs w:val="22"/>
+        </w:rPr>
+        <w:t xml:space="preserve"> in 24/7 on-call rotations to troubleshoot production issues across cross-functional teams.</w:t>
+      </w:r>
+    </w:p>
+    <w:p>
+      <w:pPr>
+        <w:pStyle w:val="Heading2"/>
+        <w:numPr>
+          <w:ilvl w:val="0"/>
+          <w:numId w:val="6"/>
+        </w:numPr>
+        <w:spacing w:before="0"/>
+        <w:ind w:left="273" w:hanging="187"/>
+        <w:jc w:val="both"/>
+        <w:rPr>
+          <w:b w:val="0"/>
+          <w:sz w:val="22"/>
+          <w:szCs w:val="22"/>
+        </w:rPr>
+      </w:pPr>
+      <w:r>
+        <w:rPr>
+          <w:b w:val="0"/>
+          <w:sz w:val="22"/>
+          <w:szCs w:val="22"/>
+        </w:rPr>
+        <w:t xml:space="preserve">Achieved a </w:t>
+      </w:r>
+      <w:r>
+        <w:rPr>
+          <w:bCs w:val="0"/>
+          <w:sz w:val="22"/>
+          <w:szCs w:val="22"/>
+        </w:rPr>
+        <w:t>50% reduction</w:t>
+      </w:r>
+      <w:r>
+        <w:rPr>
+          <w:b w:val="0"/>
+          <w:sz w:val="22"/>
+          <w:szCs w:val="22"/>
+        </w:rPr>
+        <w:t xml:space="preserve"> in config setup time </w:t>
+      </w:r>
+      <w:r>
+        <w:rPr>
+          <w:b w:val="0"/>
+          <w:sz w:val="22"/>
+          <w:szCs w:val="22"/>
+        </w:rPr>
+        <w:t xml:space="preserve">through </w:t>
+      </w:r>
+      <w:r>
+        <w:rPr>
+          <w:b w:val="0"/>
+          <w:sz w:val="22"/>
+          <w:szCs w:val="22"/>
+        </w:rPr>
+        <w:t>strategic caching and package management enhancements.</w:t>
+      </w:r>
+    </w:p>
+    <w:p>
+      <w:pPr>
+        <w:pStyle w:val="Heading2"/>
+        <w:spacing w:before="120"/>
+        <w:ind w:left="0"/>
+        <w:jc w:val="both"/>
+        <w:rPr>
+          <w:sz w:val="22"/>
+          <w:szCs w:val="22"/>
+        </w:rPr>
+      </w:pPr>
+      <w:r>
+        <w:rPr>
+          <w:sz w:val="22"/>
+          <w:szCs w:val="22"/>
+        </w:rPr>
+        <w:t>INTEL</w:t>
+      </w:r>
+      <w:r>
+        <w:rPr>
+          <w:sz w:val="22"/>
+          <w:szCs w:val="22"/>
+        </w:rPr>
+        <w:t xml:space="preserve">, Hillsboro, Oregon, Software Development Engineer </w:t>
+      </w:r>
+      <w:r>
+        <w:rPr>
+          <w:sz w:val="22"/>
+          <w:szCs w:val="22"/>
+        </w:rPr>
+        <w:tab/>
+      </w:r>
+      <w:r>
+        <w:rPr>
+          <w:sz w:val="22"/>
+          <w:szCs w:val="22"/>
+        </w:rPr>
+        <w:tab/>
+      </w:r>
+      <w:r>
+        <w:rPr>
+          <w:sz w:val="22"/>
+          <w:szCs w:val="22"/>
+        </w:rPr>
+        <w:tab/>
+      </w:r>
+      <w:r>
+        <w:rPr>
+          <w:sz w:val="22"/>
+          <w:szCs w:val="22"/>
+        </w:rPr>
+        <w:tab/>
       </w:r>
       <w:r>
         <w:rPr>
@@ -1081,25 +1466,16 @@
       </w:r>
       <w:r>
         <w:rPr>
-          <w:i/>
-          <w:sz w:val="22"/>
-          <w:szCs w:val="22"/>
-        </w:rPr>
-        <w:t xml:space="preserve">January 2018 – </w:t>
-      </w:r>
-      <w:r>
-        <w:rPr>
-          <w:i/>
-          <w:sz w:val="22"/>
-          <w:szCs w:val="22"/>
-        </w:rPr>
-        <w:t>June 2021</w:t>
+          <w:sz w:val="22"/>
+          <w:szCs w:val="22"/>
+        </w:rPr>
+        <w:t>January 2018 – June 2021</w:t>
       </w:r>
     </w:p>
     <w:p>
       <w:pPr>
         <w:pStyle w:val="Heading2"/>
-        <w:spacing w:before="0"/>
+        <w:spacing w:before="60"/>
         <w:ind w:left="86"/>
         <w:jc w:val="both"/>
         <w:rPr>
@@ -1120,6 +1496,14 @@
           <w:sz w:val="22"/>
           <w:szCs w:val="22"/>
         </w:rPr>
+        <w:t xml:space="preserve">Fab </w:t>
+      </w:r>
+      <w:r>
+        <w:rPr>
+          <w:b w:val="0"/>
+          <w:sz w:val="22"/>
+          <w:szCs w:val="22"/>
+        </w:rPr>
         <w:t xml:space="preserve">Authentication </w:t>
       </w:r>
       <w:r>
@@ -1132,7 +1516,6 @@
       </w:r>
       <w:r>
         <w:rPr>
-          <w:b w:val="0"/>
           <w:sz w:val="22"/>
           <w:szCs w:val="22"/>
         </w:rPr>
@@ -1185,51 +1568,33 @@
           <w:sz w:val="22"/>
           <w:szCs w:val="22"/>
         </w:rPr>
-        <w:tab/>
-        <w:t xml:space="preserve">     </w:t>
-      </w:r>
-      <w:r>
-        <w:rPr>
-          <w:b w:val="0"/>
-          <w:i/>
-          <w:sz w:val="22"/>
-          <w:szCs w:val="22"/>
-        </w:rPr>
-        <w:t xml:space="preserve">Nov </w:t>
-      </w:r>
-      <w:r>
-        <w:rPr>
-          <w:b w:val="0"/>
-          <w:i/>
-          <w:sz w:val="22"/>
-          <w:szCs w:val="22"/>
-        </w:rPr>
-        <w:t xml:space="preserve">2020 – </w:t>
-      </w:r>
-      <w:r>
-        <w:rPr>
-          <w:b w:val="0"/>
-          <w:i/>
+        <w:t xml:space="preserve"> </w:t>
+      </w:r>
+      <w:r>
+        <w:rPr>
+          <w:iCs/>
+          <w:sz w:val="22"/>
+          <w:szCs w:val="22"/>
+        </w:rPr>
+        <w:t xml:space="preserve">   </w:t>
+      </w:r>
+      <w:r>
+        <w:rPr>
+          <w:b w:val="0"/>
+          <w:iCs/>
+          <w:sz w:val="22"/>
+          <w:szCs w:val="22"/>
+        </w:rPr>
+        <w:t xml:space="preserve">Nov 2020 – </w:t>
+      </w:r>
+      <w:r>
+        <w:rPr>
+          <w:b w:val="0"/>
+          <w:iCs/>
           <w:sz w:val="22"/>
           <w:szCs w:val="22"/>
         </w:rPr>
         <w:t>June 2021</w:t>
-      </w:r>
-    </w:p>
-    <w:p>
-      <w:pPr>
-        <w:pStyle w:val="Heading2"/>
-        <w:spacing w:before="0"/>
-        <w:ind w:left="90"/>
-        <w:jc w:val="both"/>
-      </w:pPr>
-      <w:r>
-        <w:rPr>
-          <w:bCs w:val="0"/>
-          <w:sz w:val="22"/>
-          <w:szCs w:val="22"/>
-        </w:rPr>
-        <w:t>Role:</w:t>
       </w:r>
       <w:r>
         <w:rPr>
@@ -1240,30 +1605,6 @@
           <w:szCs w:val="22"/>
         </w:rPr>
         <w:t xml:space="preserve"> </w:t>
-      </w:r>
-      <w:r>
-        <w:rPr>
-          <w:b w:val="0"/>
-          <w:sz w:val="22"/>
-          <w:szCs w:val="22"/>
-        </w:rPr>
-        <w:t xml:space="preserve">Backend </w:t>
-      </w:r>
-      <w:r>
-        <w:rPr>
-          <w:b w:val="0"/>
-          <w:sz w:val="22"/>
-          <w:szCs w:val="22"/>
-        </w:rPr>
-        <w:t xml:space="preserve">Software </w:t>
-      </w:r>
-      <w:r>
-        <w:rPr>
-          <w:b w:val="0"/>
-          <w:sz w:val="22"/>
-          <w:szCs w:val="22"/>
-        </w:rPr>
-        <w:t>Engineer</w:t>
       </w:r>
     </w:p>
     <w:p>
@@ -1288,87 +1629,7 @@
           <w:sz w:val="22"/>
           <w:szCs w:val="22"/>
         </w:rPr>
-        <w:t>Develop</w:t>
-      </w:r>
-      <w:r>
-        <w:rPr>
-          <w:b w:val="0"/>
-          <w:sz w:val="22"/>
-          <w:szCs w:val="22"/>
-        </w:rPr>
-        <w:t>ing</w:t>
-      </w:r>
-      <w:r>
-        <w:rPr>
-          <w:b w:val="0"/>
-          <w:sz w:val="22"/>
-          <w:szCs w:val="22"/>
-        </w:rPr>
-        <w:t xml:space="preserve"> a scalable Spring </w:t>
-      </w:r>
-      <w:r>
-        <w:rPr>
-          <w:b w:val="0"/>
-          <w:sz w:val="22"/>
-          <w:szCs w:val="22"/>
-        </w:rPr>
-        <w:t xml:space="preserve">Boot </w:t>
-      </w:r>
-      <w:r>
-        <w:rPr>
-          <w:b w:val="0"/>
-          <w:sz w:val="22"/>
-          <w:szCs w:val="22"/>
-        </w:rPr>
-        <w:t xml:space="preserve">based </w:t>
-      </w:r>
-      <w:r>
-        <w:rPr>
-          <w:b w:val="0"/>
-          <w:sz w:val="22"/>
-          <w:szCs w:val="22"/>
-        </w:rPr>
-        <w:t>m</w:t>
-      </w:r>
-      <w:r>
-        <w:rPr>
-          <w:b w:val="0"/>
-          <w:sz w:val="22"/>
-          <w:szCs w:val="22"/>
-        </w:rPr>
-        <w:t xml:space="preserve">icroservice to submit </w:t>
-      </w:r>
-      <w:r>
-        <w:rPr>
-          <w:b w:val="0"/>
-          <w:sz w:val="22"/>
-          <w:szCs w:val="22"/>
-        </w:rPr>
-        <w:t>S</w:t>
-      </w:r>
-      <w:r>
-        <w:rPr>
-          <w:b w:val="0"/>
-          <w:sz w:val="22"/>
-          <w:szCs w:val="22"/>
-        </w:rPr>
-        <w:t>park job</w:t>
-      </w:r>
-      <w:r>
-        <w:rPr>
-          <w:b w:val="0"/>
-          <w:sz w:val="22"/>
-          <w:szCs w:val="22"/>
-        </w:rPr>
-        <w:t>s</w:t>
-      </w:r>
-      <w:r>
-        <w:rPr>
-          <w:b w:val="0"/>
-          <w:sz w:val="22"/>
-          <w:szCs w:val="22"/>
-        </w:rPr>
-        <w:t xml:space="preserve"> in a Hadoop ecosystem</w:t>
+        <w:t>Pioneered a scalable Java Spring Boot microservice to efficiently process Spark jobs within a Hadoop ecosystem.</w:t>
       </w:r>
     </w:p>
     <w:p>
@@ -1393,22 +1654,7 @@
           <w:sz w:val="22"/>
           <w:szCs w:val="22"/>
         </w:rPr>
-        <w:t xml:space="preserve">Modernized data transfer across systems with </w:t>
-      </w:r>
-      <w:r>
-        <w:rPr>
-          <w:sz w:val="22"/>
-          <w:szCs w:val="22"/>
-        </w:rPr>
-        <w:t xml:space="preserve">3x increase </w:t>
-      </w:r>
-      <w:r>
-        <w:rPr>
-          <w:b w:val="0"/>
-          <w:sz w:val="22"/>
-          <w:szCs w:val="22"/>
-        </w:rPr>
-        <w:t xml:space="preserve">in throughput using </w:t>
+        <w:t xml:space="preserve">Amplified data transfer rates across systems, achieving a </w:t>
       </w:r>
       <w:r>
         <w:rPr>
@@ -1416,18 +1662,159 @@
           <w:sz w:val="22"/>
           <w:szCs w:val="22"/>
         </w:rPr>
-        <w:t xml:space="preserve">Apache </w:t>
-      </w:r>
-      <w:proofErr w:type="spellStart"/>
-      <w:r>
-        <w:rPr>
-          <w:bCs w:val="0"/>
-          <w:sz w:val="22"/>
-          <w:szCs w:val="22"/>
-        </w:rPr>
-        <w:t>NiFi</w:t>
-      </w:r>
-      <w:proofErr w:type="spellEnd"/>
+        <w:t>3x boost</w:t>
+      </w:r>
+      <w:r>
+        <w:rPr>
+          <w:b w:val="0"/>
+          <w:sz w:val="22"/>
+          <w:szCs w:val="22"/>
+        </w:rPr>
+        <w:t xml:space="preserve"> in throughput via Apache NiFi integration.</w:t>
+      </w:r>
+    </w:p>
+    <w:p>
+      <w:pPr>
+        <w:pStyle w:val="Heading2"/>
+        <w:numPr>
+          <w:ilvl w:val="0"/>
+          <w:numId w:val="6"/>
+        </w:numPr>
+        <w:spacing w:before="0"/>
+        <w:ind w:left="270" w:hanging="180"/>
+        <w:jc w:val="both"/>
+        <w:rPr>
+          <w:b w:val="0"/>
+          <w:sz w:val="22"/>
+          <w:szCs w:val="22"/>
+        </w:rPr>
+      </w:pPr>
+      <w:r>
+        <w:rPr>
+          <w:b w:val="0"/>
+          <w:sz w:val="22"/>
+          <w:szCs w:val="22"/>
+        </w:rPr>
+        <w:t>Orchestrated robust CI/CD pipelines tailored for client needs, utilizing Java, Docker, Gradle, and GitHub Workflows.</w:t>
+      </w:r>
+    </w:p>
+    <w:p>
+      <w:pPr>
+        <w:pStyle w:val="Heading2"/>
+        <w:spacing w:before="60"/>
+        <w:ind w:left="86"/>
+        <w:jc w:val="both"/>
+        <w:rPr>
+          <w:b w:val="0"/>
+          <w:i/>
+          <w:sz w:val="22"/>
+          <w:szCs w:val="22"/>
+        </w:rPr>
+      </w:pPr>
+      <w:r>
+        <w:rPr>
+          <w:sz w:val="22"/>
+          <w:szCs w:val="22"/>
+        </w:rPr>
+        <w:t>Project:</w:t>
+      </w:r>
+      <w:r>
+        <w:rPr>
+          <w:b w:val="0"/>
+          <w:sz w:val="22"/>
+          <w:szCs w:val="22"/>
+        </w:rPr>
+        <w:t xml:space="preserve"> Retail Promotion Analytics</w:t>
+      </w:r>
+      <w:r>
+        <w:rPr>
+          <w:b w:val="0"/>
+          <w:sz w:val="22"/>
+          <w:szCs w:val="22"/>
+        </w:rPr>
+        <w:t xml:space="preserve"> (RPA)</w:t>
+      </w:r>
+      <w:r>
+        <w:rPr>
+          <w:b w:val="0"/>
+          <w:sz w:val="22"/>
+          <w:szCs w:val="22"/>
+        </w:rPr>
+        <w:tab/>
+      </w:r>
+      <w:r>
+        <w:rPr>
+          <w:b w:val="0"/>
+          <w:sz w:val="22"/>
+          <w:szCs w:val="22"/>
+        </w:rPr>
+        <w:tab/>
+      </w:r>
+      <w:r>
+        <w:rPr>
+          <w:b w:val="0"/>
+          <w:sz w:val="22"/>
+          <w:szCs w:val="22"/>
+        </w:rPr>
+        <w:tab/>
+      </w:r>
+      <w:r>
+        <w:rPr>
+          <w:b w:val="0"/>
+          <w:sz w:val="22"/>
+          <w:szCs w:val="22"/>
+        </w:rPr>
+        <w:tab/>
+      </w:r>
+      <w:r>
+        <w:rPr>
+          <w:b w:val="0"/>
+          <w:sz w:val="22"/>
+          <w:szCs w:val="22"/>
+        </w:rPr>
+        <w:tab/>
+      </w:r>
+      <w:r>
+        <w:rPr>
+          <w:b w:val="0"/>
+          <w:sz w:val="22"/>
+          <w:szCs w:val="22"/>
+        </w:rPr>
+        <w:tab/>
+      </w:r>
+      <w:r>
+        <w:rPr>
+          <w:b w:val="0"/>
+          <w:sz w:val="22"/>
+          <w:szCs w:val="22"/>
+        </w:rPr>
+        <w:tab/>
+      </w:r>
+      <w:r>
+        <w:rPr>
+          <w:b w:val="0"/>
+          <w:sz w:val="22"/>
+          <w:szCs w:val="22"/>
+        </w:rPr>
+        <w:t xml:space="preserve"> </w:t>
+      </w:r>
+      <w:r>
+        <w:rPr>
+          <w:b w:val="0"/>
+          <w:sz w:val="22"/>
+          <w:szCs w:val="22"/>
+        </w:rPr>
+        <w:t xml:space="preserve">    </w:t>
+      </w:r>
+      <w:r>
+        <w:rPr>
+          <w:b w:val="0"/>
+          <w:iCs/>
+          <w:sz w:val="22"/>
+          <w:szCs w:val="22"/>
+        </w:rPr>
+        <w:t xml:space="preserve"> Jan 2019 – Mar 2020</w:t>
+      </w:r>
     </w:p>
     <w:p>
       <w:pPr>
@@ -1451,209 +1838,7 @@
           <w:sz w:val="22"/>
           <w:szCs w:val="22"/>
         </w:rPr>
-        <w:t xml:space="preserve">Created </w:t>
-      </w:r>
-      <w:r>
-        <w:rPr>
-          <w:b w:val="0"/>
-          <w:sz w:val="22"/>
-          <w:szCs w:val="22"/>
-        </w:rPr>
-        <w:t xml:space="preserve">a </w:t>
-      </w:r>
-      <w:r>
-        <w:rPr>
-          <w:b w:val="0"/>
-          <w:sz w:val="22"/>
-          <w:szCs w:val="22"/>
-        </w:rPr>
-        <w:t xml:space="preserve">CI/CD pipeline with </w:t>
-      </w:r>
-      <w:r>
-        <w:rPr>
-          <w:sz w:val="22"/>
-          <w:szCs w:val="22"/>
-        </w:rPr>
-        <w:t>100% test coverage</w:t>
-      </w:r>
-      <w:r>
-        <w:rPr>
-          <w:b w:val="0"/>
-          <w:sz w:val="22"/>
-          <w:szCs w:val="22"/>
-        </w:rPr>
-        <w:t xml:space="preserve"> built for customers using Java, Docker, Gradle </w:t>
-      </w:r>
-      <w:r>
-        <w:rPr>
-          <w:b w:val="0"/>
-          <w:sz w:val="22"/>
-          <w:szCs w:val="22"/>
-        </w:rPr>
-        <w:t>and Azure Pipelines</w:t>
-      </w:r>
-    </w:p>
-    <w:p>
-      <w:pPr>
-        <w:pStyle w:val="Heading2"/>
-        <w:spacing w:before="60"/>
-        <w:ind w:left="86"/>
-        <w:jc w:val="both"/>
-        <w:rPr>
-          <w:b w:val="0"/>
-          <w:i/>
-          <w:sz w:val="22"/>
-          <w:szCs w:val="22"/>
-        </w:rPr>
-      </w:pPr>
-      <w:r>
-        <w:rPr>
-          <w:sz w:val="22"/>
-          <w:szCs w:val="22"/>
-        </w:rPr>
-        <w:t>Project:</w:t>
-      </w:r>
-      <w:r>
-        <w:rPr>
-          <w:b w:val="0"/>
-          <w:sz w:val="22"/>
-          <w:szCs w:val="22"/>
-        </w:rPr>
-        <w:t xml:space="preserve"> Retail Promotion Analytics</w:t>
-      </w:r>
-      <w:r>
-        <w:rPr>
-          <w:b w:val="0"/>
-          <w:sz w:val="22"/>
-          <w:szCs w:val="22"/>
-        </w:rPr>
-        <w:t xml:space="preserve"> (RPA)</w:t>
-      </w:r>
-      <w:r>
-        <w:rPr>
-          <w:b w:val="0"/>
-          <w:sz w:val="22"/>
-          <w:szCs w:val="22"/>
-        </w:rPr>
-        <w:tab/>
-      </w:r>
-      <w:r>
-        <w:rPr>
-          <w:b w:val="0"/>
-          <w:sz w:val="22"/>
-          <w:szCs w:val="22"/>
-        </w:rPr>
-        <w:tab/>
-      </w:r>
-      <w:r>
-        <w:rPr>
-          <w:b w:val="0"/>
-          <w:sz w:val="22"/>
-          <w:szCs w:val="22"/>
-        </w:rPr>
-        <w:tab/>
-      </w:r>
-      <w:r>
-        <w:rPr>
-          <w:b w:val="0"/>
-          <w:sz w:val="22"/>
-          <w:szCs w:val="22"/>
-        </w:rPr>
-        <w:tab/>
-      </w:r>
-      <w:r>
-        <w:rPr>
-          <w:b w:val="0"/>
-          <w:sz w:val="22"/>
-          <w:szCs w:val="22"/>
-        </w:rPr>
-        <w:tab/>
-      </w:r>
-      <w:r>
-        <w:rPr>
-          <w:b w:val="0"/>
-          <w:sz w:val="22"/>
-          <w:szCs w:val="22"/>
-        </w:rPr>
-        <w:tab/>
-      </w:r>
-      <w:r>
-        <w:rPr>
-          <w:b w:val="0"/>
-          <w:sz w:val="22"/>
-          <w:szCs w:val="22"/>
-        </w:rPr>
-        <w:tab/>
-      </w:r>
-      <w:r>
-        <w:rPr>
-          <w:b w:val="0"/>
-          <w:sz w:val="22"/>
-          <w:szCs w:val="22"/>
-        </w:rPr>
-        <w:t xml:space="preserve"> </w:t>
-      </w:r>
-      <w:r>
-        <w:rPr>
-          <w:b w:val="0"/>
-          <w:sz w:val="22"/>
-          <w:szCs w:val="22"/>
-        </w:rPr>
-        <w:t xml:space="preserve">     </w:t>
-      </w:r>
-      <w:r>
-        <w:rPr>
-          <w:b w:val="0"/>
-          <w:i/>
-          <w:sz w:val="22"/>
-          <w:szCs w:val="22"/>
-        </w:rPr>
-        <w:t>Jan 2019 – Mar 2020</w:t>
-      </w:r>
-    </w:p>
-    <w:p>
-      <w:pPr>
-        <w:pStyle w:val="Heading2"/>
-        <w:spacing w:before="0"/>
-        <w:ind w:left="86"/>
-        <w:jc w:val="both"/>
-        <w:rPr>
-          <w:b w:val="0"/>
-          <w:sz w:val="22"/>
-          <w:szCs w:val="22"/>
-        </w:rPr>
-      </w:pPr>
-      <w:r>
-        <w:rPr>
-          <w:bCs w:val="0"/>
-          <w:sz w:val="22"/>
-          <w:szCs w:val="22"/>
-        </w:rPr>
-        <w:t>Role:</w:t>
-      </w:r>
-      <w:r>
-        <w:rPr>
-          <w:b w:val="0"/>
-          <w:sz w:val="22"/>
-          <w:szCs w:val="22"/>
-        </w:rPr>
-        <w:t xml:space="preserve"> </w:t>
-      </w:r>
-      <w:r>
-        <w:rPr>
-          <w:b w:val="0"/>
-          <w:sz w:val="22"/>
-          <w:szCs w:val="22"/>
-        </w:rPr>
-        <w:t xml:space="preserve">Full Stack </w:t>
-      </w:r>
-      <w:r>
-        <w:rPr>
-          <w:b w:val="0"/>
-          <w:sz w:val="22"/>
-          <w:szCs w:val="22"/>
-        </w:rPr>
-        <w:t>Engineer</w:t>
+        <w:t>Commanded the project, liaising with stakeholders to craft and execute an Angular UI alongside Java APIs.</w:t>
       </w:r>
     </w:p>
     <w:p>
@@ -1678,27 +1863,70 @@
           <w:sz w:val="22"/>
           <w:szCs w:val="22"/>
         </w:rPr>
-        <w:t xml:space="preserve">Designed and developed </w:t>
-      </w:r>
-      <w:r>
-        <w:rPr>
-          <w:b w:val="0"/>
-          <w:sz w:val="22"/>
-          <w:szCs w:val="22"/>
-        </w:rPr>
-        <w:t>RPA</w:t>
-      </w:r>
-      <w:r>
-        <w:rPr>
-          <w:b w:val="0"/>
-          <w:sz w:val="22"/>
-          <w:szCs w:val="22"/>
-        </w:rPr>
-        <w:t xml:space="preserve"> UI and APIs</w:t>
-      </w:r>
-      <w:r>
-        <w:rPr>
-          <w:b w:val="0"/>
+        <w:t>Seamlessly integrated user authentication processes with AWS Cognito for sign-ups and sign-ins.</w:t>
+      </w:r>
+    </w:p>
+    <w:p>
+      <w:pPr>
+        <w:pStyle w:val="Heading2"/>
+        <w:numPr>
+          <w:ilvl w:val="0"/>
+          <w:numId w:val="6"/>
+        </w:numPr>
+        <w:spacing w:before="0"/>
+        <w:ind w:left="273" w:hanging="187"/>
+        <w:jc w:val="both"/>
+        <w:rPr>
+          <w:b w:val="0"/>
+          <w:sz w:val="22"/>
+          <w:szCs w:val="22"/>
+        </w:rPr>
+      </w:pPr>
+      <w:r>
+        <w:rPr>
+          <w:b w:val="0"/>
+          <w:sz w:val="22"/>
+          <w:szCs w:val="22"/>
+        </w:rPr>
+        <w:t xml:space="preserve">Conceptualized and rolled out a comprehensive logging solution </w:t>
+      </w:r>
+      <w:r>
+        <w:rPr>
+          <w:b w:val="0"/>
+          <w:sz w:val="22"/>
+          <w:szCs w:val="22"/>
+        </w:rPr>
+        <w:t xml:space="preserve">using </w:t>
+      </w:r>
+      <w:r>
+        <w:rPr>
+          <w:b w:val="0"/>
+          <w:sz w:val="22"/>
+          <w:szCs w:val="22"/>
+        </w:rPr>
+        <w:t>Elasticsearch, Logstash, and Kibana.</w:t>
+      </w:r>
+    </w:p>
+    <w:p>
+      <w:pPr>
+        <w:pStyle w:val="Heading2"/>
+        <w:spacing w:before="120"/>
+        <w:ind w:left="0"/>
+        <w:jc w:val="both"/>
+        <w:rPr>
+          <w:sz w:val="22"/>
+          <w:szCs w:val="22"/>
+        </w:rPr>
+      </w:pPr>
+      <w:r>
+        <w:rPr>
+          <w:sz w:val="22"/>
+          <w:szCs w:val="22"/>
+        </w:rPr>
+        <w:t>INTEL</w:t>
+      </w:r>
+      <w:r>
+        <w:rPr>
           <w:sz w:val="22"/>
           <w:szCs w:val="22"/>
         </w:rPr>
@@ -1706,43 +1934,99 @@
       </w:r>
       <w:r>
         <w:rPr>
-          <w:b w:val="0"/>
-          <w:sz w:val="22"/>
-          <w:szCs w:val="22"/>
-        </w:rPr>
-        <w:t>integrated</w:t>
-      </w:r>
-      <w:r>
-        <w:rPr>
-          <w:b w:val="0"/>
-          <w:sz w:val="22"/>
-          <w:szCs w:val="22"/>
-        </w:rPr>
-        <w:t xml:space="preserve"> </w:t>
-      </w:r>
-      <w:r>
-        <w:rPr>
-          <w:b w:val="0"/>
-          <w:sz w:val="22"/>
-          <w:szCs w:val="22"/>
-        </w:rPr>
-        <w:t xml:space="preserve">user </w:t>
-      </w:r>
-      <w:r>
-        <w:rPr>
-          <w:b w:val="0"/>
-          <w:sz w:val="22"/>
-          <w:szCs w:val="22"/>
-        </w:rPr>
-        <w:t xml:space="preserve">authorizations, </w:t>
-      </w:r>
-      <w:r>
-        <w:rPr>
-          <w:b w:val="0"/>
-          <w:sz w:val="22"/>
-          <w:szCs w:val="22"/>
-        </w:rPr>
-        <w:t>sign-ups and sign-ins with AWS Cognito</w:t>
+          <w:sz w:val="22"/>
+          <w:szCs w:val="22"/>
+        </w:rPr>
+        <w:t xml:space="preserve">Software Engineering </w:t>
+      </w:r>
+      <w:r>
+        <w:rPr>
+          <w:sz w:val="22"/>
+          <w:szCs w:val="22"/>
+        </w:rPr>
+        <w:t>Summer Intern</w:t>
+      </w:r>
+      <w:r>
+        <w:rPr>
+          <w:sz w:val="22"/>
+          <w:szCs w:val="22"/>
+        </w:rPr>
+        <w:tab/>
+        <w:t xml:space="preserve">       </w:t>
+      </w:r>
+      <w:r>
+        <w:rPr>
+          <w:sz w:val="22"/>
+          <w:szCs w:val="22"/>
+        </w:rPr>
+        <w:tab/>
+      </w:r>
+      <w:r>
+        <w:rPr>
+          <w:sz w:val="22"/>
+          <w:szCs w:val="22"/>
+        </w:rPr>
+        <w:tab/>
+      </w:r>
+      <w:r>
+        <w:rPr>
+          <w:sz w:val="22"/>
+          <w:szCs w:val="22"/>
+        </w:rPr>
+        <w:tab/>
+      </w:r>
+      <w:r>
+        <w:rPr>
+          <w:sz w:val="22"/>
+          <w:szCs w:val="22"/>
+        </w:rPr>
+        <w:tab/>
+      </w:r>
+      <w:r>
+        <w:rPr>
+          <w:sz w:val="22"/>
+          <w:szCs w:val="22"/>
+        </w:rPr>
+        <w:tab/>
+      </w:r>
+      <w:r>
+        <w:rPr>
+          <w:sz w:val="22"/>
+          <w:szCs w:val="22"/>
+        </w:rPr>
+        <w:t xml:space="preserve">    </w:t>
+      </w:r>
+      <w:r>
+        <w:rPr>
+          <w:sz w:val="22"/>
+          <w:szCs w:val="22"/>
+        </w:rPr>
+        <w:tab/>
+        <w:t xml:space="preserve">    </w:t>
+      </w:r>
+      <w:r>
+        <w:rPr>
+          <w:iCs/>
+          <w:sz w:val="22"/>
+          <w:szCs w:val="22"/>
+        </w:rPr>
+        <w:t xml:space="preserve">May 2017 – </w:t>
+      </w:r>
+      <w:r>
+        <w:rPr>
+          <w:iCs/>
+          <w:sz w:val="22"/>
+          <w:szCs w:val="22"/>
+        </w:rPr>
+        <w:t>Aug</w:t>
+      </w:r>
+      <w:r>
+        <w:rPr>
+          <w:iCs/>
+          <w:sz w:val="22"/>
+          <w:szCs w:val="22"/>
+        </w:rPr>
+        <w:t xml:space="preserve"> 2017</w:t>
       </w:r>
     </w:p>
     <w:p>
@@ -1767,272 +2051,15 @@
           <w:sz w:val="22"/>
           <w:szCs w:val="22"/>
         </w:rPr>
-        <w:t>Led</w:t>
-      </w:r>
-      <w:r>
-        <w:rPr>
-          <w:b w:val="0"/>
-          <w:sz w:val="22"/>
-          <w:szCs w:val="22"/>
-        </w:rPr>
-        <w:t xml:space="preserve"> </w:t>
-      </w:r>
-      <w:r>
-        <w:rPr>
-          <w:b w:val="0"/>
-          <w:sz w:val="22"/>
-          <w:szCs w:val="22"/>
-        </w:rPr>
-        <w:t xml:space="preserve">a team of interns, contract workers and </w:t>
-      </w:r>
-      <w:r>
-        <w:rPr>
-          <w:b w:val="0"/>
-          <w:sz w:val="22"/>
-          <w:szCs w:val="22"/>
-        </w:rPr>
-        <w:t xml:space="preserve">Intel engineers </w:t>
-      </w:r>
-      <w:r>
-        <w:rPr>
-          <w:b w:val="0"/>
-          <w:sz w:val="22"/>
-          <w:szCs w:val="22"/>
-        </w:rPr>
-        <w:t xml:space="preserve">on </w:t>
-      </w:r>
-      <w:r>
-        <w:rPr>
-          <w:b w:val="0"/>
-          <w:sz w:val="22"/>
-          <w:szCs w:val="22"/>
-        </w:rPr>
-        <w:t>different aspects of the project</w:t>
-      </w:r>
-    </w:p>
-    <w:p>
-      <w:pPr>
-        <w:pStyle w:val="Heading2"/>
-        <w:numPr>
-          <w:ilvl w:val="0"/>
-          <w:numId w:val="7"/>
-        </w:numPr>
-        <w:spacing w:before="0"/>
-        <w:ind w:left="270" w:hanging="180"/>
-        <w:jc w:val="both"/>
-        <w:rPr>
-          <w:sz w:val="22"/>
-          <w:szCs w:val="22"/>
-        </w:rPr>
-      </w:pPr>
-      <w:r>
-        <w:rPr>
-          <w:b w:val="0"/>
-          <w:sz w:val="22"/>
-          <w:szCs w:val="22"/>
-        </w:rPr>
-        <w:t xml:space="preserve">Met an aggressive due date for product release accommodating </w:t>
-      </w:r>
-      <w:r>
-        <w:rPr>
-          <w:bCs w:val="0"/>
-          <w:sz w:val="22"/>
-          <w:szCs w:val="22"/>
-        </w:rPr>
-        <w:t>25% increase</w:t>
-      </w:r>
-      <w:r>
-        <w:rPr>
-          <w:b w:val="0"/>
-          <w:sz w:val="22"/>
-          <w:szCs w:val="22"/>
-        </w:rPr>
-        <w:t xml:space="preserve"> in scope</w:t>
-      </w:r>
-    </w:p>
-    <w:p>
-      <w:pPr>
-        <w:pStyle w:val="Heading2"/>
-        <w:spacing w:before="60"/>
-        <w:ind w:left="86"/>
-        <w:jc w:val="both"/>
-        <w:rPr>
-          <w:sz w:val="22"/>
-          <w:szCs w:val="22"/>
-        </w:rPr>
-      </w:pPr>
-      <w:r>
-        <w:rPr>
-          <w:sz w:val="22"/>
-          <w:szCs w:val="22"/>
-        </w:rPr>
-        <w:t>Project</w:t>
-      </w:r>
-      <w:r>
-        <w:rPr>
-          <w:b w:val="0"/>
-          <w:bCs w:val="0"/>
-          <w:sz w:val="22"/>
-          <w:szCs w:val="22"/>
-        </w:rPr>
-        <w:t xml:space="preserve">: </w:t>
-      </w:r>
-      <w:r>
-        <w:rPr>
-          <w:b w:val="0"/>
-          <w:bCs w:val="0"/>
-          <w:sz w:val="22"/>
-          <w:szCs w:val="22"/>
-        </w:rPr>
-        <w:t>Intel Saffron</w:t>
-      </w:r>
-      <w:r>
-        <w:rPr>
-          <w:b w:val="0"/>
-          <w:bCs w:val="0"/>
-          <w:sz w:val="22"/>
-          <w:szCs w:val="22"/>
-        </w:rPr>
-        <w:t>,</w:t>
-      </w:r>
-      <w:r>
-        <w:rPr>
-          <w:b w:val="0"/>
-          <w:bCs w:val="0"/>
-          <w:sz w:val="22"/>
-          <w:szCs w:val="22"/>
-        </w:rPr>
-        <w:t xml:space="preserve"> Rest API and Infrastructure</w:t>
-      </w:r>
-      <w:r>
-        <w:rPr>
-          <w:sz w:val="22"/>
-          <w:szCs w:val="22"/>
-        </w:rPr>
-        <w:tab/>
-      </w:r>
-      <w:r>
-        <w:rPr>
-          <w:sz w:val="22"/>
-          <w:szCs w:val="22"/>
-        </w:rPr>
-        <w:tab/>
-      </w:r>
-      <w:r>
-        <w:rPr>
-          <w:sz w:val="22"/>
-          <w:szCs w:val="22"/>
-        </w:rPr>
-        <w:tab/>
-      </w:r>
-      <w:r>
-        <w:rPr>
-          <w:sz w:val="22"/>
-          <w:szCs w:val="22"/>
-        </w:rPr>
-        <w:tab/>
-      </w:r>
-      <w:r>
-        <w:rPr>
-          <w:sz w:val="22"/>
-          <w:szCs w:val="22"/>
-        </w:rPr>
-        <w:tab/>
-      </w:r>
-      <w:r>
-        <w:rPr>
-          <w:sz w:val="22"/>
-          <w:szCs w:val="22"/>
-        </w:rPr>
-        <w:tab/>
-        <w:t xml:space="preserve">      </w:t>
-      </w:r>
-      <w:r>
-        <w:rPr>
-          <w:sz w:val="22"/>
-          <w:szCs w:val="22"/>
-        </w:rPr>
-        <w:t xml:space="preserve">  </w:t>
-      </w:r>
-      <w:r>
-        <w:rPr>
-          <w:b w:val="0"/>
-          <w:bCs w:val="0"/>
-          <w:i/>
-          <w:iCs/>
-          <w:sz w:val="22"/>
-          <w:szCs w:val="22"/>
-        </w:rPr>
-        <w:t xml:space="preserve">Jan 2018 – </w:t>
-      </w:r>
-      <w:r>
-        <w:rPr>
-          <w:b w:val="0"/>
-          <w:bCs w:val="0"/>
-          <w:i/>
-          <w:iCs/>
-          <w:sz w:val="22"/>
-          <w:szCs w:val="22"/>
-        </w:rPr>
-        <w:t>Oct</w:t>
-      </w:r>
-      <w:r>
-        <w:rPr>
-          <w:b w:val="0"/>
-          <w:bCs w:val="0"/>
-          <w:i/>
-          <w:iCs/>
-          <w:sz w:val="22"/>
-          <w:szCs w:val="22"/>
-        </w:rPr>
-        <w:t xml:space="preserve"> 2018</w:t>
-      </w:r>
-    </w:p>
-    <w:p>
-      <w:pPr>
-        <w:pStyle w:val="Heading2"/>
-        <w:spacing w:before="0"/>
-        <w:ind w:left="90"/>
-        <w:jc w:val="both"/>
-        <w:rPr>
-          <w:b w:val="0"/>
-          <w:sz w:val="22"/>
-          <w:szCs w:val="22"/>
-        </w:rPr>
-      </w:pPr>
-      <w:r>
-        <w:rPr>
-          <w:bCs w:val="0"/>
-          <w:sz w:val="22"/>
-          <w:szCs w:val="22"/>
-        </w:rPr>
-        <w:t>Role:</w:t>
-      </w:r>
-      <w:r>
-        <w:rPr>
-          <w:b w:val="0"/>
-          <w:i/>
-          <w:iCs/>
-          <w:sz w:val="22"/>
-          <w:szCs w:val="22"/>
-        </w:rPr>
-        <w:t xml:space="preserve"> </w:t>
-      </w:r>
-      <w:r>
-        <w:rPr>
-          <w:b w:val="0"/>
-          <w:sz w:val="22"/>
-          <w:szCs w:val="22"/>
-        </w:rPr>
-        <w:t xml:space="preserve">Software </w:t>
-      </w:r>
-      <w:r>
-        <w:rPr>
-          <w:b w:val="0"/>
-          <w:sz w:val="22"/>
-          <w:szCs w:val="22"/>
-        </w:rPr>
-        <w:t>Engineer</w:t>
+        <w:t xml:space="preserve">Engineered </w:t>
+      </w:r>
+      <w:r>
+        <w:rPr>
+          <w:b w:val="0"/>
+          <w:sz w:val="22"/>
+          <w:szCs w:val="22"/>
+        </w:rPr>
+        <w:t>Intel Saffron's Java REST API for AI services, incorporating specialized security measures and intricate classification/recommendation modules.</w:t>
       </w:r>
     </w:p>
     <w:p>
@@ -2057,88 +2084,7 @@
           <w:sz w:val="22"/>
           <w:szCs w:val="22"/>
         </w:rPr>
-        <w:t>Designed and implemented</w:t>
-      </w:r>
-      <w:r>
-        <w:rPr>
-          <w:b w:val="0"/>
-          <w:sz w:val="22"/>
-          <w:szCs w:val="22"/>
-        </w:rPr>
-        <w:t xml:space="preserve"> API</w:t>
-      </w:r>
-      <w:r>
-        <w:rPr>
-          <w:b w:val="0"/>
-          <w:sz w:val="22"/>
-          <w:szCs w:val="22"/>
-        </w:rPr>
-        <w:t>s</w:t>
-      </w:r>
-      <w:r>
-        <w:rPr>
-          <w:b w:val="0"/>
-          <w:sz w:val="22"/>
-          <w:szCs w:val="22"/>
-        </w:rPr>
-        <w:t xml:space="preserve"> in Java and Python to facilitate </w:t>
-      </w:r>
-      <w:r>
-        <w:rPr>
-          <w:b w:val="0"/>
-          <w:sz w:val="22"/>
-          <w:szCs w:val="22"/>
-        </w:rPr>
-        <w:t>REST querying and processing</w:t>
-      </w:r>
-    </w:p>
-    <w:p>
-      <w:pPr>
-        <w:pStyle w:val="Heading2"/>
-        <w:numPr>
-          <w:ilvl w:val="0"/>
-          <w:numId w:val="6"/>
-        </w:numPr>
-        <w:spacing w:before="0"/>
-        <w:ind w:left="270" w:hanging="180"/>
-        <w:jc w:val="both"/>
-        <w:rPr>
-          <w:b w:val="0"/>
-          <w:sz w:val="22"/>
-          <w:szCs w:val="22"/>
-        </w:rPr>
-      </w:pPr>
-      <w:r>
-        <w:rPr>
-          <w:b w:val="0"/>
-          <w:sz w:val="22"/>
-          <w:szCs w:val="22"/>
-        </w:rPr>
-        <w:t>E</w:t>
-      </w:r>
-      <w:r>
-        <w:rPr>
-          <w:b w:val="0"/>
-          <w:sz w:val="22"/>
-          <w:szCs w:val="22"/>
-        </w:rPr>
-        <w:t>nabl</w:t>
-      </w:r>
-      <w:r>
-        <w:rPr>
-          <w:b w:val="0"/>
-          <w:sz w:val="22"/>
-          <w:szCs w:val="22"/>
-        </w:rPr>
-        <w:t>ed</w:t>
-      </w:r>
-      <w:r>
-        <w:rPr>
-          <w:b w:val="0"/>
-          <w:sz w:val="22"/>
-          <w:szCs w:val="22"/>
-        </w:rPr>
-        <w:t xml:space="preserve"> concurrency and </w:t>
+        <w:t xml:space="preserve">Devised an Ansible playbook to facilitate the deployment of AI services on AWS, slashing setup time by a </w:t>
       </w:r>
       <w:r>
         <w:rPr>
@@ -2146,417 +2092,8 @@
           <w:sz w:val="22"/>
           <w:szCs w:val="22"/>
         </w:rPr>
-        <w:t>2</w:t>
-      </w:r>
-      <w:r>
-        <w:rPr>
-          <w:bCs w:val="0"/>
-          <w:sz w:val="22"/>
-          <w:szCs w:val="22"/>
-        </w:rPr>
-        <w:t>x</w:t>
-      </w:r>
-      <w:r>
-        <w:rPr>
-          <w:b w:val="0"/>
-          <w:sz w:val="22"/>
-          <w:szCs w:val="22"/>
-        </w:rPr>
-        <w:t xml:space="preserve"> </w:t>
-      </w:r>
-      <w:r>
-        <w:rPr>
-          <w:b w:val="0"/>
-          <w:sz w:val="22"/>
-          <w:szCs w:val="22"/>
-        </w:rPr>
-        <w:t>faster results</w:t>
-      </w:r>
-      <w:r>
-        <w:rPr>
-          <w:b w:val="0"/>
-          <w:sz w:val="22"/>
-          <w:szCs w:val="22"/>
-        </w:rPr>
-        <w:t xml:space="preserve"> in client environments</w:t>
-      </w:r>
-      <w:r>
-        <w:rPr>
-          <w:b w:val="0"/>
-          <w:sz w:val="22"/>
-          <w:szCs w:val="22"/>
-        </w:rPr>
-        <w:t xml:space="preserve"> with quick POCs</w:t>
-      </w:r>
-    </w:p>
-    <w:p>
-      <w:pPr>
-        <w:pStyle w:val="Heading2"/>
-        <w:numPr>
-          <w:ilvl w:val="0"/>
-          <w:numId w:val="6"/>
-        </w:numPr>
-        <w:spacing w:before="0"/>
-        <w:ind w:left="270" w:hanging="180"/>
-        <w:jc w:val="both"/>
-        <w:rPr>
-          <w:b w:val="0"/>
-          <w:sz w:val="22"/>
-          <w:szCs w:val="22"/>
-        </w:rPr>
-      </w:pPr>
-      <w:r>
-        <w:rPr>
-          <w:b w:val="0"/>
-          <w:sz w:val="22"/>
-          <w:szCs w:val="22"/>
-        </w:rPr>
-        <w:t>Automated</w:t>
-      </w:r>
-      <w:r>
-        <w:rPr>
-          <w:b w:val="0"/>
-          <w:sz w:val="22"/>
-          <w:szCs w:val="22"/>
-        </w:rPr>
-        <w:t xml:space="preserve"> product installation with a high-quality pipeline using </w:t>
-      </w:r>
-      <w:r>
-        <w:rPr>
-          <w:b w:val="0"/>
-          <w:sz w:val="22"/>
-          <w:szCs w:val="22"/>
-        </w:rPr>
-        <w:t>Ansible, Docker, Docker Swarm and Bash scripting</w:t>
-      </w:r>
-      <w:r>
-        <w:rPr>
-          <w:b w:val="0"/>
-          <w:sz w:val="22"/>
-          <w:szCs w:val="22"/>
-        </w:rPr>
-        <w:t xml:space="preserve"> </w:t>
-      </w:r>
-      <w:r>
-        <w:rPr>
-          <w:b w:val="0"/>
-          <w:sz w:val="22"/>
-          <w:szCs w:val="22"/>
-        </w:rPr>
-        <w:t xml:space="preserve">that reduced </w:t>
-      </w:r>
-      <w:r>
-        <w:rPr>
-          <w:b w:val="0"/>
-          <w:sz w:val="22"/>
-          <w:szCs w:val="22"/>
-        </w:rPr>
-        <w:t xml:space="preserve">installation time </w:t>
-      </w:r>
-      <w:r>
-        <w:rPr>
-          <w:b w:val="0"/>
-          <w:sz w:val="22"/>
-          <w:szCs w:val="22"/>
-        </w:rPr>
-        <w:t xml:space="preserve">by </w:t>
-      </w:r>
-      <w:r>
-        <w:rPr>
-          <w:sz w:val="22"/>
-          <w:szCs w:val="22"/>
-        </w:rPr>
-        <w:t>50%</w:t>
-      </w:r>
-    </w:p>
-    <w:p>
-      <w:pPr>
-        <w:pStyle w:val="Heading2"/>
-        <w:spacing w:before="120"/>
-        <w:ind w:left="0"/>
-        <w:jc w:val="both"/>
-        <w:rPr>
-          <w:sz w:val="22"/>
-          <w:szCs w:val="22"/>
-        </w:rPr>
-      </w:pPr>
-      <w:r>
-        <w:rPr>
-          <w:sz w:val="22"/>
-          <w:szCs w:val="22"/>
-        </w:rPr>
-        <w:t>I</w:t>
-      </w:r>
-      <w:r>
-        <w:rPr>
-          <w:sz w:val="22"/>
-          <w:szCs w:val="22"/>
-        </w:rPr>
-        <w:t xml:space="preserve">ntel, </w:t>
-      </w:r>
-      <w:r>
-        <w:rPr>
-          <w:sz w:val="22"/>
-          <w:szCs w:val="22"/>
-        </w:rPr>
-        <w:t xml:space="preserve">Software Engineering </w:t>
-      </w:r>
-      <w:r>
-        <w:rPr>
-          <w:sz w:val="22"/>
-          <w:szCs w:val="22"/>
-        </w:rPr>
-        <w:t>Summer Intern</w:t>
-      </w:r>
-      <w:r>
-        <w:rPr>
-          <w:sz w:val="22"/>
-          <w:szCs w:val="22"/>
-        </w:rPr>
-        <w:tab/>
-        <w:t xml:space="preserve">       </w:t>
-      </w:r>
-      <w:r>
-        <w:rPr>
-          <w:sz w:val="22"/>
-          <w:szCs w:val="22"/>
-        </w:rPr>
-        <w:tab/>
-      </w:r>
-      <w:r>
-        <w:rPr>
-          <w:sz w:val="22"/>
-          <w:szCs w:val="22"/>
-        </w:rPr>
-        <w:tab/>
-      </w:r>
-      <w:r>
-        <w:rPr>
-          <w:sz w:val="22"/>
-          <w:szCs w:val="22"/>
-        </w:rPr>
-        <w:tab/>
-      </w:r>
-      <w:r>
-        <w:rPr>
-          <w:sz w:val="22"/>
-          <w:szCs w:val="22"/>
-        </w:rPr>
-        <w:tab/>
-      </w:r>
-      <w:r>
-        <w:rPr>
-          <w:sz w:val="22"/>
-          <w:szCs w:val="22"/>
-        </w:rPr>
-        <w:tab/>
-      </w:r>
-      <w:r>
-        <w:rPr>
-          <w:sz w:val="22"/>
-          <w:szCs w:val="22"/>
-        </w:rPr>
-        <w:t xml:space="preserve">    </w:t>
-      </w:r>
-      <w:r>
-        <w:rPr>
-          <w:sz w:val="22"/>
-          <w:szCs w:val="22"/>
-        </w:rPr>
-        <w:tab/>
-        <w:t xml:space="preserve">    </w:t>
-      </w:r>
-      <w:r>
-        <w:rPr>
-          <w:i/>
-          <w:sz w:val="22"/>
-          <w:szCs w:val="22"/>
-        </w:rPr>
-        <w:t xml:space="preserve">May 2017 – </w:t>
-      </w:r>
-      <w:r>
-        <w:rPr>
-          <w:i/>
-          <w:sz w:val="22"/>
-          <w:szCs w:val="22"/>
-        </w:rPr>
-        <w:t>Aug</w:t>
-      </w:r>
-      <w:r>
-        <w:rPr>
-          <w:i/>
-          <w:sz w:val="22"/>
-          <w:szCs w:val="22"/>
-        </w:rPr>
-        <w:t xml:space="preserve"> 2017</w:t>
-      </w:r>
-    </w:p>
-    <w:p>
-      <w:pPr>
-        <w:pStyle w:val="Heading2"/>
-        <w:numPr>
-          <w:ilvl w:val="0"/>
-          <w:numId w:val="6"/>
-        </w:numPr>
-        <w:spacing w:before="0"/>
-        <w:ind w:left="270" w:hanging="180"/>
-        <w:jc w:val="both"/>
-        <w:rPr>
-          <w:b w:val="0"/>
-          <w:sz w:val="22"/>
-          <w:szCs w:val="22"/>
-        </w:rPr>
-      </w:pPr>
-      <w:r>
-        <w:rPr>
-          <w:b w:val="0"/>
-          <w:sz w:val="22"/>
-          <w:szCs w:val="22"/>
-        </w:rPr>
-        <w:t xml:space="preserve">Engineered </w:t>
-      </w:r>
-      <w:r>
-        <w:rPr>
-          <w:b w:val="0"/>
-          <w:sz w:val="22"/>
-          <w:szCs w:val="22"/>
-        </w:rPr>
-        <w:t>Intel Saffron</w:t>
-      </w:r>
-      <w:r>
-        <w:rPr>
-          <w:b w:val="0"/>
-          <w:sz w:val="22"/>
-          <w:szCs w:val="22"/>
-        </w:rPr>
-        <w:t>’s</w:t>
-      </w:r>
-      <w:r>
-        <w:rPr>
-          <w:b w:val="0"/>
-          <w:sz w:val="22"/>
-          <w:szCs w:val="22"/>
-        </w:rPr>
-        <w:t xml:space="preserve"> Java REST </w:t>
-      </w:r>
-      <w:r>
-        <w:rPr>
-          <w:b w:val="0"/>
-          <w:sz w:val="22"/>
-          <w:szCs w:val="22"/>
-        </w:rPr>
-        <w:t>API</w:t>
-      </w:r>
-      <w:r>
-        <w:rPr>
-          <w:b w:val="0"/>
-          <w:sz w:val="22"/>
-          <w:szCs w:val="22"/>
-        </w:rPr>
-        <w:t>,</w:t>
-      </w:r>
-      <w:r>
-        <w:rPr>
-          <w:b w:val="0"/>
-          <w:sz w:val="22"/>
-          <w:szCs w:val="22"/>
-        </w:rPr>
-        <w:t xml:space="preserve"> </w:t>
-      </w:r>
-      <w:r>
-        <w:rPr>
-          <w:b w:val="0"/>
-          <w:sz w:val="22"/>
-          <w:szCs w:val="22"/>
-        </w:rPr>
-        <w:t xml:space="preserve">encapsulating unique security protocols and complex </w:t>
-      </w:r>
-      <w:r>
-        <w:rPr>
-          <w:b w:val="0"/>
-          <w:sz w:val="22"/>
-          <w:szCs w:val="22"/>
-        </w:rPr>
-        <w:t>classification</w:t>
-      </w:r>
-      <w:r>
-        <w:rPr>
-          <w:b w:val="0"/>
-          <w:sz w:val="22"/>
-          <w:szCs w:val="22"/>
-        </w:rPr>
-        <w:t xml:space="preserve"> </w:t>
-      </w:r>
-      <w:r>
-        <w:rPr>
-          <w:b w:val="0"/>
-          <w:sz w:val="22"/>
-          <w:szCs w:val="22"/>
-        </w:rPr>
-        <w:t>and recommendation</w:t>
-      </w:r>
-      <w:r>
-        <w:rPr>
-          <w:b w:val="0"/>
-          <w:sz w:val="22"/>
-          <w:szCs w:val="22"/>
-        </w:rPr>
-        <w:t xml:space="preserve"> APIs</w:t>
-      </w:r>
-      <w:r>
-        <w:rPr>
-          <w:b w:val="0"/>
-          <w:sz w:val="22"/>
-          <w:szCs w:val="22"/>
-        </w:rPr>
-        <w:t>.</w:t>
-      </w:r>
-      <w:r>
-        <w:rPr>
-          <w:b w:val="0"/>
-          <w:sz w:val="22"/>
-          <w:szCs w:val="22"/>
-        </w:rPr>
-        <w:t xml:space="preserve"> E</w:t>
-      </w:r>
-      <w:r>
-        <w:rPr>
-          <w:b w:val="0"/>
-          <w:sz w:val="22"/>
-          <w:szCs w:val="22"/>
-        </w:rPr>
-        <w:t xml:space="preserve">nabled </w:t>
-      </w:r>
-      <w:r>
-        <w:rPr>
-          <w:bCs w:val="0"/>
-          <w:sz w:val="22"/>
-          <w:szCs w:val="22"/>
-        </w:rPr>
-        <w:t>10x faster API calls</w:t>
-      </w:r>
-      <w:r>
-        <w:rPr>
-          <w:b w:val="0"/>
-          <w:sz w:val="22"/>
-          <w:szCs w:val="22"/>
-        </w:rPr>
-        <w:t xml:space="preserve"> for </w:t>
-      </w:r>
-      <w:r>
-        <w:rPr>
-          <w:b w:val="0"/>
-          <w:sz w:val="22"/>
-          <w:szCs w:val="22"/>
-        </w:rPr>
-        <w:t>the client user</w:t>
-      </w:r>
-      <w:bookmarkStart w:id="1" w:name="EDUCATION"/>
-      <w:bookmarkStart w:id="2" w:name="SKILLS_&amp;_INTERESTS"/>
-      <w:bookmarkStart w:id="3" w:name="OTHER_PROJECTS"/>
-      <w:bookmarkEnd w:id="1"/>
-      <w:bookmarkEnd w:id="2"/>
-      <w:bookmarkEnd w:id="3"/>
+        <w:t>notable 90%</w:t>
+      </w:r>
       <w:r>
         <w:rPr>
           <w:b w:val="0"/>
@@ -2574,245 +2111,8 @@
         <w:spacing w:before="120"/>
         <w:rPr>
           <w:b/>
-          <w:bCs/>
-          <w:smallCaps/>
           <w:sz w:val="24"/>
           <w:szCs w:val="24"/>
-        </w:rPr>
-      </w:pPr>
-      <w:r>
-        <w:rPr>
-          <w:b/>
-          <w:bCs/>
-          <w:smallCaps/>
-          <w:sz w:val="24"/>
-          <w:szCs w:val="24"/>
-        </w:rPr>
-        <w:t>Additional Projects</w:t>
-      </w:r>
-    </w:p>
-    <w:p>
-      <w:pPr>
-        <w:pStyle w:val="ListParagraph"/>
-        <w:tabs>
-          <w:tab w:val="left" w:pos="0"/>
-          <w:tab w:val="left" w:pos="9503"/>
-          <w:tab w:val="left" w:pos="10620"/>
-        </w:tabs>
-        <w:spacing w:before="0"/>
-        <w:ind w:left="0" w:firstLine="0"/>
-        <w:jc w:val="both"/>
-        <w:rPr>
-          <w:b/>
-          <w:color w:val="000000" w:themeColor="text1"/>
-        </w:rPr>
-      </w:pPr>
-      <w:r>
-        <w:rPr>
-          <w:b/>
-        </w:rPr>
-        <w:t>Personal Portfolio</w:t>
-      </w:r>
-      <w:r>
-        <w:rPr>
-          <w:b/>
-        </w:rPr>
-        <w:t xml:space="preserve">, </w:t>
-      </w:r>
-      <w:r>
-        <w:t>uses Angular, GitHub Actions for CI/CD, Karma for testing</w:t>
-      </w:r>
-      <w:r>
-        <w:t xml:space="preserve">                                      </w:t>
-      </w:r>
-      <w:hyperlink r:id="rId13" w:history="1">
-        <w:r>
-          <w:rPr>
-            <w:rStyle w:val="Hyperlink"/>
-            <w:b/>
-            <w:bCs/>
-            <w:color w:val="000000" w:themeColor="text1"/>
-            <w:u w:val="none"/>
-          </w:rPr>
-          <w:t>https://bhatvivek.com</w:t>
-        </w:r>
-      </w:hyperlink>
-    </w:p>
-    <w:p>
-      <w:pPr>
-        <w:pStyle w:val="ListParagraph"/>
-        <w:tabs>
-          <w:tab w:val="left" w:pos="0"/>
-          <w:tab w:val="left" w:pos="9503"/>
-        </w:tabs>
-        <w:spacing w:before="0"/>
-        <w:ind w:left="0" w:firstLine="0"/>
-        <w:jc w:val="both"/>
-      </w:pPr>
-      <w:r>
-        <w:t xml:space="preserve">Personal </w:t>
-      </w:r>
-      <w:r>
-        <w:t xml:space="preserve">secure </w:t>
-      </w:r>
-      <w:r>
-        <w:t>portfolio/website</w:t>
-      </w:r>
-      <w:r>
-        <w:t xml:space="preserve"> </w:t>
-      </w:r>
-      <w:r>
-        <w:t xml:space="preserve">hosted on </w:t>
-      </w:r>
-      <w:r>
-        <w:t>GitHub</w:t>
-      </w:r>
-      <w:r>
-        <w:t xml:space="preserve"> pages</w:t>
-      </w:r>
-      <w:r>
-        <w:t xml:space="preserve"> with </w:t>
-      </w:r>
-      <w:r>
-        <w:t xml:space="preserve">CI/CD for </w:t>
-      </w:r>
-      <w:r>
-        <w:t>testing</w:t>
-      </w:r>
-      <w:r>
-        <w:t>, building and deploying the application</w:t>
-      </w:r>
-    </w:p>
-    <w:p>
-      <w:pPr>
-        <w:pStyle w:val="ListParagraph"/>
-        <w:tabs>
-          <w:tab w:val="left" w:pos="0"/>
-          <w:tab w:val="left" w:pos="9503"/>
-        </w:tabs>
-        <w:spacing w:before="60"/>
-        <w:ind w:left="0" w:firstLine="0"/>
-        <w:jc w:val="both"/>
-      </w:pPr>
-      <w:r>
-        <w:rPr>
-          <w:b/>
-        </w:rPr>
-        <w:t>Serverless REST APIs</w:t>
-      </w:r>
-      <w:r>
-        <w:t>, uses AWS API Gateway, Lambda, Dynamo DB</w:t>
-      </w:r>
-      <w:r>
-        <w:t>, NodeJS</w:t>
-      </w:r>
-      <w:r>
-        <w:tab/>
-        <w:t xml:space="preserve">     </w:t>
-      </w:r>
-      <w:hyperlink r:id="rId14" w:history="1">
-        <w:r>
-          <w:rPr>
-            <w:rStyle w:val="Hyperlink"/>
-            <w:b/>
-            <w:color w:val="auto"/>
-            <w:u w:val="none"/>
-          </w:rPr>
-          <w:t>git.io/</w:t>
-        </w:r>
-        <w:proofErr w:type="spellStart"/>
-        <w:r>
-          <w:rPr>
-            <w:rStyle w:val="Hyperlink"/>
-            <w:b/>
-            <w:color w:val="auto"/>
-            <w:u w:val="none"/>
-          </w:rPr>
-          <w:t>JfGEJ</w:t>
-        </w:r>
-        <w:proofErr w:type="spellEnd"/>
-      </w:hyperlink>
-    </w:p>
-    <w:p>
-      <w:pPr>
-        <w:pStyle w:val="ListParagraph"/>
-        <w:tabs>
-          <w:tab w:val="left" w:pos="0"/>
-          <w:tab w:val="left" w:pos="9503"/>
-        </w:tabs>
-        <w:spacing w:before="0"/>
-        <w:ind w:left="0" w:firstLine="0"/>
-        <w:jc w:val="both"/>
-      </w:pPr>
-      <w:r>
-        <w:t>Engineered</w:t>
-      </w:r>
-      <w:r>
-        <w:t xml:space="preserve"> serverless restful webservices with </w:t>
-      </w:r>
-      <w:r>
-        <w:t>Lambda function</w:t>
-      </w:r>
-      <w:r>
-        <w:t>s</w:t>
-      </w:r>
-      <w:r>
-        <w:t xml:space="preserve"> </w:t>
-      </w:r>
-      <w:r>
-        <w:t>operat</w:t>
-      </w:r>
-      <w:r>
-        <w:t>ing</w:t>
-      </w:r>
-      <w:r>
-        <w:t xml:space="preserve"> on </w:t>
-      </w:r>
-      <w:r>
-        <w:t>AWS D</w:t>
-      </w:r>
-      <w:r>
-        <w:t xml:space="preserve">ynamo </w:t>
-      </w:r>
-      <w:r>
-        <w:t>DB</w:t>
-      </w:r>
-      <w:r>
-        <w:t xml:space="preserve"> database</w:t>
-      </w:r>
-    </w:p>
-    <w:p>
-      <w:pPr>
-        <w:pBdr>
-          <w:bottom w:val="single" w:sz="6" w:space="1" w:color="auto"/>
-        </w:pBdr>
-        <w:spacing w:before="120"/>
-        <w:rPr>
-          <w:b/>
-          <w:bCs/>
-          <w:smallCaps/>
-          <w:sz w:val="24"/>
-          <w:szCs w:val="24"/>
-        </w:rPr>
-      </w:pPr>
-      <w:r>
-        <w:rPr>
-          <w:b/>
-          <w:bCs/>
-          <w:smallCaps/>
-          <w:sz w:val="24"/>
-          <w:szCs w:val="24"/>
-        </w:rPr>
-        <w:t>Education</w:t>
-      </w:r>
-    </w:p>
-    <w:p>
-      <w:pPr>
-        <w:tabs>
-          <w:tab w:val="left" w:pos="326"/>
-        </w:tabs>
-        <w:rPr>
-          <w:b/>
         </w:rPr>
         <w:sectPr>
           <w:type w:val="continuous"/>
@@ -2821,12 +2121,23 @@
           <w:cols w:space="720"/>
         </w:sectPr>
       </w:pPr>
+      <w:r>
+        <w:rPr>
+          <w:b/>
+          <w:bCs/>
+          <w:smallCaps/>
+          <w:sz w:val="28"/>
+          <w:szCs w:val="28"/>
+        </w:rPr>
+        <w:t>Education</w:t>
+      </w:r>
     </w:p>
     <w:p>
       <w:pPr>
         <w:tabs>
           <w:tab w:val="left" w:pos="326"/>
         </w:tabs>
+        <w:spacing w:before="60"/>
         <w:rPr>
           <w:b/>
         </w:rPr>
@@ -2898,7 +2209,19 @@
         <w:rPr>
           <w:b/>
         </w:rPr>
-        <w:t>August 2016 – December 2017</w:t>
+        <w:t>Aug 2016 – Dec</w:t>
+      </w:r>
+      <w:r>
+        <w:rPr>
+          <w:b/>
+        </w:rPr>
+        <w:t xml:space="preserve"> </w:t>
+      </w:r>
+      <w:r>
+        <w:rPr>
+          <w:b/>
+        </w:rPr>
+        <w:t>2017</w:t>
       </w:r>
     </w:p>
     <w:p>
@@ -2970,7 +2293,7 @@
     </w:p>
     <w:p>
       <w:pPr>
-        <w:spacing w:before="60"/>
+        <w:spacing w:before="120"/>
         <w:rPr>
           <w:b/>
         </w:rPr>
@@ -3050,157 +2373,8 @@
       </w:pPr>
     </w:p>
     <w:p>
-      <w:pPr>
-        <w:rPr>
-          <w:b/>
-        </w:rPr>
-      </w:pPr>
-      <w:r>
-        <w:t>Bachelor of Technology in Electronics and Communication Engineering</w:t>
-      </w:r>
-      <w:r>
-        <w:tab/>
-      </w:r>
-      <w:r>
-        <w:tab/>
-      </w:r>
-      <w:r>
-        <w:tab/>
-      </w:r>
-      <w:r>
-        <w:tab/>
-        <w:t xml:space="preserve">   </w:t>
-      </w:r>
-    </w:p>
-    <w:p>
-      <w:pPr>
-        <w:pBdr>
-          <w:bottom w:val="single" w:sz="6" w:space="1" w:color="auto"/>
-        </w:pBdr>
-        <w:spacing w:before="120"/>
-        <w:rPr>
-          <w:b/>
-          <w:bCs/>
-          <w:smallCaps/>
-          <w:sz w:val="24"/>
-          <w:szCs w:val="24"/>
-        </w:rPr>
-      </w:pPr>
-      <w:r>
-        <w:rPr>
-          <w:b/>
-          <w:bCs/>
-          <w:smallCaps/>
-          <w:sz w:val="24"/>
-          <w:szCs w:val="24"/>
-        </w:rPr>
-        <w:t>Leadership and Volunteer Service</w:t>
-      </w:r>
-    </w:p>
-    <w:p>
-      <w:pPr>
-        <w:pStyle w:val="Heading2"/>
-        <w:numPr>
-          <w:ilvl w:val="0"/>
-          <w:numId w:val="6"/>
-        </w:numPr>
-        <w:spacing w:before="0"/>
-        <w:ind w:left="270" w:hanging="180"/>
-        <w:jc w:val="both"/>
-        <w:rPr>
-          <w:b w:val="0"/>
-          <w:sz w:val="22"/>
-          <w:szCs w:val="22"/>
-        </w:rPr>
-      </w:pPr>
-      <w:r>
-        <w:rPr>
-          <w:bCs w:val="0"/>
-          <w:sz w:val="22"/>
-          <w:szCs w:val="22"/>
-        </w:rPr>
-        <w:t>Board member</w:t>
-      </w:r>
-      <w:r>
-        <w:rPr>
-          <w:b w:val="0"/>
-          <w:sz w:val="22"/>
-          <w:szCs w:val="22"/>
-        </w:rPr>
-        <w:t xml:space="preserve"> of multiple </w:t>
-      </w:r>
-      <w:r>
-        <w:rPr>
-          <w:b w:val="0"/>
-          <w:sz w:val="22"/>
-          <w:szCs w:val="22"/>
-        </w:rPr>
-        <w:t xml:space="preserve">Employee Resource Groups </w:t>
-      </w:r>
-      <w:r>
-        <w:rPr>
-          <w:b w:val="0"/>
-          <w:sz w:val="22"/>
-          <w:szCs w:val="22"/>
-        </w:rPr>
-        <w:t xml:space="preserve">at Intel. </w:t>
-      </w:r>
-      <w:r>
-        <w:rPr>
-          <w:b w:val="0"/>
-          <w:sz w:val="22"/>
-          <w:szCs w:val="22"/>
-        </w:rPr>
-        <w:t xml:space="preserve">Organized multiple </w:t>
-      </w:r>
-      <w:r>
-        <w:rPr>
-          <w:b w:val="0"/>
-          <w:sz w:val="22"/>
-          <w:szCs w:val="22"/>
-        </w:rPr>
-        <w:t xml:space="preserve">socio-cultural </w:t>
-      </w:r>
-      <w:r>
-        <w:rPr>
-          <w:b w:val="0"/>
-          <w:sz w:val="22"/>
-          <w:szCs w:val="22"/>
-        </w:rPr>
-        <w:t>events</w:t>
-      </w:r>
-    </w:p>
-    <w:p>
-      <w:pPr>
-        <w:pStyle w:val="Heading2"/>
-        <w:numPr>
-          <w:ilvl w:val="0"/>
-          <w:numId w:val="6"/>
-        </w:numPr>
-        <w:spacing w:before="0"/>
-        <w:ind w:left="270" w:hanging="180"/>
-        <w:jc w:val="both"/>
-        <w:rPr>
-          <w:b w:val="0"/>
-          <w:sz w:val="22"/>
-          <w:szCs w:val="22"/>
-        </w:rPr>
-      </w:pPr>
-      <w:r>
-        <w:rPr>
-          <w:bCs w:val="0"/>
-          <w:sz w:val="22"/>
-          <w:szCs w:val="22"/>
-        </w:rPr>
-        <w:t>President</w:t>
-      </w:r>
-      <w:r>
-        <w:rPr>
-          <w:b w:val="0"/>
-          <w:sz w:val="22"/>
-          <w:szCs w:val="22"/>
-        </w:rPr>
-        <w:t xml:space="preserve"> of IEEE JMI Student Branch and IEEE JMI Computer Society (2015-2016)</w:t>
+      <w:r>
+        <w:t xml:space="preserve">Bachelor of Technology in Electronics and Communication Engineering </w:t>
       </w:r>
     </w:p>
     <w:sectPr>
@@ -3214,7 +2388,7 @@
 </file>
 
 <file path=word/endnotes.xml><?xml version="1.0" encoding="utf-8"?>
-<w:endnotes xmlns:wpc="http://schemas.microsoft.com/office/word/2010/wordprocessingCanvas" xmlns:cx="http://schemas.microsoft.com/office/drawing/2014/chartex" xmlns:cx1="http://schemas.microsoft.com/office/drawing/2015/9/8/chartex" xmlns:cx2="http://schemas.microsoft.com/office/drawing/2015/10/21/chartex" xmlns:cx3="http://schemas.microsoft.com/office/drawing/2016/5/9/chartex" xmlns:cx4="http://schemas.microsoft.com/office/drawing/2016/5/10/chartex" xmlns:cx5="http://schemas.microsoft.com/office/drawing/2016/5/11/chartex" xmlns:cx6="http://schemas.microsoft.com/office/drawing/2016/5/12/chartex" xmlns:cx7="http://schemas.microsoft.com/office/drawing/2016/5/13/chartex" xmlns:cx8="http://schemas.microsoft.com/office/drawing/2016/5/14/chartex" xmlns:mc="http://schemas.openxmlformats.org/markup-compatibility/2006" xmlns:aink="http://schemas.microsoft.com/office/drawing/2016/ink" xmlns:am3d="http://schemas.microsoft.com/office/drawing/2017/model3d" xmlns:o="urn:schemas-microsoft-com:office:office" xmlns:r="http://schemas.openxmlformats.org/officeDocument/2006/relationships" xmlns:m="http://schemas.openxmlformats.org/officeDocument/2006/math" xmlns:v="urn:schemas-microsoft-com:vml" xmlns:wp14="http://schemas.microsoft.com/office/word/2010/wordprocessingDrawing" xmlns:wp="http://schemas.openxmlformats.org/drawingml/2006/wordprocessingDrawing" xmlns:w10="urn:schemas-microsoft-com:office:word" xmlns:w="http://schemas.openxmlformats.org/wordprocessingml/2006/main" xmlns:w14="http://schemas.microsoft.com/office/word/2010/wordml" xmlns:w15="http://schemas.microsoft.com/office/word/2012/wordml" xmlns:w16cex="http://schemas.microsoft.com/office/word/2018/wordml/cex" xmlns:w16cid="http://schemas.microsoft.com/office/word/2016/wordml/cid" xmlns:w16="http://schemas.microsoft.com/office/word/2018/wordml" xmlns:w16sdtdh="http://schemas.microsoft.com/office/word/2020/wordml/sdtdatahash" xmlns:w16se="http://schemas.microsoft.com/office/word/2015/wordml/symex" xmlns:wpg="http://schemas.microsoft.com/office/word/2010/wordprocessingGroup" xmlns:wpi="http://schemas.microsoft.com/office/word/2010/wordprocessingInk" xmlns:wne="http://schemas.microsoft.com/office/word/2006/wordml" xmlns:wps="http://schemas.microsoft.com/office/word/2010/wordprocessingShape" mc:Ignorable="w14 w15 w16se w16cid w16 w16cex w16sdtdh wp14">
+<w:endnotes xmlns:wpc="http://schemas.microsoft.com/office/word/2010/wordprocessingCanvas" xmlns:cx="http://schemas.microsoft.com/office/drawing/2014/chartex" xmlns:cx1="http://schemas.microsoft.com/office/drawing/2015/9/8/chartex" xmlns:cx2="http://schemas.microsoft.com/office/drawing/2015/10/21/chartex" xmlns:cx3="http://schemas.microsoft.com/office/drawing/2016/5/9/chartex" xmlns:cx4="http://schemas.microsoft.com/office/drawing/2016/5/10/chartex" xmlns:cx5="http://schemas.microsoft.com/office/drawing/2016/5/11/chartex" xmlns:cx6="http://schemas.microsoft.com/office/drawing/2016/5/12/chartex" xmlns:cx7="http://schemas.microsoft.com/office/drawing/2016/5/13/chartex" xmlns:cx8="http://schemas.microsoft.com/office/drawing/2016/5/14/chartex" xmlns:mc="http://schemas.openxmlformats.org/markup-compatibility/2006" xmlns:aink="http://schemas.microsoft.com/office/drawing/2016/ink" xmlns:am3d="http://schemas.microsoft.com/office/drawing/2017/model3d" xmlns:o="urn:schemas-microsoft-com:office:office" xmlns:oel="http://schemas.microsoft.com/office/2019/extlst" xmlns:r="http://schemas.openxmlformats.org/officeDocument/2006/relationships" xmlns:m="http://schemas.openxmlformats.org/officeDocument/2006/math" xmlns:v="urn:schemas-microsoft-com:vml" xmlns:wp14="http://schemas.microsoft.com/office/word/2010/wordprocessingDrawing" xmlns:wp="http://schemas.openxmlformats.org/drawingml/2006/wordprocessingDrawing" xmlns:w10="urn:schemas-microsoft-com:office:word" xmlns:w="http://schemas.openxmlformats.org/wordprocessingml/2006/main" xmlns:w14="http://schemas.microsoft.com/office/word/2010/wordml" xmlns:w15="http://schemas.microsoft.com/office/word/2012/wordml" xmlns:w16cex="http://schemas.microsoft.com/office/word/2018/wordml/cex" xmlns:w16cid="http://schemas.microsoft.com/office/word/2016/wordml/cid" xmlns:w16="http://schemas.microsoft.com/office/word/2018/wordml" xmlns:w16sdtdh="http://schemas.microsoft.com/office/word/2020/wordml/sdtdatahash" xmlns:w16se="http://schemas.microsoft.com/office/word/2015/wordml/symex" xmlns:wpg="http://schemas.microsoft.com/office/word/2010/wordprocessingGroup" xmlns:wpi="http://schemas.microsoft.com/office/word/2010/wordprocessingInk" xmlns:wne="http://schemas.microsoft.com/office/word/2006/wordml" xmlns:wps="http://schemas.microsoft.com/office/word/2010/wordprocessingShape" mc:Ignorable="w14 w15 w16se w16cid w16 w16cex w16sdtdh wp14">
   <w:endnote w:type="separator" w:id="-1">
     <w:p>
       <w:r>
@@ -3236,7 +2410,7 @@
 </file>
 
 <file path=word/footnotes.xml><?xml version="1.0" encoding="utf-8"?>
-<w:footnotes xmlns:wpc="http://schemas.microsoft.com/office/word/2010/wordprocessingCanvas" xmlns:cx="http://schemas.microsoft.com/office/drawing/2014/chartex" xmlns:cx1="http://schemas.microsoft.com/office/drawing/2015/9/8/chartex" xmlns:cx2="http://schemas.microsoft.com/office/drawing/2015/10/21/chartex" xmlns:cx3="http://schemas.microsoft.com/office/drawing/2016/5/9/chartex" xmlns:cx4="http://schemas.microsoft.com/office/drawing/2016/5/10/chartex" xmlns:cx5="http://schemas.microsoft.com/office/drawing/2016/5/11/chartex" xmlns:cx6="http://schemas.microsoft.com/office/drawing/2016/5/12/chartex" xmlns:cx7="http://schemas.microsoft.com/office/drawing/2016/5/13/chartex" xmlns:cx8="http://schemas.microsoft.com/office/drawing/2016/5/14/chartex" xmlns:mc="http://schemas.openxmlformats.org/markup-compatibility/2006" xmlns:aink="http://schemas.microsoft.com/office/drawing/2016/ink" xmlns:am3d="http://schemas.microsoft.com/office/drawing/2017/model3d" xmlns:o="urn:schemas-microsoft-com:office:office" xmlns:r="http://schemas.openxmlformats.org/officeDocument/2006/relationships" xmlns:m="http://schemas.openxmlformats.org/officeDocument/2006/math" xmlns:v="urn:schemas-microsoft-com:vml" xmlns:wp14="http://schemas.microsoft.com/office/word/2010/wordprocessingDrawing" xmlns:wp="http://schemas.openxmlformats.org/drawingml/2006/wordprocessingDrawing" xmlns:w10="urn:schemas-microsoft-com:office:word" xmlns:w="http://schemas.openxmlformats.org/wordprocessingml/2006/main" xmlns:w14="http://schemas.microsoft.com/office/word/2010/wordml" xmlns:w15="http://schemas.microsoft.com/office/word/2012/wordml" xmlns:w16cex="http://schemas.microsoft.com/office/word/2018/wordml/cex" xmlns:w16cid="http://schemas.microsoft.com/office/word/2016/wordml/cid" xmlns:w16="http://schemas.microsoft.com/office/word/2018/wordml" xmlns:w16sdtdh="http://schemas.microsoft.com/office/word/2020/wordml/sdtdatahash" xmlns:w16se="http://schemas.microsoft.com/office/word/2015/wordml/symex" xmlns:wpg="http://schemas.microsoft.com/office/word/2010/wordprocessingGroup" xmlns:wpi="http://schemas.microsoft.com/office/word/2010/wordprocessingInk" xmlns:wne="http://schemas.microsoft.com/office/word/2006/wordml" xmlns:wps="http://schemas.microsoft.com/office/word/2010/wordprocessingShape" mc:Ignorable="w14 w15 w16se w16cid w16 w16cex w16sdtdh wp14">
+<w:footnotes xmlns:wpc="http://schemas.microsoft.com/office/word/2010/wordprocessingCanvas" xmlns:cx="http://schemas.microsoft.com/office/drawing/2014/chartex" xmlns:cx1="http://schemas.microsoft.com/office/drawing/2015/9/8/chartex" xmlns:cx2="http://schemas.microsoft.com/office/drawing/2015/10/21/chartex" xmlns:cx3="http://schemas.microsoft.com/office/drawing/2016/5/9/chartex" xmlns:cx4="http://schemas.microsoft.com/office/drawing/2016/5/10/chartex" xmlns:cx5="http://schemas.microsoft.com/office/drawing/2016/5/11/chartex" xmlns:cx6="http://schemas.microsoft.com/office/drawing/2016/5/12/chartex" xmlns:cx7="http://schemas.microsoft.com/office/drawing/2016/5/13/chartex" xmlns:cx8="http://schemas.microsoft.com/office/drawing/2016/5/14/chartex" xmlns:mc="http://schemas.openxmlformats.org/markup-compatibility/2006" xmlns:aink="http://schemas.microsoft.com/office/drawing/2016/ink" xmlns:am3d="http://schemas.microsoft.com/office/drawing/2017/model3d" xmlns:o="urn:schemas-microsoft-com:office:office" xmlns:oel="http://schemas.microsoft.com/office/2019/extlst" xmlns:r="http://schemas.openxmlformats.org/officeDocument/2006/relationships" xmlns:m="http://schemas.openxmlformats.org/officeDocument/2006/math" xmlns:v="urn:schemas-microsoft-com:vml" xmlns:wp14="http://schemas.microsoft.com/office/word/2010/wordprocessingDrawing" xmlns:wp="http://schemas.openxmlformats.org/drawingml/2006/wordprocessingDrawing" xmlns:w10="urn:schemas-microsoft-com:office:word" xmlns:w="http://schemas.openxmlformats.org/wordprocessingml/2006/main" xmlns:w14="http://schemas.microsoft.com/office/word/2010/wordml" xmlns:w15="http://schemas.microsoft.com/office/word/2012/wordml" xmlns:w16cex="http://schemas.microsoft.com/office/word/2018/wordml/cex" xmlns:w16cid="http://schemas.microsoft.com/office/word/2016/wordml/cid" xmlns:w16="http://schemas.microsoft.com/office/word/2018/wordml" xmlns:w16sdtdh="http://schemas.microsoft.com/office/word/2020/wordml/sdtdatahash" xmlns:w16se="http://schemas.microsoft.com/office/word/2015/wordml/symex" xmlns:wpg="http://schemas.microsoft.com/office/word/2010/wordprocessingGroup" xmlns:wpi="http://schemas.microsoft.com/office/word/2010/wordprocessingInk" xmlns:wne="http://schemas.microsoft.com/office/word/2006/wordml" xmlns:wps="http://schemas.microsoft.com/office/word/2010/wordprocessingShape" mc:Ignorable="w14 w15 w16se w16cid w16 w16cex w16sdtdh wp14">
   <w:footnote w:type="separator" w:id="-1">
     <w:p>
       <w:r>
@@ -3257,8 +2431,18 @@
 </w:footnotes>
 </file>
 
+<file path=word/header1.xml><?xml version="1.0" encoding="utf-8"?>
+<w:hdr xmlns:wpc="http://schemas.microsoft.com/office/word/2010/wordprocessingCanvas" xmlns:cx="http://schemas.microsoft.com/office/drawing/2014/chartex" xmlns:cx1="http://schemas.microsoft.com/office/drawing/2015/9/8/chartex" xmlns:cx2="http://schemas.microsoft.com/office/drawing/2015/10/21/chartex" xmlns:cx3="http://schemas.microsoft.com/office/drawing/2016/5/9/chartex" xmlns:cx4="http://schemas.microsoft.com/office/drawing/2016/5/10/chartex" xmlns:cx5="http://schemas.microsoft.com/office/drawing/2016/5/11/chartex" xmlns:cx6="http://schemas.microsoft.com/office/drawing/2016/5/12/chartex" xmlns:cx7="http://schemas.microsoft.com/office/drawing/2016/5/13/chartex" xmlns:cx8="http://schemas.microsoft.com/office/drawing/2016/5/14/chartex" xmlns:mc="http://schemas.openxmlformats.org/markup-compatibility/2006" xmlns:aink="http://schemas.microsoft.com/office/drawing/2016/ink" xmlns:am3d="http://schemas.microsoft.com/office/drawing/2017/model3d" xmlns:o="urn:schemas-microsoft-com:office:office" xmlns:oel="http://schemas.microsoft.com/office/2019/extlst" xmlns:r="http://schemas.openxmlformats.org/officeDocument/2006/relationships" xmlns:m="http://schemas.openxmlformats.org/officeDocument/2006/math" xmlns:v="urn:schemas-microsoft-com:vml" xmlns:wp14="http://schemas.microsoft.com/office/word/2010/wordprocessingDrawing" xmlns:wp="http://schemas.openxmlformats.org/drawingml/2006/wordprocessingDrawing" xmlns:w10="urn:schemas-microsoft-com:office:word" xmlns:w="http://schemas.openxmlformats.org/wordprocessingml/2006/main" xmlns:w14="http://schemas.microsoft.com/office/word/2010/wordml" xmlns:w15="http://schemas.microsoft.com/office/word/2012/wordml" xmlns:w16cex="http://schemas.microsoft.com/office/word/2018/wordml/cex" xmlns:w16cid="http://schemas.microsoft.com/office/word/2016/wordml/cid" xmlns:w16="http://schemas.microsoft.com/office/word/2018/wordml" xmlns:w16sdtdh="http://schemas.microsoft.com/office/word/2020/wordml/sdtdatahash" xmlns:w16se="http://schemas.microsoft.com/office/word/2015/wordml/symex" xmlns:wpg="http://schemas.microsoft.com/office/word/2010/wordprocessingGroup" xmlns:wpi="http://schemas.microsoft.com/office/word/2010/wordprocessingInk" xmlns:wne="http://schemas.microsoft.com/office/word/2006/wordml" xmlns:wps="http://schemas.microsoft.com/office/word/2010/wordprocessingShape" mc:Ignorable="w14 w15 w16se w16cid w16 w16cex w16sdtdh wp14">
+  <w:p>
+    <w:pPr>
+      <w:pStyle w:val="Header"/>
+    </w:pPr>
+  </w:p>
+</w:hdr>
+</file>
+
 <file path=word/numbering.xml><?xml version="1.0" encoding="utf-8"?>
-<w:numbering xmlns:wpc="http://schemas.microsoft.com/office/word/2010/wordprocessingCanvas" xmlns:cx="http://schemas.microsoft.com/office/drawing/2014/chartex" xmlns:cx1="http://schemas.microsoft.com/office/drawing/2015/9/8/chartex" xmlns:cx2="http://schemas.microsoft.com/office/drawing/2015/10/21/chartex" xmlns:cx3="http://schemas.microsoft.com/office/drawing/2016/5/9/chartex" xmlns:cx4="http://schemas.microsoft.com/office/drawing/2016/5/10/chartex" xmlns:cx5="http://schemas.microsoft.com/office/drawing/2016/5/11/chartex" xmlns:cx6="http://schemas.microsoft.com/office/drawing/2016/5/12/chartex" xmlns:cx7="http://schemas.microsoft.com/office/drawing/2016/5/13/chartex" xmlns:cx8="http://schemas.microsoft.com/office/drawing/2016/5/14/chartex" xmlns:mc="http://schemas.openxmlformats.org/markup-compatibility/2006" xmlns:aink="http://schemas.microsoft.com/office/drawing/2016/ink" xmlns:am3d="http://schemas.microsoft.com/office/drawing/2017/model3d" xmlns:o="urn:schemas-microsoft-com:office:office" xmlns:r="http://schemas.openxmlformats.org/officeDocument/2006/relationships" xmlns:m="http://schemas.openxmlformats.org/officeDocument/2006/math" xmlns:v="urn:schemas-microsoft-com:vml" xmlns:wp14="http://schemas.microsoft.com/office/word/2010/wordprocessingDrawing" xmlns:wp="http://schemas.openxmlformats.org/drawingml/2006/wordprocessingDrawing" xmlns:w10="urn:schemas-microsoft-com:office:word" xmlns:w="http://schemas.openxmlformats.org/wordprocessingml/2006/main" xmlns:w14="http://schemas.microsoft.com/office/word/2010/wordml" xmlns:w15="http://schemas.microsoft.com/office/word/2012/wordml" xmlns:w16cex="http://schemas.microsoft.com/office/word/2018/wordml/cex" xmlns:w16cid="http://schemas.microsoft.com/office/word/2016/wordml/cid" xmlns:w16="http://schemas.microsoft.com/office/word/2018/wordml" xmlns:w16sdtdh="http://schemas.microsoft.com/office/word/2020/wordml/sdtdatahash" xmlns:w16se="http://schemas.microsoft.com/office/word/2015/wordml/symex" xmlns:wpg="http://schemas.microsoft.com/office/word/2010/wordprocessingGroup" xmlns:wpi="http://schemas.microsoft.com/office/word/2010/wordprocessingInk" xmlns:wne="http://schemas.microsoft.com/office/word/2006/wordml" xmlns:wps="http://schemas.microsoft.com/office/word/2010/wordprocessingShape" mc:Ignorable="w14 w15 w16se w16cid w16 w16cex w16sdtdh wp14">
+<w:numbering xmlns:wpc="http://schemas.microsoft.com/office/word/2010/wordprocessingCanvas" xmlns:cx="http://schemas.microsoft.com/office/drawing/2014/chartex" xmlns:cx1="http://schemas.microsoft.com/office/drawing/2015/9/8/chartex" xmlns:cx2="http://schemas.microsoft.com/office/drawing/2015/10/21/chartex" xmlns:cx3="http://schemas.microsoft.com/office/drawing/2016/5/9/chartex" xmlns:cx4="http://schemas.microsoft.com/office/drawing/2016/5/10/chartex" xmlns:cx5="http://schemas.microsoft.com/office/drawing/2016/5/11/chartex" xmlns:cx6="http://schemas.microsoft.com/office/drawing/2016/5/12/chartex" xmlns:cx7="http://schemas.microsoft.com/office/drawing/2016/5/13/chartex" xmlns:cx8="http://schemas.microsoft.com/office/drawing/2016/5/14/chartex" xmlns:mc="http://schemas.openxmlformats.org/markup-compatibility/2006" xmlns:aink="http://schemas.microsoft.com/office/drawing/2016/ink" xmlns:am3d="http://schemas.microsoft.com/office/drawing/2017/model3d" xmlns:o="urn:schemas-microsoft-com:office:office" xmlns:oel="http://schemas.microsoft.com/office/2019/extlst" xmlns:r="http://schemas.openxmlformats.org/officeDocument/2006/relationships" xmlns:m="http://schemas.openxmlformats.org/officeDocument/2006/math" xmlns:v="urn:schemas-microsoft-com:vml" xmlns:wp14="http://schemas.microsoft.com/office/word/2010/wordprocessingDrawing" xmlns:wp="http://schemas.openxmlformats.org/drawingml/2006/wordprocessingDrawing" xmlns:w10="urn:schemas-microsoft-com:office:word" xmlns:w="http://schemas.openxmlformats.org/wordprocessingml/2006/main" xmlns:w14="http://schemas.microsoft.com/office/word/2010/wordml" xmlns:w15="http://schemas.microsoft.com/office/word/2012/wordml" xmlns:w16cex="http://schemas.microsoft.com/office/word/2018/wordml/cex" xmlns:w16cid="http://schemas.microsoft.com/office/word/2016/wordml/cid" xmlns:w16="http://schemas.microsoft.com/office/word/2018/wordml" xmlns:w16sdtdh="http://schemas.microsoft.com/office/word/2020/wordml/sdtdatahash" xmlns:w16se="http://schemas.microsoft.com/office/word/2015/wordml/symex" xmlns:wpg="http://schemas.microsoft.com/office/word/2010/wordprocessingGroup" xmlns:wpi="http://schemas.microsoft.com/office/word/2010/wordprocessingInk" xmlns:wne="http://schemas.microsoft.com/office/word/2006/wordml" xmlns:wps="http://schemas.microsoft.com/office/word/2010/wordprocessingShape" mc:Ignorable="w14 w15 w16se w16cid w16 w16cex w16sdtdh wp14">
   <w:abstractNum w:abstractNumId="0" w15:restartNumberingAfterBreak="0">
     <w:nsid w:val="0DE363F0"/>
     <w:multiLevelType w:val="hybridMultilevel"/>
@@ -4364,34 +3548,34 @@
       </w:rPr>
     </w:lvl>
   </w:abstractNum>
-  <w:num w:numId="1">
+  <w:num w:numId="1" w16cid:durableId="429475535">
     <w:abstractNumId w:val="9"/>
   </w:num>
-  <w:num w:numId="2">
+  <w:num w:numId="2" w16cid:durableId="2011827015">
     <w:abstractNumId w:val="1"/>
   </w:num>
-  <w:num w:numId="3">
+  <w:num w:numId="3" w16cid:durableId="1816339071">
     <w:abstractNumId w:val="0"/>
   </w:num>
-  <w:num w:numId="4">
+  <w:num w:numId="4" w16cid:durableId="1135682530">
     <w:abstractNumId w:val="5"/>
   </w:num>
-  <w:num w:numId="5">
+  <w:num w:numId="5" w16cid:durableId="62484708">
     <w:abstractNumId w:val="6"/>
   </w:num>
-  <w:num w:numId="6">
+  <w:num w:numId="6" w16cid:durableId="811825007">
     <w:abstractNumId w:val="4"/>
   </w:num>
-  <w:num w:numId="7">
+  <w:num w:numId="7" w16cid:durableId="1452549051">
     <w:abstractNumId w:val="2"/>
   </w:num>
-  <w:num w:numId="8">
+  <w:num w:numId="8" w16cid:durableId="1513452962">
     <w:abstractNumId w:val="3"/>
   </w:num>
-  <w:num w:numId="9">
+  <w:num w:numId="9" w16cid:durableId="838083671">
     <w:abstractNumId w:val="7"/>
   </w:num>
-  <w:num w:numId="10">
+  <w:num w:numId="10" w16cid:durableId="1923219457">
     <w:abstractNumId w:val="8"/>
   </w:num>
 </w:numbering>
@@ -4822,6 +4006,7 @@
   <w:style w:type="paragraph" w:styleId="Heading2">
     <w:name w:val="heading 2"/>
     <w:basedOn w:val="Normal"/>
+    <w:link w:val="Heading2Char"/>
     <w:uiPriority w:val="9"/>
     <w:unhideWhenUsed/>
     <w:qFormat/>
@@ -5073,6 +4258,21 @@
     <w:rPr>
       <w:color w:val="800080" w:themeColor="followedHyperlink"/>
       <w:u w:val="single"/>
+    </w:rPr>
+  </w:style>
+  <w:style w:type="character" w:customStyle="1" w:styleId="Heading2Char">
+    <w:name w:val="Heading 2 Char"/>
+    <w:basedOn w:val="DefaultParagraphFont"/>
+    <w:link w:val="Heading2"/>
+    <w:uiPriority w:val="9"/>
+    <w:rsid w:val="00C84048"/>
+    <w:rPr>
+      <w:rFonts w:ascii="Calibri" w:eastAsia="Calibri" w:hAnsi="Calibri" w:cs="Calibri"/>
+      <w:b/>
+      <w:bCs/>
+      <w:sz w:val="20"/>
+      <w:szCs w:val="20"/>
+      <w:lang w:bidi="en-US"/>
     </w:rPr>
   </w:style>
 </w:styles>
@@ -5362,6 +4562,12 @@
 </file>
 
 <file path=customXml/item1.xml><?xml version="1.0" encoding="utf-8"?>
+<p:properties xmlns:p="http://schemas.microsoft.com/office/2006/metadata/properties" xmlns:xsi="http://www.w3.org/2001/XMLSchema-instance" xmlns:pc="http://schemas.microsoft.com/office/infopath/2007/PartnerControls">
+  <documentManagement/>
+</p:properties>
+</file>
+
+<file path=customXml/item2.xml><?xml version="1.0" encoding="utf-8"?>
 <?mso-contentType ?>
 <FormTemplates xmlns="http://schemas.microsoft.com/sharepoint/v3/contenttype/forms">
   <Display>DocumentLibraryForm</Display>
@@ -5370,13 +4576,11 @@
 </FormTemplates>
 </file>
 
-<file path=customXml/item2.xml><?xml version="1.0" encoding="utf-8"?>
-<p:properties xmlns:p="http://schemas.microsoft.com/office/2006/metadata/properties" xmlns:xsi="http://www.w3.org/2001/XMLSchema-instance" xmlns:pc="http://schemas.microsoft.com/office/infopath/2007/PartnerControls">
-  <documentManagement/>
-</p:properties>
+<file path=customXml/item3.xml><?xml version="1.0" encoding="utf-8"?>
+<b:Sources xmlns:b="http://schemas.openxmlformats.org/officeDocument/2006/bibliography" xmlns="http://schemas.openxmlformats.org/officeDocument/2006/bibliography" SelectedStyle="\APASixthEditionOfficeOnline.xsl" StyleName="APA" Version="6"/>
 </file>
 
-<file path=customXml/item3.xml><?xml version="1.0" encoding="utf-8"?>
+<file path=customXml/item4.xml><?xml version="1.0" encoding="utf-8"?>
 <ct:contentTypeSchema xmlns:ct="http://schemas.microsoft.com/office/2006/metadata/contentType" xmlns:ma="http://schemas.microsoft.com/office/2006/metadata/properties/metaAttributes" ct:_="" ma:_="" ma:contentTypeName="Document" ma:contentTypeID="0x010100C62E9F8080EF9045A3461589C8C739D0" ma:contentTypeVersion="12" ma:contentTypeDescription="Create a new document." ma:contentTypeScope="" ma:versionID="b82a4e0cfbba1a4e0025dcf5a4615212">
   <xsd:schema xmlns:xsd="http://www.w3.org/2001/XMLSchema" xmlns:xs="http://www.w3.org/2001/XMLSchema" xmlns:p="http://schemas.microsoft.com/office/2006/metadata/properties" xmlns:ns3="9237417f-6a90-4707-b345-f61fa45bd513" xmlns:ns4="9a6bc8ff-0751-4fb5-b019-c7731e2305e0" targetNamespace="http://schemas.microsoft.com/office/2006/metadata/properties" ma:root="true" ma:fieldsID="8962f9b60b26a87ae6d308e6e9d5b6bd" ns3:_="" ns4:_="">
     <xsd:import namespace="9237417f-6a90-4707-b345-f61fa45bd513"/>
@@ -5593,19 +4797,7 @@
 </ct:contentTypeSchema>
 </file>
 
-<file path=customXml/item4.xml><?xml version="1.0" encoding="utf-8"?>
-<b:Sources xmlns:b="http://schemas.openxmlformats.org/officeDocument/2006/bibliography" xmlns="http://schemas.openxmlformats.org/officeDocument/2006/bibliography" SelectedStyle="\APASixthEditionOfficeOnline.xsl" StyleName="APA" Version="6"/>
-</file>
-
 <file path=customXml/itemProps1.xml><?xml version="1.0" encoding="utf-8"?>
-<ds:datastoreItem xmlns:ds="http://schemas.openxmlformats.org/officeDocument/2006/customXml" ds:itemID="{A6C65B34-06ED-41A8-A3F3-05A1F92025D0}">
-  <ds:schemaRefs>
-    <ds:schemaRef ds:uri="http://schemas.microsoft.com/sharepoint/v3/contenttype/forms"/>
-  </ds:schemaRefs>
-</ds:datastoreItem>
-</file>
-
-<file path=customXml/itemProps2.xml><?xml version="1.0" encoding="utf-8"?>
 <ds:datastoreItem xmlns:ds="http://schemas.openxmlformats.org/officeDocument/2006/customXml" ds:itemID="{83F54608-22A7-4AF5-943D-E29461CC7B4C}">
   <ds:schemaRefs>
     <ds:schemaRef ds:uri="http://schemas.microsoft.com/office/2006/metadata/properties"/>
@@ -5614,7 +4806,23 @@
 </ds:datastoreItem>
 </file>
 
+<file path=customXml/itemProps2.xml><?xml version="1.0" encoding="utf-8"?>
+<ds:datastoreItem xmlns:ds="http://schemas.openxmlformats.org/officeDocument/2006/customXml" ds:itemID="{A6C65B34-06ED-41A8-A3F3-05A1F92025D0}">
+  <ds:schemaRefs>
+    <ds:schemaRef ds:uri="http://schemas.microsoft.com/sharepoint/v3/contenttype/forms"/>
+  </ds:schemaRefs>
+</ds:datastoreItem>
+</file>
+
 <file path=customXml/itemProps3.xml><?xml version="1.0" encoding="utf-8"?>
+<ds:datastoreItem xmlns:ds="http://schemas.openxmlformats.org/officeDocument/2006/customXml" ds:itemID="{CC3DF9CB-EAE3-4358-B00B-AEDD1725FC02}">
+  <ds:schemaRefs>
+    <ds:schemaRef ds:uri="http://schemas.openxmlformats.org/officeDocument/2006/bibliography"/>
+  </ds:schemaRefs>
+</ds:datastoreItem>
+</file>
+
+<file path=customXml/itemProps4.xml><?xml version="1.0" encoding="utf-8"?>
 <ds:datastoreItem xmlns:ds="http://schemas.openxmlformats.org/officeDocument/2006/customXml" ds:itemID="{2993B305-E746-423D-81B7-32926B0D6054}">
   <ds:schemaRefs>
     <ds:schemaRef ds:uri="http://schemas.microsoft.com/office/2006/metadata/contentType"/>
@@ -5631,12 +4839,4 @@
     <ds:schemaRef ds:uri="http://schemas.microsoft.com/internal/obd"/>
   </ds:schemaRefs>
 </ds:datastoreItem>
-</file>
-
-<file path=customXml/itemProps4.xml><?xml version="1.0" encoding="utf-8"?>
-<ds:datastoreItem xmlns:ds="http://schemas.openxmlformats.org/officeDocument/2006/customXml" ds:itemID="{CC3DF9CB-EAE3-4358-B00B-AEDD1725FC02}">
-  <ds:schemaRefs>
-    <ds:schemaRef ds:uri="http://schemas.openxmlformats.org/officeDocument/2006/bibliography"/>
-  </ds:schemaRefs>
-</ds:datastoreItem>
 </file>
</xml_diff>

<commit_message>
Deploying to gh-pages from  @ 3e13a837135a295df3bc119c5acd81a6dafab046 🚀
</commit_message>
<xml_diff>
--- a/assets/resume/Resume_Vivek_Bhat.docx
+++ b/assets/resume/Resume_Vivek_Bhat.docx
@@ -159,53 +159,55 @@
           <w:u w:val="none"/>
         </w:rPr>
       </w:pPr>
-      <w:r>
-        <w:rPr>
-          <w:rStyle w:val="Hyperlink"/>
+      <w:hyperlink r:id="rId11" w:history="1">
+        <w:r>
+          <w:rPr>
+            <w:rStyle w:val="Hyperlink"/>
+            <w:color w:val="000000" w:themeColor="text1"/>
+            <w:sz w:val="20"/>
+            <w:szCs w:val="20"/>
+            <w:u w:val="none"/>
+          </w:rPr>
+          <w:t>bhatvivek.com</w:t>
+        </w:r>
+      </w:hyperlink>
+    </w:p>
+    <w:p>
+      <w:pPr>
+        <w:ind w:left="274"/>
+        <w:jc w:val="right"/>
+        <w:rPr>
           <w:color w:val="000000" w:themeColor="text1"/>
           <w:sz w:val="20"/>
           <w:szCs w:val="20"/>
-          <w:u w:val="none"/>
-        </w:rPr>
-        <w:t>bhatvivek.com</w:t>
-      </w:r>
-    </w:p>
-    <w:p>
-      <w:pPr>
-        <w:ind w:left="274"/>
-        <w:jc w:val="right"/>
+        </w:rPr>
+      </w:pPr>
+      <w:r>
         <w:rPr>
           <w:color w:val="000000" w:themeColor="text1"/>
           <w:sz w:val="20"/>
           <w:szCs w:val="20"/>
         </w:rPr>
-      </w:pPr>
-      <w:r>
-        <w:rPr>
-          <w:color w:val="000000" w:themeColor="text1"/>
+        <w:t>github.com/vivekbhat</w:t>
+      </w:r>
+    </w:p>
+    <w:p>
+      <w:pPr>
+        <w:ind w:left="274"/>
+        <w:jc w:val="right"/>
+        <w:rPr>
           <w:sz w:val="20"/>
           <w:szCs w:val="20"/>
         </w:rPr>
-        <w:t>github.com/vivekbhat</w:t>
-      </w:r>
-    </w:p>
-    <w:p>
-      <w:pPr>
-        <w:ind w:left="274"/>
-        <w:jc w:val="right"/>
-        <w:rPr>
-          <w:sz w:val="20"/>
-          <w:szCs w:val="20"/>
-        </w:rPr>
         <w:sectPr>
-          <w:headerReference w:type="default" r:id="rId11"/>
+          <w:headerReference w:type="default" r:id="rId12"/>
           <w:type w:val="continuous"/>
           <w:pgSz w:w="11910" w:h="16840"/>
           <w:pgMar w:top="520" w:right="570" w:bottom="630" w:left="540" w:header="250" w:footer="720" w:gutter="0"/>
           <w:cols w:num="2" w:space="720"/>
         </w:sectPr>
       </w:pPr>
-      <w:hyperlink r:id="rId12" w:history="1">
+      <w:hyperlink r:id="rId13" w:history="1">
         <w:r>
           <w:rPr>
             <w:sz w:val="20"/>
@@ -4562,25 +4564,6 @@
 </file>
 
 <file path=customXml/item1.xml><?xml version="1.0" encoding="utf-8"?>
-<p:properties xmlns:p="http://schemas.microsoft.com/office/2006/metadata/properties" xmlns:xsi="http://www.w3.org/2001/XMLSchema-instance" xmlns:pc="http://schemas.microsoft.com/office/infopath/2007/PartnerControls">
-  <documentManagement/>
-</p:properties>
-</file>
-
-<file path=customXml/item2.xml><?xml version="1.0" encoding="utf-8"?>
-<?mso-contentType ?>
-<FormTemplates xmlns="http://schemas.microsoft.com/sharepoint/v3/contenttype/forms">
-  <Display>DocumentLibraryForm</Display>
-  <Edit>DocumentLibraryForm</Edit>
-  <New>DocumentLibraryForm</New>
-</FormTemplates>
-</file>
-
-<file path=customXml/item3.xml><?xml version="1.0" encoding="utf-8"?>
-<b:Sources xmlns:b="http://schemas.openxmlformats.org/officeDocument/2006/bibliography" xmlns="http://schemas.openxmlformats.org/officeDocument/2006/bibliography" SelectedStyle="\APASixthEditionOfficeOnline.xsl" StyleName="APA" Version="6"/>
-</file>
-
-<file path=customXml/item4.xml><?xml version="1.0" encoding="utf-8"?>
 <ct:contentTypeSchema xmlns:ct="http://schemas.microsoft.com/office/2006/metadata/contentType" xmlns:ma="http://schemas.microsoft.com/office/2006/metadata/properties/metaAttributes" ct:_="" ma:_="" ma:contentTypeName="Document" ma:contentTypeID="0x010100C62E9F8080EF9045A3461589C8C739D0" ma:contentTypeVersion="12" ma:contentTypeDescription="Create a new document." ma:contentTypeScope="" ma:versionID="b82a4e0cfbba1a4e0025dcf5a4615212">
   <xsd:schema xmlns:xsd="http://www.w3.org/2001/XMLSchema" xmlns:xs="http://www.w3.org/2001/XMLSchema" xmlns:p="http://schemas.microsoft.com/office/2006/metadata/properties" xmlns:ns3="9237417f-6a90-4707-b345-f61fa45bd513" xmlns:ns4="9a6bc8ff-0751-4fb5-b019-c7731e2305e0" targetNamespace="http://schemas.microsoft.com/office/2006/metadata/properties" ma:root="true" ma:fieldsID="8962f9b60b26a87ae6d308e6e9d5b6bd" ns3:_="" ns4:_="">
     <xsd:import namespace="9237417f-6a90-4707-b345-f61fa45bd513"/>
@@ -4797,32 +4780,26 @@
 </ct:contentTypeSchema>
 </file>
 
-<file path=customXml/itemProps1.xml><?xml version="1.0" encoding="utf-8"?>
-<ds:datastoreItem xmlns:ds="http://schemas.openxmlformats.org/officeDocument/2006/customXml" ds:itemID="{83F54608-22A7-4AF5-943D-E29461CC7B4C}">
-  <ds:schemaRefs>
-    <ds:schemaRef ds:uri="http://schemas.microsoft.com/office/2006/metadata/properties"/>
-    <ds:schemaRef ds:uri="http://schemas.microsoft.com/office/infopath/2007/PartnerControls"/>
-  </ds:schemaRefs>
-</ds:datastoreItem>
+<file path=customXml/item2.xml><?xml version="1.0" encoding="utf-8"?>
+<b:Sources xmlns:b="http://schemas.openxmlformats.org/officeDocument/2006/bibliography" xmlns="http://schemas.openxmlformats.org/officeDocument/2006/bibliography" SelectedStyle="\APASixthEditionOfficeOnline.xsl" StyleName="APA" Version="6"/>
 </file>
 
-<file path=customXml/itemProps2.xml><?xml version="1.0" encoding="utf-8"?>
-<ds:datastoreItem xmlns:ds="http://schemas.openxmlformats.org/officeDocument/2006/customXml" ds:itemID="{A6C65B34-06ED-41A8-A3F3-05A1F92025D0}">
-  <ds:schemaRefs>
-    <ds:schemaRef ds:uri="http://schemas.microsoft.com/sharepoint/v3/contenttype/forms"/>
-  </ds:schemaRefs>
-</ds:datastoreItem>
+<file path=customXml/item3.xml><?xml version="1.0" encoding="utf-8"?>
+<?mso-contentType ?>
+<FormTemplates xmlns="http://schemas.microsoft.com/sharepoint/v3/contenttype/forms">
+  <Display>DocumentLibraryForm</Display>
+  <Edit>DocumentLibraryForm</Edit>
+  <New>DocumentLibraryForm</New>
+</FormTemplates>
 </file>
 
-<file path=customXml/itemProps3.xml><?xml version="1.0" encoding="utf-8"?>
-<ds:datastoreItem xmlns:ds="http://schemas.openxmlformats.org/officeDocument/2006/customXml" ds:itemID="{CC3DF9CB-EAE3-4358-B00B-AEDD1725FC02}">
-  <ds:schemaRefs>
-    <ds:schemaRef ds:uri="http://schemas.openxmlformats.org/officeDocument/2006/bibliography"/>
-  </ds:schemaRefs>
-</ds:datastoreItem>
+<file path=customXml/item4.xml><?xml version="1.0" encoding="utf-8"?>
+<p:properties xmlns:p="http://schemas.microsoft.com/office/2006/metadata/properties" xmlns:xsi="http://www.w3.org/2001/XMLSchema-instance" xmlns:pc="http://schemas.microsoft.com/office/infopath/2007/PartnerControls">
+  <documentManagement/>
+</p:properties>
 </file>
 
-<file path=customXml/itemProps4.xml><?xml version="1.0" encoding="utf-8"?>
+<file path=customXml/itemProps1.xml><?xml version="1.0" encoding="utf-8"?>
 <ds:datastoreItem xmlns:ds="http://schemas.openxmlformats.org/officeDocument/2006/customXml" ds:itemID="{2993B305-E746-423D-81B7-32926B0D6054}">
   <ds:schemaRefs>
     <ds:schemaRef ds:uri="http://schemas.microsoft.com/office/2006/metadata/contentType"/>
@@ -4839,4 +4816,29 @@
     <ds:schemaRef ds:uri="http://schemas.microsoft.com/internal/obd"/>
   </ds:schemaRefs>
 </ds:datastoreItem>
+</file>
+
+<file path=customXml/itemProps2.xml><?xml version="1.0" encoding="utf-8"?>
+<ds:datastoreItem xmlns:ds="http://schemas.openxmlformats.org/officeDocument/2006/customXml" ds:itemID="{CC3DF9CB-EAE3-4358-B00B-AEDD1725FC02}">
+  <ds:schemaRefs>
+    <ds:schemaRef ds:uri="http://schemas.openxmlformats.org/officeDocument/2006/bibliography"/>
+  </ds:schemaRefs>
+</ds:datastoreItem>
+</file>
+
+<file path=customXml/itemProps3.xml><?xml version="1.0" encoding="utf-8"?>
+<ds:datastoreItem xmlns:ds="http://schemas.openxmlformats.org/officeDocument/2006/customXml" ds:itemID="{A6C65B34-06ED-41A8-A3F3-05A1F92025D0}">
+  <ds:schemaRefs>
+    <ds:schemaRef ds:uri="http://schemas.microsoft.com/sharepoint/v3/contenttype/forms"/>
+  </ds:schemaRefs>
+</ds:datastoreItem>
+</file>
+
+<file path=customXml/itemProps4.xml><?xml version="1.0" encoding="utf-8"?>
+<ds:datastoreItem xmlns:ds="http://schemas.openxmlformats.org/officeDocument/2006/customXml" ds:itemID="{83F54608-22A7-4AF5-943D-E29461CC7B4C}">
+  <ds:schemaRefs>
+    <ds:schemaRef ds:uri="http://schemas.microsoft.com/office/2006/metadata/properties"/>
+    <ds:schemaRef ds:uri="http://schemas.microsoft.com/office/infopath/2007/PartnerControls"/>
+  </ds:schemaRefs>
+</ds:datastoreItem>
 </file>
</xml_diff>

<commit_message>
Deploying to gh-pages from  @ ea0319b53caf6cd2a94c8df318c5bb6fce60dbad 🚀
</commit_message>
<xml_diff>
--- a/assets/resume/Resume_Vivek_Bhat.docx
+++ b/assets/resume/Resume_Vivek_Bhat.docx
@@ -5,91 +5,83 @@
     <w:p>
       <w:pPr>
         <w:rPr>
+          <w:rFonts w:ascii="Times" w:hAnsi="Times" w:cs="Times New Roman"/>
+          <w:smallCaps/>
+          <w:sz w:val="16"/>
+          <w:szCs w:val="16"/>
+        </w:rPr>
+      </w:pPr>
+    </w:p>
+    <w:p>
+      <w:pPr>
+        <w:rPr>
+          <w:rFonts w:ascii="Times" w:hAnsi="Times" w:cs="Times New Roman"/>
+          <w:smallCaps/>
+          <w:sz w:val="64"/>
+          <w:szCs w:val="64"/>
+        </w:rPr>
+      </w:pPr>
+      <w:r>
+        <w:rPr>
+          <w:rFonts w:ascii="Times" w:hAnsi="Times" w:cs="Times New Roman"/>
+          <w:smallCaps/>
+          <w:sz w:val="64"/>
+          <w:szCs w:val="64"/>
+        </w:rPr>
+        <w:t>V</w:t>
+      </w:r>
+      <w:r>
+        <w:rPr>
+          <w:rFonts w:ascii="Times" w:hAnsi="Times" w:cs="Times New Roman"/>
+          <w:smallCaps/>
+          <w:sz w:val="64"/>
+          <w:szCs w:val="64"/>
+        </w:rPr>
+        <w:t xml:space="preserve">IVEK </w:t>
+      </w:r>
+      <w:r>
+        <w:rPr>
+          <w:rFonts w:ascii="Times" w:hAnsi="Times" w:cs="Times New Roman"/>
+          <w:smallCaps/>
+          <w:sz w:val="64"/>
+          <w:szCs w:val="64"/>
+        </w:rPr>
+        <w:t>B</w:t>
+      </w:r>
+      <w:r>
+        <w:rPr>
+          <w:rFonts w:ascii="Times" w:hAnsi="Times" w:cs="Times New Roman"/>
+          <w:smallCaps/>
+          <w:sz w:val="64"/>
+          <w:szCs w:val="64"/>
+        </w:rPr>
+        <w:t>HAT</w:t>
+      </w:r>
+    </w:p>
+    <w:p>
+      <w:pPr>
+        <w:spacing w:before="120" w:line="360" w:lineRule="auto"/>
+        <w:rPr>
           <w:rStyle w:val="Hyperlink"/>
           <w:rFonts w:ascii="Times" w:hAnsi="Times" w:cs="Times New Roman"/>
           <w:smallCaps/>
           <w:color w:val="auto"/>
-          <w:sz w:val="80"/>
-          <w:szCs w:val="80"/>
+          <w:sz w:val="12"/>
+          <w:szCs w:val="12"/>
           <w:u w:val="none"/>
         </w:rPr>
       </w:pPr>
-      <w:r>
-        <w:rPr>
-          <w:rFonts w:ascii="Times" w:hAnsi="Times" w:cs="Times New Roman"/>
-          <w:smallCaps/>
-          <w:sz w:val="80"/>
-          <w:szCs w:val="80"/>
-        </w:rPr>
-        <w:t>V</w:t>
-      </w:r>
-      <w:r>
-        <w:rPr>
-          <w:rFonts w:ascii="Times" w:hAnsi="Times" w:cs="Times New Roman"/>
-          <w:smallCaps/>
-          <w:sz w:val="80"/>
-          <w:szCs w:val="80"/>
-        </w:rPr>
-        <w:t xml:space="preserve">IVEK </w:t>
-      </w:r>
-      <w:r>
-        <w:rPr>
-          <w:rFonts w:ascii="Times" w:hAnsi="Times" w:cs="Times New Roman"/>
-          <w:smallCaps/>
-          <w:sz w:val="80"/>
-          <w:szCs w:val="80"/>
-        </w:rPr>
-        <w:t>B</w:t>
-      </w:r>
-      <w:r>
-        <w:rPr>
-          <w:rFonts w:ascii="Times" w:hAnsi="Times" w:cs="Times New Roman"/>
-          <w:smallCaps/>
-          <w:sz w:val="80"/>
-          <w:szCs w:val="80"/>
-        </w:rPr>
-        <w:t>HAT</w:t>
-      </w:r>
-      <w:r>
-        <w:rPr>
-          <w:rFonts w:ascii="Times" w:hAnsi="Times" w:cs="Times New Roman"/>
-          <w:smallCaps/>
-          <w:sz w:val="80"/>
-          <w:szCs w:val="80"/>
-        </w:rPr>
-        <w:t xml:space="preserve">           </w:t>
-      </w:r>
-    </w:p>
-    <w:p>
-      <w:pPr>
-        <w:rPr>
-          <w:rStyle w:val="Hyperlink"/>
-          <w:color w:val="000000" w:themeColor="text1"/>
-          <w:sz w:val="20"/>
-          <w:szCs w:val="20"/>
-          <w:u w:val="none"/>
-        </w:rPr>
-      </w:pPr>
-      <w:r>
-        <w:rPr>
-          <w:rStyle w:val="Hyperlink"/>
-          <w:color w:val="000000" w:themeColor="text1"/>
-          <w:sz w:val="20"/>
-          <w:szCs w:val="20"/>
-          <w:u w:val="none"/>
-        </w:rPr>
-        <w:t xml:space="preserve">           </w:t>
-      </w:r>
-    </w:p>
-    <w:p>
-      <w:pPr>
+    </w:p>
+    <w:p>
+      <w:pPr>
+        <w:ind w:firstLine="720"/>
         <w:jc w:val="right"/>
         <w:rPr>
           <w:rStyle w:val="Hyperlink"/>
           <w:rFonts w:ascii="Times" w:hAnsi="Times" w:cs="Times New Roman"/>
           <w:color w:val="auto"/>
-          <w:sz w:val="144"/>
-          <w:szCs w:val="144"/>
+          <w:sz w:val="20"/>
+          <w:szCs w:val="20"/>
           <w:u w:val="none"/>
         </w:rPr>
       </w:pPr>
@@ -551,128 +543,109 @@
         <w:rPr>
           <w:i/>
           <w:iCs/>
-          <w:sz w:val="22"/>
-          <w:szCs w:val="22"/>
-        </w:rPr>
-      </w:pPr>
-      <w:r>
-        <w:rPr>
-          <w:sz w:val="22"/>
-          <w:szCs w:val="22"/>
+          <w:sz w:val="24"/>
+          <w:szCs w:val="24"/>
+        </w:rPr>
+      </w:pPr>
+      <w:r>
+        <w:rPr>
+          <w:sz w:val="24"/>
+          <w:szCs w:val="24"/>
         </w:rPr>
         <w:t>AMAZON</w:t>
       </w:r>
       <w:r>
         <w:rPr>
-          <w:sz w:val="22"/>
-          <w:szCs w:val="22"/>
-        </w:rPr>
-        <w:t xml:space="preserve">, Software </w:t>
-      </w:r>
-      <w:r>
-        <w:rPr>
-          <w:sz w:val="22"/>
-          <w:szCs w:val="22"/>
-        </w:rPr>
-        <w:t>Development Engineer</w:t>
-      </w:r>
-      <w:r>
-        <w:rPr>
-          <w:sz w:val="22"/>
-          <w:szCs w:val="22"/>
-        </w:rPr>
-        <w:t xml:space="preserve"> </w:t>
-      </w:r>
-      <w:r>
-        <w:rPr>
-          <w:sz w:val="22"/>
-          <w:szCs w:val="22"/>
-        </w:rPr>
-        <w:tab/>
-      </w:r>
-      <w:r>
-        <w:rPr>
-          <w:sz w:val="22"/>
-          <w:szCs w:val="22"/>
+          <w:sz w:val="24"/>
+          <w:szCs w:val="24"/>
+        </w:rPr>
+        <w:t xml:space="preserve">, Software Development Engineer </w:t>
+      </w:r>
+      <w:r>
+        <w:rPr>
+          <w:sz w:val="24"/>
+          <w:szCs w:val="24"/>
         </w:rPr>
         <w:tab/>
         <w:t xml:space="preserve"> </w:t>
       </w:r>
       <w:r>
         <w:rPr>
-          <w:sz w:val="22"/>
-          <w:szCs w:val="22"/>
+          <w:sz w:val="24"/>
+          <w:szCs w:val="24"/>
         </w:rPr>
         <w:tab/>
       </w:r>
       <w:r>
         <w:rPr>
-          <w:sz w:val="22"/>
-          <w:szCs w:val="22"/>
+          <w:sz w:val="24"/>
+          <w:szCs w:val="24"/>
         </w:rPr>
         <w:tab/>
       </w:r>
       <w:r>
         <w:rPr>
-          <w:sz w:val="22"/>
-          <w:szCs w:val="22"/>
-        </w:rPr>
-        <w:tab/>
-      </w:r>
-      <w:r>
-        <w:rPr>
-          <w:sz w:val="22"/>
-          <w:szCs w:val="22"/>
+          <w:sz w:val="24"/>
+          <w:szCs w:val="24"/>
         </w:rPr>
         <w:tab/>
         <w:t xml:space="preserve">      </w:t>
       </w:r>
       <w:r>
         <w:rPr>
-          <w:sz w:val="22"/>
-          <w:szCs w:val="22"/>
+          <w:sz w:val="24"/>
+          <w:szCs w:val="24"/>
         </w:rPr>
         <w:tab/>
-      </w:r>
-      <w:r>
-        <w:rPr>
-          <w:sz w:val="22"/>
-          <w:szCs w:val="22"/>
-        </w:rPr>
-        <w:t xml:space="preserve">     Ju</w:t>
-      </w:r>
-      <w:r>
-        <w:rPr>
-          <w:sz w:val="22"/>
-          <w:szCs w:val="22"/>
+        <w:t xml:space="preserve">     </w:t>
+      </w:r>
+      <w:r>
+        <w:rPr>
+          <w:sz w:val="24"/>
+          <w:szCs w:val="24"/>
+        </w:rPr>
+        <w:tab/>
+        <w:t xml:space="preserve"> </w:t>
+      </w:r>
+      <w:r>
+        <w:rPr>
+          <w:sz w:val="24"/>
+          <w:szCs w:val="24"/>
+        </w:rPr>
+        <w:t>Ju</w:t>
+      </w:r>
+      <w:r>
+        <w:rPr>
+          <w:sz w:val="24"/>
+          <w:szCs w:val="24"/>
         </w:rPr>
         <w:t>ne</w:t>
       </w:r>
       <w:r>
         <w:rPr>
-          <w:sz w:val="22"/>
-          <w:szCs w:val="22"/>
+          <w:sz w:val="24"/>
+          <w:szCs w:val="24"/>
         </w:rPr>
         <w:t xml:space="preserve"> 202</w:t>
       </w:r>
       <w:r>
         <w:rPr>
-          <w:sz w:val="22"/>
-          <w:szCs w:val="22"/>
+          <w:sz w:val="24"/>
+          <w:szCs w:val="24"/>
         </w:rPr>
         <w:t>2</w:t>
       </w:r>
       <w:r>
         <w:rPr>
-          <w:sz w:val="22"/>
-          <w:szCs w:val="22"/>
+          <w:sz w:val="24"/>
+          <w:szCs w:val="24"/>
         </w:rPr>
         <w:t xml:space="preserve"> – </w:t>
       </w:r>
       <w:r>
         <w:rPr>
-          <w:sz w:val="22"/>
-          <w:szCs w:val="22"/>
+          <w:sz w:val="24"/>
+          <w:szCs w:val="24"/>
         </w:rPr>
         <w:t>Sep 2023</w:t>
       </w:r>
@@ -1121,79 +1094,65 @@
         <w:ind w:left="0"/>
         <w:jc w:val="both"/>
         <w:rPr>
-          <w:sz w:val="22"/>
-          <w:szCs w:val="22"/>
-        </w:rPr>
-      </w:pPr>
-      <w:r>
-        <w:rPr>
-          <w:sz w:val="22"/>
-          <w:szCs w:val="22"/>
+          <w:sz w:val="24"/>
+          <w:szCs w:val="24"/>
+        </w:rPr>
+      </w:pPr>
+      <w:r>
+        <w:rPr>
+          <w:sz w:val="24"/>
+          <w:szCs w:val="24"/>
         </w:rPr>
         <w:t>MICROSOFT</w:t>
       </w:r>
       <w:r>
         <w:rPr>
-          <w:sz w:val="22"/>
-          <w:szCs w:val="22"/>
-        </w:rPr>
-        <w:t xml:space="preserve">, Redmond, WA, Software </w:t>
-      </w:r>
-      <w:r>
-        <w:rPr>
-          <w:sz w:val="22"/>
-          <w:szCs w:val="22"/>
-        </w:rPr>
-        <w:t>Development Engineer</w:t>
-      </w:r>
-      <w:r>
-        <w:rPr>
-          <w:sz w:val="22"/>
-          <w:szCs w:val="22"/>
+          <w:sz w:val="24"/>
+          <w:szCs w:val="24"/>
+        </w:rPr>
+        <w:t>, Redmond, WA, Software Development Engineer</w:t>
+      </w:r>
+      <w:r>
+        <w:rPr>
+          <w:sz w:val="24"/>
+          <w:szCs w:val="24"/>
         </w:rPr>
         <w:tab/>
       </w:r>
       <w:r>
         <w:rPr>
-          <w:sz w:val="22"/>
-          <w:szCs w:val="22"/>
-        </w:rPr>
-        <w:tab/>
-      </w:r>
-      <w:r>
-        <w:rPr>
-          <w:sz w:val="22"/>
-          <w:szCs w:val="22"/>
-        </w:rPr>
-        <w:tab/>
-      </w:r>
-      <w:r>
-        <w:rPr>
-          <w:sz w:val="22"/>
-          <w:szCs w:val="22"/>
+          <w:sz w:val="24"/>
+          <w:szCs w:val="24"/>
         </w:rPr>
         <w:tab/>
         <w:t xml:space="preserve">      </w:t>
       </w:r>
       <w:r>
         <w:rPr>
-          <w:sz w:val="22"/>
-          <w:szCs w:val="22"/>
+          <w:sz w:val="24"/>
+          <w:szCs w:val="24"/>
         </w:rPr>
         <w:tab/>
         <w:t xml:space="preserve">   </w:t>
       </w:r>
       <w:r>
         <w:rPr>
-          <w:sz w:val="22"/>
-          <w:szCs w:val="22"/>
+          <w:sz w:val="24"/>
+          <w:szCs w:val="24"/>
+        </w:rPr>
+        <w:t xml:space="preserve">          </w:t>
+      </w:r>
+      <w:r>
+        <w:rPr>
+          <w:sz w:val="24"/>
+          <w:szCs w:val="24"/>
         </w:rPr>
         <w:t xml:space="preserve">June 2021 – </w:t>
       </w:r>
       <w:r>
         <w:rPr>
-          <w:sz w:val="22"/>
-          <w:szCs w:val="22"/>
+          <w:sz w:val="24"/>
+          <w:szCs w:val="24"/>
         </w:rPr>
         <w:t>June 2022</w:t>
       </w:r>
@@ -1413,63 +1372,57 @@
         <w:ind w:left="0"/>
         <w:jc w:val="both"/>
         <w:rPr>
-          <w:sz w:val="22"/>
-          <w:szCs w:val="22"/>
-        </w:rPr>
-      </w:pPr>
-      <w:r>
-        <w:rPr>
-          <w:sz w:val="22"/>
-          <w:szCs w:val="22"/>
+          <w:sz w:val="24"/>
+          <w:szCs w:val="24"/>
+        </w:rPr>
+      </w:pPr>
+      <w:r>
+        <w:rPr>
+          <w:sz w:val="24"/>
+          <w:szCs w:val="24"/>
         </w:rPr>
         <w:t>INTEL</w:t>
       </w:r>
       <w:r>
         <w:rPr>
-          <w:sz w:val="22"/>
-          <w:szCs w:val="22"/>
+          <w:sz w:val="24"/>
+          <w:szCs w:val="24"/>
         </w:rPr>
         <w:t xml:space="preserve">, Hillsboro, Oregon, Software Development Engineer </w:t>
       </w:r>
       <w:r>
         <w:rPr>
-          <w:sz w:val="22"/>
-          <w:szCs w:val="22"/>
+          <w:sz w:val="24"/>
+          <w:szCs w:val="24"/>
         </w:rPr>
         <w:tab/>
       </w:r>
       <w:r>
         <w:rPr>
-          <w:sz w:val="22"/>
-          <w:szCs w:val="22"/>
+          <w:sz w:val="24"/>
+          <w:szCs w:val="24"/>
         </w:rPr>
         <w:tab/>
       </w:r>
       <w:r>
         <w:rPr>
-          <w:sz w:val="22"/>
-          <w:szCs w:val="22"/>
+          <w:sz w:val="24"/>
+          <w:szCs w:val="24"/>
         </w:rPr>
         <w:tab/>
-      </w:r>
-      <w:r>
-        <w:rPr>
-          <w:sz w:val="22"/>
-          <w:szCs w:val="22"/>
-        </w:rPr>
-        <w:tab/>
-      </w:r>
-      <w:r>
-        <w:rPr>
-          <w:sz w:val="22"/>
-          <w:szCs w:val="22"/>
-        </w:rPr>
-        <w:t xml:space="preserve">            </w:t>
-      </w:r>
-      <w:r>
-        <w:rPr>
-          <w:sz w:val="22"/>
-          <w:szCs w:val="22"/>
+        <w:t xml:space="preserve"> </w:t>
+      </w:r>
+      <w:r>
+        <w:rPr>
+          <w:sz w:val="24"/>
+          <w:szCs w:val="24"/>
+        </w:rPr>
+        <w:t xml:space="preserve">      </w:t>
+      </w:r>
+      <w:r>
+        <w:rPr>
+          <w:sz w:val="24"/>
+          <w:szCs w:val="24"/>
         </w:rPr>
         <w:t>January 2018 – June 2021</w:t>
       </w:r>
@@ -1916,117 +1869,103 @@
         <w:ind w:left="0"/>
         <w:jc w:val="both"/>
         <w:rPr>
-          <w:sz w:val="22"/>
-          <w:szCs w:val="22"/>
-        </w:rPr>
-      </w:pPr>
-      <w:r>
-        <w:rPr>
-          <w:sz w:val="22"/>
-          <w:szCs w:val="22"/>
+          <w:sz w:val="24"/>
+          <w:szCs w:val="24"/>
+        </w:rPr>
+      </w:pPr>
+      <w:r>
+        <w:rPr>
+          <w:sz w:val="24"/>
+          <w:szCs w:val="24"/>
         </w:rPr>
         <w:t>INTEL</w:t>
       </w:r>
       <w:r>
         <w:rPr>
-          <w:sz w:val="22"/>
-          <w:szCs w:val="22"/>
+          <w:sz w:val="24"/>
+          <w:szCs w:val="24"/>
         </w:rPr>
         <w:t xml:space="preserve">, </w:t>
       </w:r>
       <w:r>
         <w:rPr>
-          <w:sz w:val="22"/>
-          <w:szCs w:val="22"/>
+          <w:sz w:val="24"/>
+          <w:szCs w:val="24"/>
         </w:rPr>
         <w:t xml:space="preserve">Software Engineering </w:t>
       </w:r>
       <w:r>
         <w:rPr>
-          <w:sz w:val="22"/>
-          <w:szCs w:val="22"/>
+          <w:sz w:val="24"/>
+          <w:szCs w:val="24"/>
         </w:rPr>
         <w:t>Summer Intern</w:t>
       </w:r>
       <w:r>
         <w:rPr>
-          <w:sz w:val="22"/>
-          <w:szCs w:val="22"/>
+          <w:sz w:val="24"/>
+          <w:szCs w:val="24"/>
         </w:rPr>
         <w:tab/>
         <w:t xml:space="preserve">       </w:t>
       </w:r>
       <w:r>
         <w:rPr>
-          <w:sz w:val="22"/>
-          <w:szCs w:val="22"/>
+          <w:sz w:val="24"/>
+          <w:szCs w:val="24"/>
         </w:rPr>
         <w:tab/>
       </w:r>
       <w:r>
         <w:rPr>
-          <w:sz w:val="22"/>
-          <w:szCs w:val="22"/>
+          <w:sz w:val="24"/>
+          <w:szCs w:val="24"/>
         </w:rPr>
         <w:tab/>
       </w:r>
       <w:r>
         <w:rPr>
-          <w:sz w:val="22"/>
-          <w:szCs w:val="22"/>
+          <w:sz w:val="24"/>
+          <w:szCs w:val="24"/>
         </w:rPr>
         <w:tab/>
       </w:r>
       <w:r>
         <w:rPr>
-          <w:sz w:val="22"/>
-          <w:szCs w:val="22"/>
+          <w:sz w:val="24"/>
+          <w:szCs w:val="24"/>
         </w:rPr>
         <w:tab/>
       </w:r>
       <w:r>
         <w:rPr>
-          <w:sz w:val="22"/>
-          <w:szCs w:val="22"/>
+          <w:sz w:val="24"/>
+          <w:szCs w:val="24"/>
         </w:rPr>
         <w:tab/>
-      </w:r>
-      <w:r>
-        <w:rPr>
-          <w:sz w:val="22"/>
-          <w:szCs w:val="22"/>
-        </w:rPr>
-        <w:t xml:space="preserve">    </w:t>
-      </w:r>
-      <w:r>
-        <w:rPr>
-          <w:sz w:val="22"/>
-          <w:szCs w:val="22"/>
-        </w:rPr>
-        <w:tab/>
-        <w:t xml:space="preserve">    </w:t>
+        <w:t xml:space="preserve"> </w:t>
       </w:r>
       <w:r>
         <w:rPr>
           <w:iCs/>
-          <w:sz w:val="22"/>
-          <w:szCs w:val="22"/>
+          <w:sz w:val="24"/>
+          <w:szCs w:val="24"/>
         </w:rPr>
         <w:t xml:space="preserve">May 2017 – </w:t>
       </w:r>
       <w:r>
         <w:rPr>
           <w:iCs/>
-          <w:sz w:val="22"/>
-          <w:szCs w:val="22"/>
+          <w:sz w:val="24"/>
+          <w:szCs w:val="24"/>
         </w:rPr>
         <w:t>Aug</w:t>
       </w:r>
       <w:r>
         <w:rPr>
           <w:iCs/>
-          <w:sz w:val="22"/>
-          <w:szCs w:val="22"/>
+          <w:sz w:val="24"/>
+          <w:szCs w:val="24"/>
         </w:rPr>
         <w:t xml:space="preserve"> 2017</w:t>
       </w:r>
@@ -2142,11 +2081,15 @@
         <w:spacing w:before="60"/>
         <w:rPr>
           <w:b/>
+          <w:sz w:val="24"/>
+          <w:szCs w:val="24"/>
         </w:rPr>
       </w:pPr>
       <w:r>
         <w:rPr>
           <w:b/>
+          <w:sz w:val="24"/>
+          <w:szCs w:val="24"/>
         </w:rPr>
         <w:t>North Carolina</w:t>
       </w:r>
@@ -2154,12 +2097,16 @@
         <w:rPr>
           <w:b/>
           <w:spacing w:val="-9"/>
+          <w:sz w:val="24"/>
+          <w:szCs w:val="24"/>
         </w:rPr>
         <w:t xml:space="preserve"> </w:t>
       </w:r>
       <w:r>
         <w:rPr>
           <w:b/>
+          <w:sz w:val="24"/>
+          <w:szCs w:val="24"/>
         </w:rPr>
         <w:t>State</w:t>
       </w:r>
@@ -2167,12 +2114,16 @@
         <w:rPr>
           <w:b/>
           <w:spacing w:val="-5"/>
+          <w:sz w:val="24"/>
+          <w:szCs w:val="24"/>
         </w:rPr>
         <w:t xml:space="preserve"> </w:t>
       </w:r>
       <w:r>
         <w:rPr>
           <w:b/>
+          <w:sz w:val="24"/>
+          <w:szCs w:val="24"/>
         </w:rPr>
         <w:t>University, Raleigh,</w:t>
       </w:r>
@@ -2180,12 +2131,16 @@
         <w:rPr>
           <w:b/>
           <w:spacing w:val="-8"/>
+          <w:sz w:val="24"/>
+          <w:szCs w:val="24"/>
         </w:rPr>
         <w:t xml:space="preserve"> </w:t>
       </w:r>
       <w:r>
         <w:rPr>
           <w:b/>
+          <w:sz w:val="24"/>
+          <w:szCs w:val="24"/>
         </w:rPr>
         <w:t>NC, USA</w:t>
       </w:r>
@@ -2204,24 +2159,25 @@
       <w:r>
         <w:rPr>
           <w:b/>
+          <w:sz w:val="24"/>
+          <w:szCs w:val="24"/>
         </w:rPr>
         <w:tab/>
+        <w:t>Aug 2016 – Dec</w:t>
       </w:r>
       <w:r>
         <w:rPr>
           <w:b/>
-        </w:rPr>
-        <w:t>Aug 2016 – Dec</w:t>
+          <w:sz w:val="24"/>
+          <w:szCs w:val="24"/>
+        </w:rPr>
+        <w:t xml:space="preserve"> </w:t>
       </w:r>
       <w:r>
         <w:rPr>
           <w:b/>
-        </w:rPr>
-        <w:t xml:space="preserve"> </w:t>
-      </w:r>
-      <w:r>
-        <w:rPr>
-          <w:b/>
+          <w:sz w:val="24"/>
+          <w:szCs w:val="24"/>
         </w:rPr>
         <w:t>2017</w:t>
       </w:r>
@@ -2298,11 +2254,15 @@
         <w:spacing w:before="120"/>
         <w:rPr>
           <w:b/>
+          <w:sz w:val="24"/>
+          <w:szCs w:val="24"/>
         </w:rPr>
       </w:pPr>
       <w:r>
         <w:rPr>
           <w:b/>
+          <w:sz w:val="24"/>
+          <w:szCs w:val="24"/>
         </w:rPr>
         <w:t>Jamia</w:t>
       </w:r>
@@ -2310,12 +2270,16 @@
         <w:rPr>
           <w:b/>
           <w:spacing w:val="-3"/>
+          <w:sz w:val="24"/>
+          <w:szCs w:val="24"/>
         </w:rPr>
         <w:t xml:space="preserve"> </w:t>
       </w:r>
       <w:r>
         <w:rPr>
           <w:b/>
+          <w:sz w:val="24"/>
+          <w:szCs w:val="24"/>
         </w:rPr>
         <w:t>Millia</w:t>
       </w:r>
@@ -2323,12 +2287,16 @@
         <w:rPr>
           <w:b/>
           <w:spacing w:val="-1"/>
+          <w:sz w:val="24"/>
+          <w:szCs w:val="24"/>
         </w:rPr>
         <w:t xml:space="preserve"> </w:t>
       </w:r>
       <w:r>
         <w:rPr>
           <w:b/>
+          <w:sz w:val="24"/>
+          <w:szCs w:val="24"/>
         </w:rPr>
         <w:t>University, New Delhi,</w:t>
       </w:r>
@@ -2336,18 +2304,23 @@
         <w:rPr>
           <w:b/>
           <w:spacing w:val="-3"/>
+          <w:sz w:val="24"/>
+          <w:szCs w:val="24"/>
         </w:rPr>
         <w:t xml:space="preserve"> </w:t>
       </w:r>
       <w:r>
         <w:rPr>
           <w:b/>
+          <w:sz w:val="24"/>
+          <w:szCs w:val="24"/>
         </w:rPr>
         <w:t>India</w:t>
       </w:r>
     </w:p>
     <w:p>
       <w:pPr>
+        <w:ind w:firstLine="720"/>
         <w:jc w:val="right"/>
         <w:rPr>
           <w:b/>
@@ -2356,6 +2329,16 @@
       <w:r>
         <w:rPr>
           <w:b/>
+          <w:sz w:val="24"/>
+          <w:szCs w:val="24"/>
+        </w:rPr>
+        <w:t xml:space="preserve">                            </w:t>
+      </w:r>
+      <w:r>
+        <w:rPr>
+          <w:b/>
+          <w:sz w:val="24"/>
+          <w:szCs w:val="24"/>
         </w:rPr>
         <w:t>June 2012 – July 2016</w:t>
       </w:r>
@@ -4027,7 +4010,6 @@
   <w:style w:type="character" w:default="1" w:styleId="DefaultParagraphFont">
     <w:name w:val="Default Paragraph Font"/>
     <w:uiPriority w:val="1"/>
-    <w:semiHidden/>
     <w:unhideWhenUsed/>
   </w:style>
   <w:style w:type="table" w:default="1" w:styleId="TableNormal">
@@ -4564,6 +4546,19 @@
 </file>
 
 <file path=customXml/item1.xml><?xml version="1.0" encoding="utf-8"?>
+<?mso-contentType ?>
+<FormTemplates xmlns="http://schemas.microsoft.com/sharepoint/v3/contenttype/forms">
+  <Display>DocumentLibraryForm</Display>
+  <Edit>DocumentLibraryForm</Edit>
+  <New>DocumentLibraryForm</New>
+</FormTemplates>
+</file>
+
+<file path=customXml/item2.xml><?xml version="1.0" encoding="utf-8"?>
+<b:Sources xmlns:b="http://schemas.openxmlformats.org/officeDocument/2006/bibliography" xmlns="http://schemas.openxmlformats.org/officeDocument/2006/bibliography" SelectedStyle="\APASixthEditionOfficeOnline.xsl" StyleName="APA" Version="6"/>
+</file>
+
+<file path=customXml/item3.xml><?xml version="1.0" encoding="utf-8"?>
 <ct:contentTypeSchema xmlns:ct="http://schemas.microsoft.com/office/2006/metadata/contentType" xmlns:ma="http://schemas.microsoft.com/office/2006/metadata/properties/metaAttributes" ct:_="" ma:_="" ma:contentTypeName="Document" ma:contentTypeID="0x010100C62E9F8080EF9045A3461589C8C739D0" ma:contentTypeVersion="12" ma:contentTypeDescription="Create a new document." ma:contentTypeScope="" ma:versionID="b82a4e0cfbba1a4e0025dcf5a4615212">
   <xsd:schema xmlns:xsd="http://www.w3.org/2001/XMLSchema" xmlns:xs="http://www.w3.org/2001/XMLSchema" xmlns:p="http://schemas.microsoft.com/office/2006/metadata/properties" xmlns:ns3="9237417f-6a90-4707-b345-f61fa45bd513" xmlns:ns4="9a6bc8ff-0751-4fb5-b019-c7731e2305e0" targetNamespace="http://schemas.microsoft.com/office/2006/metadata/properties" ma:root="true" ma:fieldsID="8962f9b60b26a87ae6d308e6e9d5b6bd" ns3:_="" ns4:_="">
     <xsd:import namespace="9237417f-6a90-4707-b345-f61fa45bd513"/>
@@ -4780,19 +4775,6 @@
 </ct:contentTypeSchema>
 </file>
 
-<file path=customXml/item2.xml><?xml version="1.0" encoding="utf-8"?>
-<b:Sources xmlns:b="http://schemas.openxmlformats.org/officeDocument/2006/bibliography" xmlns="http://schemas.openxmlformats.org/officeDocument/2006/bibliography" SelectedStyle="\APASixthEditionOfficeOnline.xsl" StyleName="APA" Version="6"/>
-</file>
-
-<file path=customXml/item3.xml><?xml version="1.0" encoding="utf-8"?>
-<?mso-contentType ?>
-<FormTemplates xmlns="http://schemas.microsoft.com/sharepoint/v3/contenttype/forms">
-  <Display>DocumentLibraryForm</Display>
-  <Edit>DocumentLibraryForm</Edit>
-  <New>DocumentLibraryForm</New>
-</FormTemplates>
-</file>
-
 <file path=customXml/item4.xml><?xml version="1.0" encoding="utf-8"?>
 <p:properties xmlns:p="http://schemas.microsoft.com/office/2006/metadata/properties" xmlns:xsi="http://www.w3.org/2001/XMLSchema-instance" xmlns:pc="http://schemas.microsoft.com/office/infopath/2007/PartnerControls">
   <documentManagement/>
@@ -4800,6 +4782,22 @@
 </file>
 
 <file path=customXml/itemProps1.xml><?xml version="1.0" encoding="utf-8"?>
+<ds:datastoreItem xmlns:ds="http://schemas.openxmlformats.org/officeDocument/2006/customXml" ds:itemID="{A6C65B34-06ED-41A8-A3F3-05A1F92025D0}">
+  <ds:schemaRefs>
+    <ds:schemaRef ds:uri="http://schemas.microsoft.com/sharepoint/v3/contenttype/forms"/>
+  </ds:schemaRefs>
+</ds:datastoreItem>
+</file>
+
+<file path=customXml/itemProps2.xml><?xml version="1.0" encoding="utf-8"?>
+<ds:datastoreItem xmlns:ds="http://schemas.openxmlformats.org/officeDocument/2006/customXml" ds:itemID="{CC3DF9CB-EAE3-4358-B00B-AEDD1725FC02}">
+  <ds:schemaRefs>
+    <ds:schemaRef ds:uri="http://schemas.openxmlformats.org/officeDocument/2006/bibliography"/>
+  </ds:schemaRefs>
+</ds:datastoreItem>
+</file>
+
+<file path=customXml/itemProps3.xml><?xml version="1.0" encoding="utf-8"?>
 <ds:datastoreItem xmlns:ds="http://schemas.openxmlformats.org/officeDocument/2006/customXml" ds:itemID="{2993B305-E746-423D-81B7-32926B0D6054}">
   <ds:schemaRefs>
     <ds:schemaRef ds:uri="http://schemas.microsoft.com/office/2006/metadata/contentType"/>
@@ -4818,22 +4816,6 @@
 </ds:datastoreItem>
 </file>
 
-<file path=customXml/itemProps2.xml><?xml version="1.0" encoding="utf-8"?>
-<ds:datastoreItem xmlns:ds="http://schemas.openxmlformats.org/officeDocument/2006/customXml" ds:itemID="{CC3DF9CB-EAE3-4358-B00B-AEDD1725FC02}">
-  <ds:schemaRefs>
-    <ds:schemaRef ds:uri="http://schemas.openxmlformats.org/officeDocument/2006/bibliography"/>
-  </ds:schemaRefs>
-</ds:datastoreItem>
-</file>
-
-<file path=customXml/itemProps3.xml><?xml version="1.0" encoding="utf-8"?>
-<ds:datastoreItem xmlns:ds="http://schemas.openxmlformats.org/officeDocument/2006/customXml" ds:itemID="{A6C65B34-06ED-41A8-A3F3-05A1F92025D0}">
-  <ds:schemaRefs>
-    <ds:schemaRef ds:uri="http://schemas.microsoft.com/sharepoint/v3/contenttype/forms"/>
-  </ds:schemaRefs>
-</ds:datastoreItem>
-</file>
-
 <file path=customXml/itemProps4.xml><?xml version="1.0" encoding="utf-8"?>
 <ds:datastoreItem xmlns:ds="http://schemas.openxmlformats.org/officeDocument/2006/customXml" ds:itemID="{83F54608-22A7-4AF5-943D-E29461CC7B4C}">
   <ds:schemaRefs>

</xml_diff>

<commit_message>
Deploying to gh-pages from  @ a5519fb775f5fc0dbce32c3f1deb000396efad11 🚀
</commit_message>
<xml_diff>
--- a/assets/resume/Resume_Vivek_Bhat.docx
+++ b/assets/resume/Resume_Vivek_Bhat.docx
@@ -17,16 +17,16 @@
         <w:rPr>
           <w:rFonts w:ascii="Times" w:hAnsi="Times" w:cs="Times New Roman"/>
           <w:smallCaps/>
-          <w:sz w:val="64"/>
-          <w:szCs w:val="64"/>
+          <w:sz w:val="56"/>
+          <w:szCs w:val="56"/>
         </w:rPr>
       </w:pPr>
       <w:r>
         <w:rPr>
           <w:rFonts w:ascii="Times" w:hAnsi="Times" w:cs="Times New Roman"/>
           <w:smallCaps/>
-          <w:sz w:val="64"/>
-          <w:szCs w:val="64"/>
+          <w:sz w:val="56"/>
+          <w:szCs w:val="56"/>
         </w:rPr>
         <w:t>V</w:t>
       </w:r>
@@ -34,8 +34,8 @@
         <w:rPr>
           <w:rFonts w:ascii="Times" w:hAnsi="Times" w:cs="Times New Roman"/>
           <w:smallCaps/>
-          <w:sz w:val="64"/>
-          <w:szCs w:val="64"/>
+          <w:sz w:val="56"/>
+          <w:szCs w:val="56"/>
         </w:rPr>
         <w:t xml:space="preserve">IVEK </w:t>
       </w:r>
@@ -43,8 +43,8 @@
         <w:rPr>
           <w:rFonts w:ascii="Times" w:hAnsi="Times" w:cs="Times New Roman"/>
           <w:smallCaps/>
-          <w:sz w:val="64"/>
-          <w:szCs w:val="64"/>
+          <w:sz w:val="56"/>
+          <w:szCs w:val="56"/>
         </w:rPr>
         <w:t>B</w:t>
       </w:r>
@@ -52,8 +52,8 @@
         <w:rPr>
           <w:rFonts w:ascii="Times" w:hAnsi="Times" w:cs="Times New Roman"/>
           <w:smallCaps/>
-          <w:sz w:val="64"/>
-          <w:szCs w:val="64"/>
+          <w:sz w:val="56"/>
+          <w:szCs w:val="56"/>
         </w:rPr>
         <w:t>HAT</w:t>
       </w:r>
@@ -4010,6 +4010,7 @@
   <w:style w:type="character" w:default="1" w:styleId="DefaultParagraphFont">
     <w:name w:val="Default Paragraph Font"/>
     <w:uiPriority w:val="1"/>
+    <w:semiHidden/>
     <w:unhideWhenUsed/>
   </w:style>
   <w:style w:type="table" w:default="1" w:styleId="TableNormal">
@@ -4546,19 +4547,6 @@
 </file>
 
 <file path=customXml/item1.xml><?xml version="1.0" encoding="utf-8"?>
-<?mso-contentType ?>
-<FormTemplates xmlns="http://schemas.microsoft.com/sharepoint/v3/contenttype/forms">
-  <Display>DocumentLibraryForm</Display>
-  <Edit>DocumentLibraryForm</Edit>
-  <New>DocumentLibraryForm</New>
-</FormTemplates>
-</file>
-
-<file path=customXml/item2.xml><?xml version="1.0" encoding="utf-8"?>
-<b:Sources xmlns:b="http://schemas.openxmlformats.org/officeDocument/2006/bibliography" xmlns="http://schemas.openxmlformats.org/officeDocument/2006/bibliography" SelectedStyle="\APASixthEditionOfficeOnline.xsl" StyleName="APA" Version="6"/>
-</file>
-
-<file path=customXml/item3.xml><?xml version="1.0" encoding="utf-8"?>
 <ct:contentTypeSchema xmlns:ct="http://schemas.microsoft.com/office/2006/metadata/contentType" xmlns:ma="http://schemas.microsoft.com/office/2006/metadata/properties/metaAttributes" ct:_="" ma:_="" ma:contentTypeName="Document" ma:contentTypeID="0x010100C62E9F8080EF9045A3461589C8C739D0" ma:contentTypeVersion="12" ma:contentTypeDescription="Create a new document." ma:contentTypeScope="" ma:versionID="b82a4e0cfbba1a4e0025dcf5a4615212">
   <xsd:schema xmlns:xsd="http://www.w3.org/2001/XMLSchema" xmlns:xs="http://www.w3.org/2001/XMLSchema" xmlns:p="http://schemas.microsoft.com/office/2006/metadata/properties" xmlns:ns3="9237417f-6a90-4707-b345-f61fa45bd513" xmlns:ns4="9a6bc8ff-0751-4fb5-b019-c7731e2305e0" targetNamespace="http://schemas.microsoft.com/office/2006/metadata/properties" ma:root="true" ma:fieldsID="8962f9b60b26a87ae6d308e6e9d5b6bd" ns3:_="" ns4:_="">
     <xsd:import namespace="9237417f-6a90-4707-b345-f61fa45bd513"/>
@@ -4775,6 +4763,19 @@
 </ct:contentTypeSchema>
 </file>
 
+<file path=customXml/item2.xml><?xml version="1.0" encoding="utf-8"?>
+<b:Sources xmlns:b="http://schemas.openxmlformats.org/officeDocument/2006/bibliography" xmlns="http://schemas.openxmlformats.org/officeDocument/2006/bibliography" SelectedStyle="\APASixthEditionOfficeOnline.xsl" StyleName="APA" Version="6"/>
+</file>
+
+<file path=customXml/item3.xml><?xml version="1.0" encoding="utf-8"?>
+<?mso-contentType ?>
+<FormTemplates xmlns="http://schemas.microsoft.com/sharepoint/v3/contenttype/forms">
+  <Display>DocumentLibraryForm</Display>
+  <Edit>DocumentLibraryForm</Edit>
+  <New>DocumentLibraryForm</New>
+</FormTemplates>
+</file>
+
 <file path=customXml/item4.xml><?xml version="1.0" encoding="utf-8"?>
 <p:properties xmlns:p="http://schemas.microsoft.com/office/2006/metadata/properties" xmlns:xsi="http://www.w3.org/2001/XMLSchema-instance" xmlns:pc="http://schemas.microsoft.com/office/infopath/2007/PartnerControls">
   <documentManagement/>
@@ -4782,22 +4783,6 @@
 </file>
 
 <file path=customXml/itemProps1.xml><?xml version="1.0" encoding="utf-8"?>
-<ds:datastoreItem xmlns:ds="http://schemas.openxmlformats.org/officeDocument/2006/customXml" ds:itemID="{A6C65B34-06ED-41A8-A3F3-05A1F92025D0}">
-  <ds:schemaRefs>
-    <ds:schemaRef ds:uri="http://schemas.microsoft.com/sharepoint/v3/contenttype/forms"/>
-  </ds:schemaRefs>
-</ds:datastoreItem>
-</file>
-
-<file path=customXml/itemProps2.xml><?xml version="1.0" encoding="utf-8"?>
-<ds:datastoreItem xmlns:ds="http://schemas.openxmlformats.org/officeDocument/2006/customXml" ds:itemID="{CC3DF9CB-EAE3-4358-B00B-AEDD1725FC02}">
-  <ds:schemaRefs>
-    <ds:schemaRef ds:uri="http://schemas.openxmlformats.org/officeDocument/2006/bibliography"/>
-  </ds:schemaRefs>
-</ds:datastoreItem>
-</file>
-
-<file path=customXml/itemProps3.xml><?xml version="1.0" encoding="utf-8"?>
 <ds:datastoreItem xmlns:ds="http://schemas.openxmlformats.org/officeDocument/2006/customXml" ds:itemID="{2993B305-E746-423D-81B7-32926B0D6054}">
   <ds:schemaRefs>
     <ds:schemaRef ds:uri="http://schemas.microsoft.com/office/2006/metadata/contentType"/>
@@ -4816,6 +4801,22 @@
 </ds:datastoreItem>
 </file>
 
+<file path=customXml/itemProps2.xml><?xml version="1.0" encoding="utf-8"?>
+<ds:datastoreItem xmlns:ds="http://schemas.openxmlformats.org/officeDocument/2006/customXml" ds:itemID="{CC3DF9CB-EAE3-4358-B00B-AEDD1725FC02}">
+  <ds:schemaRefs>
+    <ds:schemaRef ds:uri="http://schemas.openxmlformats.org/officeDocument/2006/bibliography"/>
+  </ds:schemaRefs>
+</ds:datastoreItem>
+</file>
+
+<file path=customXml/itemProps3.xml><?xml version="1.0" encoding="utf-8"?>
+<ds:datastoreItem xmlns:ds="http://schemas.openxmlformats.org/officeDocument/2006/customXml" ds:itemID="{A6C65B34-06ED-41A8-A3F3-05A1F92025D0}">
+  <ds:schemaRefs>
+    <ds:schemaRef ds:uri="http://schemas.microsoft.com/sharepoint/v3/contenttype/forms"/>
+  </ds:schemaRefs>
+</ds:datastoreItem>
+</file>
+
 <file path=customXml/itemProps4.xml><?xml version="1.0" encoding="utf-8"?>
 <ds:datastoreItem xmlns:ds="http://schemas.openxmlformats.org/officeDocument/2006/customXml" ds:itemID="{83F54608-22A7-4AF5-943D-E29461CC7B4C}">
   <ds:schemaRefs>

</xml_diff>

<commit_message>
Deploying to gh-pages from  @ bf3c62b71588ba94c4149e6a2db4f96c33f83087 🚀
</commit_message>
<xml_diff>
--- a/assets/resume/Resume_Vivek_Bhat.docx
+++ b/assets/resume/Resume_Vivek_Bhat.docx
@@ -174,38 +174,56 @@
           <w:szCs w:val="20"/>
         </w:rPr>
       </w:pPr>
-      <w:r>
-        <w:rPr>
-          <w:color w:val="000000" w:themeColor="text1"/>
+      <w:hyperlink r:id="rId12" w:history="1">
+        <w:r>
+          <w:rPr>
+            <w:rStyle w:val="Hyperlink"/>
+            <w:color w:val="000000" w:themeColor="text1"/>
+            <w:sz w:val="20"/>
+            <w:szCs w:val="20"/>
+            <w:u w:val="none"/>
+          </w:rPr>
+          <w:t>github.com/vivekbhat</w:t>
+        </w:r>
+      </w:hyperlink>
+    </w:p>
+    <w:p>
+      <w:pPr>
+        <w:ind w:left="274"/>
+        <w:jc w:val="right"/>
+        <w:rPr>
           <w:sz w:val="20"/>
           <w:szCs w:val="20"/>
         </w:rPr>
-        <w:t>github.com/vivekbhat</w:t>
-      </w:r>
-    </w:p>
-    <w:p>
-      <w:pPr>
-        <w:ind w:left="274"/>
-        <w:jc w:val="right"/>
-        <w:rPr>
-          <w:sz w:val="20"/>
-          <w:szCs w:val="20"/>
-        </w:rPr>
         <w:sectPr>
-          <w:headerReference w:type="default" r:id="rId12"/>
+          <w:headerReference w:type="default" r:id="rId13"/>
           <w:type w:val="continuous"/>
           <w:pgSz w:w="11910" w:h="16840"/>
           <w:pgMar w:top="520" w:right="570" w:bottom="630" w:left="540" w:header="250" w:footer="720" w:gutter="0"/>
           <w:cols w:num="2" w:space="720"/>
         </w:sectPr>
       </w:pPr>
-      <w:hyperlink r:id="rId13" w:history="1">
+      <w:hyperlink r:id="rId14" w:history="1">
         <w:r>
           <w:rPr>
             <w:sz w:val="20"/>
             <w:szCs w:val="20"/>
           </w:rPr>
-          <w:t>linkedin.com/in/vivek-bhat</w:t>
+          <w:t>lin</w:t>
+        </w:r>
+        <w:r>
+          <w:rPr>
+            <w:sz w:val="20"/>
+            <w:szCs w:val="20"/>
+          </w:rPr>
+          <w:t>k</w:t>
+        </w:r>
+        <w:r>
+          <w:rPr>
+            <w:sz w:val="20"/>
+            <w:szCs w:val="20"/>
+          </w:rPr>
+          <w:t>edin.com/in/vivek-bhat</w:t>
         </w:r>
       </w:hyperlink>
     </w:p>
@@ -4547,6 +4565,19 @@
 </file>
 
 <file path=customXml/item1.xml><?xml version="1.0" encoding="utf-8"?>
+<?mso-contentType ?>
+<FormTemplates xmlns="http://schemas.microsoft.com/sharepoint/v3/contenttype/forms">
+  <Display>DocumentLibraryForm</Display>
+  <Edit>DocumentLibraryForm</Edit>
+  <New>DocumentLibraryForm</New>
+</FormTemplates>
+</file>
+
+<file path=customXml/item2.xml><?xml version="1.0" encoding="utf-8"?>
+<b:Sources xmlns:b="http://schemas.openxmlformats.org/officeDocument/2006/bibliography" xmlns="http://schemas.openxmlformats.org/officeDocument/2006/bibliography" SelectedStyle="\APASixthEditionOfficeOnline.xsl" StyleName="APA" Version="6"/>
+</file>
+
+<file path=customXml/item3.xml><?xml version="1.0" encoding="utf-8"?>
 <ct:contentTypeSchema xmlns:ct="http://schemas.microsoft.com/office/2006/metadata/contentType" xmlns:ma="http://schemas.microsoft.com/office/2006/metadata/properties/metaAttributes" ct:_="" ma:_="" ma:contentTypeName="Document" ma:contentTypeID="0x010100C62E9F8080EF9045A3461589C8C739D0" ma:contentTypeVersion="12" ma:contentTypeDescription="Create a new document." ma:contentTypeScope="" ma:versionID="b82a4e0cfbba1a4e0025dcf5a4615212">
   <xsd:schema xmlns:xsd="http://www.w3.org/2001/XMLSchema" xmlns:xs="http://www.w3.org/2001/XMLSchema" xmlns:p="http://schemas.microsoft.com/office/2006/metadata/properties" xmlns:ns3="9237417f-6a90-4707-b345-f61fa45bd513" xmlns:ns4="9a6bc8ff-0751-4fb5-b019-c7731e2305e0" targetNamespace="http://schemas.microsoft.com/office/2006/metadata/properties" ma:root="true" ma:fieldsID="8962f9b60b26a87ae6d308e6e9d5b6bd" ns3:_="" ns4:_="">
     <xsd:import namespace="9237417f-6a90-4707-b345-f61fa45bd513"/>
@@ -4763,19 +4794,6 @@
 </ct:contentTypeSchema>
 </file>
 
-<file path=customXml/item2.xml><?xml version="1.0" encoding="utf-8"?>
-<b:Sources xmlns:b="http://schemas.openxmlformats.org/officeDocument/2006/bibliography" xmlns="http://schemas.openxmlformats.org/officeDocument/2006/bibliography" SelectedStyle="\APASixthEditionOfficeOnline.xsl" StyleName="APA" Version="6"/>
-</file>
-
-<file path=customXml/item3.xml><?xml version="1.0" encoding="utf-8"?>
-<?mso-contentType ?>
-<FormTemplates xmlns="http://schemas.microsoft.com/sharepoint/v3/contenttype/forms">
-  <Display>DocumentLibraryForm</Display>
-  <Edit>DocumentLibraryForm</Edit>
-  <New>DocumentLibraryForm</New>
-</FormTemplates>
-</file>
-
 <file path=customXml/item4.xml><?xml version="1.0" encoding="utf-8"?>
 <p:properties xmlns:p="http://schemas.microsoft.com/office/2006/metadata/properties" xmlns:xsi="http://www.w3.org/2001/XMLSchema-instance" xmlns:pc="http://schemas.microsoft.com/office/infopath/2007/PartnerControls">
   <documentManagement/>
@@ -4783,6 +4801,22 @@
 </file>
 
 <file path=customXml/itemProps1.xml><?xml version="1.0" encoding="utf-8"?>
+<ds:datastoreItem xmlns:ds="http://schemas.openxmlformats.org/officeDocument/2006/customXml" ds:itemID="{A6C65B34-06ED-41A8-A3F3-05A1F92025D0}">
+  <ds:schemaRefs>
+    <ds:schemaRef ds:uri="http://schemas.microsoft.com/sharepoint/v3/contenttype/forms"/>
+  </ds:schemaRefs>
+</ds:datastoreItem>
+</file>
+
+<file path=customXml/itemProps2.xml><?xml version="1.0" encoding="utf-8"?>
+<ds:datastoreItem xmlns:ds="http://schemas.openxmlformats.org/officeDocument/2006/customXml" ds:itemID="{CC3DF9CB-EAE3-4358-B00B-AEDD1725FC02}">
+  <ds:schemaRefs>
+    <ds:schemaRef ds:uri="http://schemas.openxmlformats.org/officeDocument/2006/bibliography"/>
+  </ds:schemaRefs>
+</ds:datastoreItem>
+</file>
+
+<file path=customXml/itemProps3.xml><?xml version="1.0" encoding="utf-8"?>
 <ds:datastoreItem xmlns:ds="http://schemas.openxmlformats.org/officeDocument/2006/customXml" ds:itemID="{2993B305-E746-423D-81B7-32926B0D6054}">
   <ds:schemaRefs>
     <ds:schemaRef ds:uri="http://schemas.microsoft.com/office/2006/metadata/contentType"/>
@@ -4801,22 +4835,6 @@
 </ds:datastoreItem>
 </file>
 
-<file path=customXml/itemProps2.xml><?xml version="1.0" encoding="utf-8"?>
-<ds:datastoreItem xmlns:ds="http://schemas.openxmlformats.org/officeDocument/2006/customXml" ds:itemID="{CC3DF9CB-EAE3-4358-B00B-AEDD1725FC02}">
-  <ds:schemaRefs>
-    <ds:schemaRef ds:uri="http://schemas.openxmlformats.org/officeDocument/2006/bibliography"/>
-  </ds:schemaRefs>
-</ds:datastoreItem>
-</file>
-
-<file path=customXml/itemProps3.xml><?xml version="1.0" encoding="utf-8"?>
-<ds:datastoreItem xmlns:ds="http://schemas.openxmlformats.org/officeDocument/2006/customXml" ds:itemID="{A6C65B34-06ED-41A8-A3F3-05A1F92025D0}">
-  <ds:schemaRefs>
-    <ds:schemaRef ds:uri="http://schemas.microsoft.com/sharepoint/v3/contenttype/forms"/>
-  </ds:schemaRefs>
-</ds:datastoreItem>
-</file>
-
 <file path=customXml/itemProps4.xml><?xml version="1.0" encoding="utf-8"?>
 <ds:datastoreItem xmlns:ds="http://schemas.openxmlformats.org/officeDocument/2006/customXml" ds:itemID="{83F54608-22A7-4AF5-943D-E29461CC7B4C}">
   <ds:schemaRefs>

</xml_diff>

<commit_message>
Deploying to gh-pages from @ VivekBhat/website-v2@9abbe290b3282e62ff803460b3583e68dcdafb25 🚀
</commit_message>
<xml_diff>
--- a/assets/resume/Resume_Vivek_Bhat.docx
+++ b/assets/resume/Resume_Vivek_Bhat.docx
@@ -183,8 +183,20 @@
             <w:szCs w:val="20"/>
             <w:u w:val="none"/>
           </w:rPr>
-          <w:t>github.com/vivekbhat</w:t>
+          <w:t>github.com/</w:t>
         </w:r>
+        <w:proofErr w:type="spellStart"/>
+        <w:r>
+          <w:rPr>
+            <w:rStyle w:val="Hyperlink"/>
+            <w:color w:val="000000" w:themeColor="text1"/>
+            <w:sz w:val="20"/>
+            <w:szCs w:val="20"/>
+            <w:u w:val="none"/>
+          </w:rPr>
+          <w:t>vivekbhat</w:t>
+        </w:r>
+        <w:proofErr w:type="spellEnd"/>
       </w:hyperlink>
     </w:p>
     <w:p>
@@ -208,8 +220,17 @@
             <w:sz w:val="20"/>
             <w:szCs w:val="20"/>
           </w:rPr>
-          <w:t>linkedin.com/in/vivek-bhat</w:t>
+          <w:t>linkedin.com/in/</w:t>
         </w:r>
+        <w:proofErr w:type="spellStart"/>
+        <w:r>
+          <w:rPr>
+            <w:sz w:val="20"/>
+            <w:szCs w:val="20"/>
+          </w:rPr>
+          <w:t>vivek-bhat</w:t>
+        </w:r>
+        <w:proofErr w:type="spellEnd"/>
       </w:hyperlink>
     </w:p>
     <w:p>
@@ -781,36 +802,63 @@
           <w:sz w:val="25"/>
           <w:szCs w:val="25"/>
         </w:rPr>
-        <w:lastRenderedPageBreak/>
-        <w:t xml:space="preserve">HUGHES, </w:t>
+        <w:t>ECHOSTAR</w:t>
       </w:r>
       <w:r>
         <w:rPr>
           <w:sz w:val="25"/>
           <w:szCs w:val="25"/>
         </w:rPr>
-        <w:t xml:space="preserve">Maryland, </w:t>
+        <w:t>, Maryland</w:t>
       </w:r>
       <w:r>
         <w:rPr>
           <w:sz w:val="25"/>
           <w:szCs w:val="25"/>
         </w:rPr>
-        <w:t>Sr Software Engineer</w:t>
+        <w:t xml:space="preserve"> - </w:t>
       </w:r>
       <w:r>
         <w:rPr>
           <w:sz w:val="25"/>
           <w:szCs w:val="25"/>
         </w:rPr>
-        <w:tab/>
+        <w:t xml:space="preserve">Principal </w:t>
       </w:r>
       <w:r>
         <w:rPr>
           <w:sz w:val="25"/>
           <w:szCs w:val="25"/>
         </w:rPr>
-        <w:t>Nov 2023 – Present</w:t>
+        <w:t xml:space="preserve">Software </w:t>
+      </w:r>
+      <w:r>
+        <w:rPr>
+          <w:sz w:val="25"/>
+          <w:szCs w:val="25"/>
+        </w:rPr>
+        <w:t>Engineer</w:t>
+      </w:r>
+      <w:r>
+        <w:rPr>
+          <w:sz w:val="25"/>
+          <w:szCs w:val="25"/>
+        </w:rPr>
+        <w:tab/>
+      </w:r>
+      <w:r>
+        <w:rPr>
+          <w:sz w:val="25"/>
+          <w:szCs w:val="25"/>
+        </w:rPr>
+        <w:t xml:space="preserve">March 2026 </w:t>
+      </w:r>
+      <w:r>
+        <w:rPr>
+          <w:sz w:val="25"/>
+          <w:szCs w:val="25"/>
+        </w:rPr>
+        <w:t>– Present</w:t>
       </w:r>
     </w:p>
     <w:p>
@@ -837,7 +885,7 @@
           <w:sz w:val="24"/>
           <w:szCs w:val="24"/>
         </w:rPr>
-        <w:t>Built distributed microservices and platform components powering large</w:t>
+        <w:t>Led end</w:t>
       </w:r>
       <w:r>
         <w:rPr>
@@ -856,7 +904,45 @@
           <w:sz w:val="24"/>
           <w:szCs w:val="24"/>
         </w:rPr>
-        <w:t>scale observability systems.</w:t>
+        <w:t>to</w:t>
+      </w:r>
+      <w:r>
+        <w:rPr>
+          <w:rFonts w:ascii="Cambria Math" w:hAnsi="Cambria Math" w:cs="Cambria Math"/>
+          <w:b w:val="0"/>
+          <w:bCs w:val="0"/>
+          <w:sz w:val="24"/>
+          <w:szCs w:val="24"/>
+        </w:rPr>
+        <w:t>‑</w:t>
+      </w:r>
+      <w:r>
+        <w:rPr>
+          <w:b w:val="0"/>
+          <w:bCs w:val="0"/>
+          <w:sz w:val="24"/>
+          <w:szCs w:val="24"/>
+        </w:rPr>
+        <w:t>end design of a fault</w:t>
+      </w:r>
+      <w:r>
+        <w:rPr>
+          <w:rFonts w:ascii="Cambria Math" w:hAnsi="Cambria Math" w:cs="Cambria Math"/>
+          <w:b w:val="0"/>
+          <w:bCs w:val="0"/>
+          <w:sz w:val="24"/>
+          <w:szCs w:val="24"/>
+        </w:rPr>
+        <w:t>‑</w:t>
+      </w:r>
+      <w:r>
+        <w:rPr>
+          <w:b w:val="0"/>
+          <w:bCs w:val="0"/>
+          <w:sz w:val="24"/>
+          <w:szCs w:val="24"/>
+        </w:rPr>
+        <w:t>tolerant Apache Flink/Kafka streaming platform processing 500M+ events daily for global satellite connectivity monitoring.</w:t>
       </w:r>
     </w:p>
     <w:p>
@@ -883,25 +969,35 @@
           <w:sz w:val="24"/>
           <w:szCs w:val="24"/>
         </w:rPr>
-        <w:t>Implemented best practices for a greenfield project, including AWS VPC design, IAM</w:t>
-      </w:r>
-      <w:r>
-        <w:rPr>
-          <w:b w:val="0"/>
-          <w:bCs w:val="0"/>
-          <w:sz w:val="24"/>
-          <w:szCs w:val="24"/>
-        </w:rPr>
-        <w:t>/RBAC</w:t>
-      </w:r>
-      <w:r>
-        <w:rPr>
-          <w:b w:val="0"/>
-          <w:bCs w:val="0"/>
-          <w:sz w:val="24"/>
-          <w:szCs w:val="24"/>
-        </w:rPr>
-        <w:t xml:space="preserve"> policies, Kafka integration, Terraform-based infrastructure, and observability systems.</w:t>
+        <w:t>Set technical standards and led development of distributed platform services for large</w:t>
+      </w:r>
+      <w:r>
+        <w:rPr>
+          <w:rFonts w:ascii="Cambria Math" w:hAnsi="Cambria Math" w:cs="Cambria Math"/>
+          <w:b w:val="0"/>
+          <w:bCs w:val="0"/>
+          <w:sz w:val="24"/>
+          <w:szCs w:val="24"/>
+        </w:rPr>
+        <w:t>‑</w:t>
+      </w:r>
+      <w:r>
+        <w:rPr>
+          <w:b w:val="0"/>
+          <w:bCs w:val="0"/>
+          <w:sz w:val="24"/>
+          <w:szCs w:val="24"/>
+        </w:rPr>
+        <w:t>scale observability and reliability.</w:t>
+      </w:r>
+      <w:r>
+        <w:rPr>
+          <w:b w:val="0"/>
+          <w:bCs w:val="0"/>
+          <w:sz w:val="24"/>
+          <w:szCs w:val="24"/>
+        </w:rPr>
+        <w:t xml:space="preserve"> </w:t>
       </w:r>
     </w:p>
     <w:p>
@@ -915,91 +1011,71 @@
         <w:ind w:left="273" w:hanging="187"/>
         <w:jc w:val="both"/>
         <w:rPr>
-          <w:sz w:val="24"/>
-          <w:szCs w:val="24"/>
-        </w:rPr>
-      </w:pPr>
-      <w:r>
-        <w:rPr>
-          <w:b w:val="0"/>
-          <w:bCs w:val="0"/>
-          <w:sz w:val="24"/>
-          <w:szCs w:val="24"/>
-        </w:rPr>
-        <w:t xml:space="preserve">Built real-time data stream processing engine using </w:t>
-      </w:r>
-      <w:r>
-        <w:rPr>
-          <w:sz w:val="24"/>
-          <w:szCs w:val="24"/>
-        </w:rPr>
-        <w:t>Apache</w:t>
-      </w:r>
-      <w:r>
-        <w:rPr>
-          <w:b w:val="0"/>
-          <w:bCs w:val="0"/>
-          <w:sz w:val="24"/>
-          <w:szCs w:val="24"/>
-        </w:rPr>
-        <w:t xml:space="preserve"> </w:t>
-      </w:r>
-      <w:r>
-        <w:rPr>
-          <w:sz w:val="24"/>
-          <w:szCs w:val="24"/>
-        </w:rPr>
-        <w:t xml:space="preserve">Flink </w:t>
-      </w:r>
-      <w:r>
-        <w:rPr>
-          <w:sz w:val="24"/>
-          <w:szCs w:val="24"/>
-        </w:rPr>
-        <w:t>and Kafka</w:t>
-      </w:r>
-      <w:r>
-        <w:rPr>
-          <w:b w:val="0"/>
-          <w:bCs w:val="0"/>
-          <w:sz w:val="24"/>
-          <w:szCs w:val="24"/>
-        </w:rPr>
-        <w:t xml:space="preserve"> </w:t>
-      </w:r>
-      <w:r>
-        <w:rPr>
-          <w:b w:val="0"/>
-          <w:bCs w:val="0"/>
-          <w:sz w:val="24"/>
-          <w:szCs w:val="24"/>
-        </w:rPr>
-        <w:t xml:space="preserve">to detect satellite internet communication issues globally, reducing triage time from </w:t>
-      </w:r>
-      <w:r>
-        <w:rPr>
-          <w:sz w:val="24"/>
-          <w:szCs w:val="24"/>
-        </w:rPr>
-        <w:t>days to near real-time</w:t>
-      </w:r>
-      <w:r>
-        <w:rPr>
-          <w:b w:val="0"/>
-          <w:bCs w:val="0"/>
-          <w:sz w:val="24"/>
-          <w:szCs w:val="24"/>
-        </w:rPr>
-        <w:t>.</w:t>
-      </w:r>
-      <w:r>
-        <w:rPr>
-          <w:b w:val="0"/>
-          <w:bCs w:val="0"/>
-          <w:sz w:val="24"/>
-          <w:szCs w:val="24"/>
-        </w:rPr>
-        <w:t xml:space="preserve"> </w:t>
+          <w:b w:val="0"/>
+          <w:bCs w:val="0"/>
+          <w:sz w:val="24"/>
+          <w:szCs w:val="24"/>
+        </w:rPr>
+      </w:pPr>
+      <w:r>
+        <w:rPr>
+          <w:b w:val="0"/>
+          <w:bCs w:val="0"/>
+          <w:sz w:val="24"/>
+          <w:szCs w:val="24"/>
+        </w:rPr>
+        <w:t>Drove architectural leadership and mentorship across teams.</w:t>
+      </w:r>
+    </w:p>
+    <w:p>
+      <w:pPr>
+        <w:pStyle w:val="Heading2"/>
+        <w:tabs>
+          <w:tab w:val="right" w:pos="10440"/>
+        </w:tabs>
+        <w:spacing w:before="120" w:after="60"/>
+        <w:ind w:left="0"/>
+        <w:jc w:val="both"/>
+        <w:rPr>
+          <w:sz w:val="25"/>
+          <w:szCs w:val="25"/>
+        </w:rPr>
+      </w:pPr>
+      <w:r>
+        <w:rPr>
+          <w:sz w:val="25"/>
+          <w:szCs w:val="25"/>
+        </w:rPr>
+        <w:t xml:space="preserve">ECHOSTAR, Maryland - </w:t>
+      </w:r>
+      <w:r>
+        <w:rPr>
+          <w:sz w:val="25"/>
+          <w:szCs w:val="25"/>
+        </w:rPr>
+        <w:t>Sr Software Engineer</w:t>
+      </w:r>
+      <w:r>
+        <w:rPr>
+          <w:sz w:val="25"/>
+          <w:szCs w:val="25"/>
+        </w:rPr>
+        <w:tab/>
+        <w:t xml:space="preserve">Nov 2023 – </w:t>
+      </w:r>
+      <w:r>
+        <w:rPr>
+          <w:sz w:val="25"/>
+          <w:szCs w:val="25"/>
+        </w:rPr>
+        <w:t xml:space="preserve">March </w:t>
+      </w:r>
+      <w:r>
+        <w:rPr>
+          <w:sz w:val="25"/>
+          <w:szCs w:val="25"/>
+        </w:rPr>
+        <w:t>2026</w:t>
       </w:r>
     </w:p>
     <w:p>
@@ -1026,34 +1102,25 @@
           <w:sz w:val="24"/>
           <w:szCs w:val="24"/>
         </w:rPr>
-        <w:t xml:space="preserve">Leveraged </w:t>
-      </w:r>
-      <w:r>
-        <w:rPr>
-          <w:b w:val="0"/>
-          <w:bCs w:val="0"/>
-          <w:sz w:val="24"/>
-          <w:szCs w:val="24"/>
-        </w:rPr>
-        <w:t>AI coding assistants such as Amazon Q</w:t>
-      </w:r>
-      <w:r>
-        <w:rPr>
-          <w:b w:val="0"/>
-          <w:bCs w:val="0"/>
-          <w:sz w:val="24"/>
-          <w:szCs w:val="24"/>
-        </w:rPr>
-        <w:t xml:space="preserve"> CLI</w:t>
-      </w:r>
-      <w:r>
-        <w:rPr>
-          <w:b w:val="0"/>
-          <w:bCs w:val="0"/>
-          <w:sz w:val="24"/>
-          <w:szCs w:val="24"/>
-        </w:rPr>
-        <w:t>, GitHub Copilot, and Bedrock-based tools to optimize development workflows and improve engineering velocity.</w:t>
+        <w:t>Implemented best practices for a greenfield project, including AWS VPC design, IAM</w:t>
+      </w:r>
+      <w:r>
+        <w:rPr>
+          <w:b w:val="0"/>
+          <w:bCs w:val="0"/>
+          <w:sz w:val="24"/>
+          <w:szCs w:val="24"/>
+        </w:rPr>
+        <w:t>/RBAC</w:t>
+      </w:r>
+      <w:r>
+        <w:rPr>
+          <w:b w:val="0"/>
+          <w:bCs w:val="0"/>
+          <w:sz w:val="24"/>
+          <w:szCs w:val="24"/>
+        </w:rPr>
+        <w:t xml:space="preserve"> policies, Kafka integration, Terraform-based infrastructure, and observability systems.</w:t>
       </w:r>
     </w:p>
     <w:p>
@@ -1114,34 +1181,42 @@
           <w:sz w:val="24"/>
           <w:szCs w:val="24"/>
         </w:rPr>
-        <w:t xml:space="preserve">Engineered an </w:t>
-      </w:r>
-      <w:r>
-        <w:rPr>
-          <w:b w:val="0"/>
-          <w:bCs w:val="0"/>
-          <w:sz w:val="24"/>
-          <w:szCs w:val="24"/>
-        </w:rPr>
-        <w:t>Avro Schema</w:t>
-      </w:r>
-      <w:r>
-        <w:rPr>
-          <w:b w:val="0"/>
-          <w:bCs w:val="0"/>
-          <w:sz w:val="24"/>
-          <w:szCs w:val="24"/>
-        </w:rPr>
-        <w:t xml:space="preserve"> Registry enabling safe backward/forward compatibility and seamless schema evolution across distributed services.</w:t>
-      </w:r>
-      <w:r>
-        <w:rPr>
-          <w:b w:val="0"/>
-          <w:bCs w:val="0"/>
-          <w:sz w:val="24"/>
-          <w:szCs w:val="24"/>
-        </w:rPr>
-        <w:t xml:space="preserve">  </w:t>
+        <w:t>Automated reporting across distributed services to surface system</w:t>
+      </w:r>
+      <w:r>
+        <w:rPr>
+          <w:rFonts w:ascii="Cambria Math" w:hAnsi="Cambria Math" w:cs="Cambria Math"/>
+          <w:b w:val="0"/>
+          <w:bCs w:val="0"/>
+          <w:sz w:val="24"/>
+          <w:szCs w:val="24"/>
+        </w:rPr>
+        <w:t>‑</w:t>
+      </w:r>
+      <w:r>
+        <w:rPr>
+          <w:b w:val="0"/>
+          <w:bCs w:val="0"/>
+          <w:sz w:val="24"/>
+          <w:szCs w:val="24"/>
+        </w:rPr>
+        <w:t xml:space="preserve">wide health </w:t>
+      </w:r>
+      <w:r>
+        <w:rPr>
+          <w:sz w:val="24"/>
+          <w:szCs w:val="24"/>
+        </w:rPr>
+        <w:t>insights for stakeholders</w:t>
+      </w:r>
+      <w:r>
+        <w:rPr>
+          <w:b w:val="0"/>
+          <w:bCs w:val="0"/>
+          <w:sz w:val="24"/>
+          <w:szCs w:val="24"/>
+        </w:rPr>
+        <w:t>.</w:t>
       </w:r>
     </w:p>
     <w:p>
@@ -1168,42 +1243,7 @@
           <w:sz w:val="24"/>
           <w:szCs w:val="24"/>
         </w:rPr>
-        <w:t>Automated reporting across distributed services to surface system</w:t>
-      </w:r>
-      <w:r>
-        <w:rPr>
-          <w:rFonts w:ascii="Cambria Math" w:hAnsi="Cambria Math" w:cs="Cambria Math"/>
-          <w:b w:val="0"/>
-          <w:bCs w:val="0"/>
-          <w:sz w:val="24"/>
-          <w:szCs w:val="24"/>
-        </w:rPr>
-        <w:t>‑</w:t>
-      </w:r>
-      <w:r>
-        <w:rPr>
-          <w:b w:val="0"/>
-          <w:bCs w:val="0"/>
-          <w:sz w:val="24"/>
-          <w:szCs w:val="24"/>
-        </w:rPr>
-        <w:t xml:space="preserve">wide health </w:t>
-      </w:r>
-      <w:r>
-        <w:rPr>
-          <w:sz w:val="24"/>
-          <w:szCs w:val="24"/>
-        </w:rPr>
-        <w:t>insights for stakeholders</w:t>
-      </w:r>
-      <w:r>
-        <w:rPr>
-          <w:b w:val="0"/>
-          <w:bCs w:val="0"/>
-          <w:sz w:val="24"/>
-          <w:szCs w:val="24"/>
-        </w:rPr>
-        <w:t>.</w:t>
+        <w:t xml:space="preserve">Engineered an Avro Schema Registry enabling safe backward/forward compatibility and seamless schema evolution across distributed services.  </w:t>
       </w:r>
     </w:p>
     <w:p>
@@ -1294,25 +1334,7 @@
           <w:sz w:val="24"/>
           <w:szCs w:val="24"/>
         </w:rPr>
-        <w:t xml:space="preserve">Delivered full observability (metrics, logs, </w:t>
-      </w:r>
-      <w:r>
-        <w:rPr>
-          <w:b w:val="0"/>
-          <w:bCs w:val="0"/>
-          <w:sz w:val="24"/>
-          <w:szCs w:val="24"/>
-        </w:rPr>
-        <w:t>dashboards</w:t>
-      </w:r>
-      <w:r>
-        <w:rPr>
-          <w:b w:val="0"/>
-          <w:bCs w:val="0"/>
-          <w:sz w:val="24"/>
-          <w:szCs w:val="24"/>
-        </w:rPr>
-        <w:t>) to improve reliability and MTTR across services.</w:t>
+        <w:t>Leveraged AI coding assistants such as Amazon Q CLI, GitHub Copilot, and Bedrock-based tools to optimize development workflows and improve engineering velocity.</w:t>
       </w:r>
     </w:p>
     <w:p>
@@ -1339,32 +1361,25 @@
           <w:sz w:val="24"/>
           <w:szCs w:val="24"/>
         </w:rPr>
-        <w:t xml:space="preserve">Engineered a </w:t>
-      </w:r>
-      <w:r>
-        <w:rPr>
-          <w:b w:val="0"/>
-          <w:bCs w:val="0"/>
-          <w:sz w:val="24"/>
-          <w:szCs w:val="24"/>
-        </w:rPr>
-        <w:t xml:space="preserve">highly scalable </w:t>
-      </w:r>
-      <w:r>
-        <w:rPr>
-          <w:b w:val="0"/>
-          <w:bCs w:val="0"/>
-          <w:sz w:val="24"/>
-          <w:szCs w:val="24"/>
-        </w:rPr>
-        <w:t xml:space="preserve">service to identify weather-impacted customers, cutting </w:t>
-      </w:r>
-      <w:r>
-        <w:rPr>
-          <w:sz w:val="24"/>
-          <w:szCs w:val="24"/>
-        </w:rPr>
-        <w:t>triage time by 90%.</w:t>
+        <w:t xml:space="preserve">Delivered full observability (metrics, logs, </w:t>
+      </w:r>
+      <w:r>
+        <w:rPr>
+          <w:b w:val="0"/>
+          <w:bCs w:val="0"/>
+          <w:sz w:val="24"/>
+          <w:szCs w:val="24"/>
+        </w:rPr>
+        <w:t>dashboards</w:t>
+      </w:r>
+      <w:r>
+        <w:rPr>
+          <w:b w:val="0"/>
+          <w:bCs w:val="0"/>
+          <w:sz w:val="24"/>
+          <w:szCs w:val="24"/>
+        </w:rPr>
+        <w:t>) to improve reliability and MTTR across services.</w:t>
       </w:r>
     </w:p>
     <w:p>
@@ -1391,32 +1406,32 @@
           <w:sz w:val="24"/>
           <w:szCs w:val="24"/>
         </w:rPr>
-        <w:t xml:space="preserve">Built ML pipelines for </w:t>
-      </w:r>
-      <w:r>
-        <w:rPr>
-          <w:sz w:val="24"/>
-          <w:szCs w:val="24"/>
-        </w:rPr>
-        <w:t>anomaly detection</w:t>
-      </w:r>
-      <w:r>
-        <w:rPr>
-          <w:b w:val="0"/>
-          <w:bCs w:val="0"/>
-          <w:sz w:val="24"/>
-          <w:szCs w:val="24"/>
-        </w:rPr>
-        <w:t>,</w:t>
-      </w:r>
-      <w:r>
-        <w:rPr>
-          <w:b w:val="0"/>
-          <w:bCs w:val="0"/>
-          <w:sz w:val="24"/>
-          <w:szCs w:val="24"/>
-        </w:rPr>
-        <w:t xml:space="preserve"> classification and prediction of large-scale network issues.</w:t>
+        <w:t xml:space="preserve">Engineered a </w:t>
+      </w:r>
+      <w:r>
+        <w:rPr>
+          <w:b w:val="0"/>
+          <w:bCs w:val="0"/>
+          <w:sz w:val="24"/>
+          <w:szCs w:val="24"/>
+        </w:rPr>
+        <w:t xml:space="preserve">highly scalable </w:t>
+      </w:r>
+      <w:r>
+        <w:rPr>
+          <w:b w:val="0"/>
+          <w:bCs w:val="0"/>
+          <w:sz w:val="24"/>
+          <w:szCs w:val="24"/>
+        </w:rPr>
+        <w:t xml:space="preserve">service to identify weather-impacted customers, cutting </w:t>
+      </w:r>
+      <w:r>
+        <w:rPr>
+          <w:sz w:val="24"/>
+          <w:szCs w:val="24"/>
+        </w:rPr>
+        <w:t>triage time by 90%.</w:t>
       </w:r>
     </w:p>
     <w:p>
@@ -1443,25 +1458,151 @@
           <w:sz w:val="24"/>
           <w:szCs w:val="24"/>
         </w:rPr>
-        <w:t>Mentored engineers and influenced architecture across teams</w:t>
-      </w:r>
-      <w:r>
-        <w:rPr>
-          <w:b w:val="0"/>
-          <w:bCs w:val="0"/>
-          <w:sz w:val="24"/>
-          <w:szCs w:val="24"/>
-        </w:rPr>
-        <w:t xml:space="preserve"> and organizations</w:t>
-      </w:r>
-      <w:r>
-        <w:rPr>
-          <w:b w:val="0"/>
-          <w:bCs w:val="0"/>
-          <w:sz w:val="24"/>
-          <w:szCs w:val="24"/>
-        </w:rPr>
-        <w:t>.</w:t>
+        <w:t xml:space="preserve">Built ML pipelines for </w:t>
+      </w:r>
+      <w:r>
+        <w:rPr>
+          <w:sz w:val="24"/>
+          <w:szCs w:val="24"/>
+        </w:rPr>
+        <w:t>anomaly detection</w:t>
+      </w:r>
+      <w:r>
+        <w:rPr>
+          <w:b w:val="0"/>
+          <w:bCs w:val="0"/>
+          <w:sz w:val="24"/>
+          <w:szCs w:val="24"/>
+        </w:rPr>
+        <w:t>,</w:t>
+      </w:r>
+      <w:r>
+        <w:rPr>
+          <w:b w:val="0"/>
+          <w:bCs w:val="0"/>
+          <w:sz w:val="24"/>
+          <w:szCs w:val="24"/>
+        </w:rPr>
+        <w:t xml:space="preserve"> classification and prediction of large-scale network issues.</w:t>
+      </w:r>
+    </w:p>
+    <w:p>
+      <w:pPr>
+        <w:pStyle w:val="Heading2"/>
+        <w:tabs>
+          <w:tab w:val="right" w:pos="10440"/>
+        </w:tabs>
+        <w:spacing w:before="120" w:after="60"/>
+        <w:ind w:left="0"/>
+        <w:rPr>
+          <w:sz w:val="25"/>
+          <w:szCs w:val="25"/>
+        </w:rPr>
+      </w:pPr>
+      <w:r>
+        <w:rPr>
+          <w:sz w:val="25"/>
+          <w:szCs w:val="25"/>
+        </w:rPr>
+        <w:t>AMAZON</w:t>
+      </w:r>
+      <w:r>
+        <w:rPr>
+          <w:sz w:val="25"/>
+          <w:szCs w:val="25"/>
+        </w:rPr>
+        <w:t xml:space="preserve">, </w:t>
+      </w:r>
+      <w:r>
+        <w:rPr>
+          <w:sz w:val="25"/>
+          <w:szCs w:val="25"/>
+        </w:rPr>
+        <w:t>Seattle</w:t>
+      </w:r>
+      <w:r>
+        <w:rPr>
+          <w:sz w:val="25"/>
+          <w:szCs w:val="25"/>
+        </w:rPr>
+        <w:t>, WA</w:t>
+      </w:r>
+      <w:r>
+        <w:rPr>
+          <w:sz w:val="25"/>
+          <w:szCs w:val="25"/>
+        </w:rPr>
+        <w:t xml:space="preserve"> -</w:t>
+      </w:r>
+      <w:r>
+        <w:rPr>
+          <w:sz w:val="25"/>
+          <w:szCs w:val="25"/>
+        </w:rPr>
+        <w:t xml:space="preserve"> Software Development Engineer</w:t>
+      </w:r>
+      <w:r>
+        <w:rPr>
+          <w:sz w:val="25"/>
+          <w:szCs w:val="25"/>
+        </w:rPr>
+        <w:t xml:space="preserve"> </w:t>
+      </w:r>
+      <w:r>
+        <w:rPr>
+          <w:sz w:val="25"/>
+          <w:szCs w:val="25"/>
+        </w:rPr>
+        <w:tab/>
+      </w:r>
+      <w:r>
+        <w:rPr>
+          <w:sz w:val="25"/>
+          <w:szCs w:val="25"/>
+        </w:rPr>
+        <w:t>Ju</w:t>
+      </w:r>
+      <w:r>
+        <w:rPr>
+          <w:sz w:val="25"/>
+          <w:szCs w:val="25"/>
+        </w:rPr>
+        <w:t>ne</w:t>
+      </w:r>
+      <w:r>
+        <w:rPr>
+          <w:sz w:val="25"/>
+          <w:szCs w:val="25"/>
+        </w:rPr>
+        <w:t xml:space="preserve"> 202</w:t>
+      </w:r>
+      <w:r>
+        <w:rPr>
+          <w:sz w:val="25"/>
+          <w:szCs w:val="25"/>
+        </w:rPr>
+        <w:t>2</w:t>
+      </w:r>
+      <w:r>
+        <w:rPr>
+          <w:sz w:val="25"/>
+          <w:szCs w:val="25"/>
+        </w:rPr>
+        <w:t xml:space="preserve"> – </w:t>
+      </w:r>
+      <w:r>
+        <w:rPr>
+          <w:sz w:val="25"/>
+          <w:szCs w:val="25"/>
+        </w:rPr>
+        <w:t>Sep</w:t>
+      </w:r>
+      <w:r>
+        <w:rPr>
+          <w:sz w:val="25"/>
+          <w:szCs w:val="25"/>
+        </w:rPr>
+        <w:t xml:space="preserve"> 2023</w:t>
       </w:r>
     </w:p>
     <w:p>
@@ -1486,127 +1627,55 @@
           <w:sz w:val="24"/>
           <w:szCs w:val="24"/>
         </w:rPr>
-        <w:t xml:space="preserve">Optimized AWS infrastructure monitoring, reducing costs </w:t>
-      </w:r>
-      <w:r>
-        <w:rPr>
-          <w:bCs w:val="0"/>
-          <w:sz w:val="24"/>
-          <w:szCs w:val="24"/>
-        </w:rPr>
-        <w:t>by 65%.</w:t>
-      </w:r>
-    </w:p>
-    <w:p>
-      <w:pPr>
-        <w:pStyle w:val="Heading2"/>
-        <w:tabs>
-          <w:tab w:val="right" w:pos="10440"/>
-        </w:tabs>
-        <w:spacing w:before="120" w:after="60"/>
-        <w:ind w:left="0"/>
-        <w:rPr>
-          <w:sz w:val="25"/>
-          <w:szCs w:val="25"/>
-        </w:rPr>
-      </w:pPr>
-      <w:r>
-        <w:rPr>
-          <w:sz w:val="25"/>
-          <w:szCs w:val="25"/>
-        </w:rPr>
-        <w:t>AMAZON</w:t>
-      </w:r>
-      <w:r>
-        <w:rPr>
-          <w:sz w:val="25"/>
-          <w:szCs w:val="25"/>
-        </w:rPr>
-        <w:t xml:space="preserve">, </w:t>
-      </w:r>
-      <w:r>
-        <w:rPr>
-          <w:sz w:val="25"/>
-          <w:szCs w:val="25"/>
-        </w:rPr>
-        <w:t>Seattle</w:t>
-      </w:r>
-      <w:r>
-        <w:rPr>
-          <w:sz w:val="25"/>
-          <w:szCs w:val="25"/>
-        </w:rPr>
-        <w:t>, WA</w:t>
-      </w:r>
-      <w:r>
-        <w:rPr>
-          <w:sz w:val="25"/>
-          <w:szCs w:val="25"/>
-        </w:rPr>
-        <w:t>, Software Development Engineer</w:t>
-      </w:r>
-      <w:r>
-        <w:rPr>
-          <w:sz w:val="25"/>
-          <w:szCs w:val="25"/>
-        </w:rPr>
-        <w:t xml:space="preserve"> </w:t>
-      </w:r>
-      <w:r>
-        <w:rPr>
-          <w:sz w:val="25"/>
-          <w:szCs w:val="25"/>
-        </w:rPr>
-        <w:tab/>
-      </w:r>
-      <w:r>
-        <w:rPr>
-          <w:sz w:val="25"/>
-          <w:szCs w:val="25"/>
-        </w:rPr>
-        <w:t>Ju</w:t>
-      </w:r>
-      <w:r>
-        <w:rPr>
-          <w:sz w:val="25"/>
-          <w:szCs w:val="25"/>
-        </w:rPr>
-        <w:t>ne</w:t>
-      </w:r>
-      <w:r>
-        <w:rPr>
-          <w:sz w:val="25"/>
-          <w:szCs w:val="25"/>
-        </w:rPr>
-        <w:t xml:space="preserve"> 202</w:t>
-      </w:r>
-      <w:r>
-        <w:rPr>
-          <w:sz w:val="25"/>
-          <w:szCs w:val="25"/>
-        </w:rPr>
-        <w:t>2</w:t>
-      </w:r>
-      <w:r>
-        <w:rPr>
-          <w:sz w:val="25"/>
-          <w:szCs w:val="25"/>
-        </w:rPr>
-        <w:t xml:space="preserve"> – </w:t>
-      </w:r>
-      <w:r>
-        <w:rPr>
-          <w:sz w:val="25"/>
-          <w:szCs w:val="25"/>
-        </w:rPr>
-        <w:t>Sep</w:t>
-      </w:r>
-      <w:r>
-        <w:rPr>
-          <w:sz w:val="25"/>
-          <w:szCs w:val="25"/>
-        </w:rPr>
-        <w:t xml:space="preserve"> 2023</w:t>
+        <w:t xml:space="preserve">Led the </w:t>
+      </w:r>
+      <w:r>
+        <w:rPr>
+          <w:b w:val="0"/>
+          <w:sz w:val="24"/>
+          <w:szCs w:val="24"/>
+        </w:rPr>
+        <w:t>design</w:t>
+      </w:r>
+      <w:r>
+        <w:rPr>
+          <w:b w:val="0"/>
+          <w:sz w:val="24"/>
+          <w:szCs w:val="24"/>
+        </w:rPr>
+        <w:t xml:space="preserve">, development, and deployment of </w:t>
+      </w:r>
+      <w:r>
+        <w:rPr>
+          <w:b w:val="0"/>
+          <w:sz w:val="24"/>
+          <w:szCs w:val="24"/>
+        </w:rPr>
+        <w:t xml:space="preserve">highly </w:t>
+      </w:r>
+      <w:r>
+        <w:rPr>
+          <w:b w:val="0"/>
+          <w:sz w:val="24"/>
+          <w:szCs w:val="24"/>
+        </w:rPr>
+        <w:t xml:space="preserve">scalable </w:t>
+      </w:r>
+      <w:r>
+        <w:rPr>
+          <w:b w:val="0"/>
+          <w:sz w:val="24"/>
+          <w:szCs w:val="24"/>
+        </w:rPr>
+        <w:t xml:space="preserve">software solutions </w:t>
+      </w:r>
+      <w:r>
+        <w:rPr>
+          <w:b w:val="0"/>
+          <w:sz w:val="24"/>
+          <w:szCs w:val="24"/>
+        </w:rPr>
+        <w:t>and microservices.</w:t>
       </w:r>
     </w:p>
     <w:p>
@@ -1631,56 +1700,39 @@
           <w:sz w:val="24"/>
           <w:szCs w:val="24"/>
         </w:rPr>
-        <w:lastRenderedPageBreak/>
-        <w:t xml:space="preserve">Led the </w:t>
-      </w:r>
-      <w:r>
-        <w:rPr>
-          <w:b w:val="0"/>
-          <w:sz w:val="24"/>
-          <w:szCs w:val="24"/>
-        </w:rPr>
-        <w:t>design</w:t>
-      </w:r>
-      <w:r>
-        <w:rPr>
-          <w:b w:val="0"/>
-          <w:sz w:val="24"/>
-          <w:szCs w:val="24"/>
-        </w:rPr>
-        <w:t xml:space="preserve">, development, and deployment of </w:t>
-      </w:r>
-      <w:r>
-        <w:rPr>
-          <w:b w:val="0"/>
-          <w:sz w:val="24"/>
-          <w:szCs w:val="24"/>
-        </w:rPr>
-        <w:t xml:space="preserve">highly </w:t>
-      </w:r>
-      <w:r>
-        <w:rPr>
-          <w:b w:val="0"/>
-          <w:sz w:val="24"/>
-          <w:szCs w:val="24"/>
-        </w:rPr>
-        <w:t xml:space="preserve">scalable </w:t>
-      </w:r>
-      <w:r>
-        <w:rPr>
-          <w:b w:val="0"/>
-          <w:sz w:val="24"/>
-          <w:szCs w:val="24"/>
-        </w:rPr>
-        <w:t xml:space="preserve">software solutions </w:t>
-      </w:r>
-      <w:r>
-        <w:rPr>
-          <w:b w:val="0"/>
-          <w:sz w:val="24"/>
-          <w:szCs w:val="24"/>
-        </w:rPr>
-        <w:t>and microservices.</w:t>
+        <w:t xml:space="preserve">Automated </w:t>
+      </w:r>
+      <w:r>
+        <w:rPr>
+          <w:bCs w:val="0"/>
+          <w:sz w:val="24"/>
+          <w:szCs w:val="24"/>
+        </w:rPr>
+        <w:t>Amazon Same-Day Delivery</w:t>
+      </w:r>
+      <w:r>
+        <w:rPr>
+          <w:b w:val="0"/>
+          <w:sz w:val="24"/>
+          <w:szCs w:val="24"/>
+        </w:rPr>
+        <w:t xml:space="preserve"> catalog refresh, reducing update time </w:t>
+      </w:r>
+      <w:r>
+        <w:rPr>
+          <w:bCs w:val="0"/>
+          <w:sz w:val="24"/>
+          <w:szCs w:val="24"/>
+        </w:rPr>
+        <w:t>by 12 hours</w:t>
+      </w:r>
+      <w:r>
+        <w:rPr>
+          <w:b w:val="0"/>
+          <w:sz w:val="24"/>
+          <w:szCs w:val="24"/>
+        </w:rPr>
+        <w:t>, improving data freshness, and eliminating manual effort.</w:t>
       </w:r>
     </w:p>
     <w:p>
@@ -1705,39 +1757,15 @@
           <w:sz w:val="24"/>
           <w:szCs w:val="24"/>
         </w:rPr>
-        <w:t xml:space="preserve">Automated </w:t>
-      </w:r>
-      <w:r>
-        <w:rPr>
-          <w:bCs w:val="0"/>
-          <w:sz w:val="24"/>
-          <w:szCs w:val="24"/>
-        </w:rPr>
-        <w:t>Amazon Same-Day Delivery</w:t>
-      </w:r>
-      <w:r>
-        <w:rPr>
-          <w:b w:val="0"/>
-          <w:sz w:val="24"/>
-          <w:szCs w:val="24"/>
-        </w:rPr>
-        <w:t xml:space="preserve"> catalog refresh, reducing update time </w:t>
-      </w:r>
-      <w:r>
-        <w:rPr>
-          <w:bCs w:val="0"/>
-          <w:sz w:val="24"/>
-          <w:szCs w:val="24"/>
-        </w:rPr>
-        <w:t>by 12 hours</w:t>
-      </w:r>
-      <w:r>
-        <w:rPr>
-          <w:b w:val="0"/>
-          <w:sz w:val="24"/>
-          <w:szCs w:val="24"/>
-        </w:rPr>
-        <w:t>, improving data freshness, and eliminating manual effort.</w:t>
+        <w:t>Proactively refactored system logic to remove redundant API checks to an external service, improving efficiency and reducing latency</w:t>
+      </w:r>
+      <w:r>
+        <w:rPr>
+          <w:b w:val="0"/>
+          <w:sz w:val="24"/>
+          <w:szCs w:val="24"/>
+        </w:rPr>
+        <w:t>.</w:t>
       </w:r>
     </w:p>
     <w:p>
@@ -1762,7 +1790,39 @@
           <w:sz w:val="24"/>
           <w:szCs w:val="24"/>
         </w:rPr>
-        <w:t>Proactively refactored system logic to remove redundant API checks to an external service, improving efficiency and reducing latency</w:t>
+        <w:t xml:space="preserve">Developed an </w:t>
+      </w:r>
+      <w:r>
+        <w:rPr>
+          <w:bCs w:val="0"/>
+          <w:sz w:val="24"/>
+          <w:szCs w:val="24"/>
+        </w:rPr>
+        <w:t>ML-powered “Frequently Bought Together”</w:t>
+      </w:r>
+      <w:r>
+        <w:rPr>
+          <w:b w:val="0"/>
+          <w:sz w:val="24"/>
+          <w:szCs w:val="24"/>
+        </w:rPr>
+        <w:t xml:space="preserve"> widget, driving $1</w:t>
+      </w:r>
+      <w:r>
+        <w:rPr>
+          <w:b w:val="0"/>
+          <w:sz w:val="24"/>
+          <w:szCs w:val="24"/>
+        </w:rPr>
+        <w:t>0</w:t>
+      </w:r>
+      <w:r>
+        <w:rPr>
+          <w:b w:val="0"/>
+          <w:sz w:val="24"/>
+          <w:szCs w:val="24"/>
+        </w:rPr>
+        <w:t>0K+ in revenue</w:t>
       </w:r>
       <w:r>
         <w:rPr>
@@ -1795,47 +1855,31 @@
           <w:sz w:val="24"/>
           <w:szCs w:val="24"/>
         </w:rPr>
-        <w:t xml:space="preserve">Developed an </w:t>
-      </w:r>
-      <w:r>
-        <w:rPr>
-          <w:bCs w:val="0"/>
-          <w:sz w:val="24"/>
-          <w:szCs w:val="24"/>
-        </w:rPr>
-        <w:t>ML-powered “Frequently Bought Together”</w:t>
-      </w:r>
-      <w:r>
-        <w:rPr>
-          <w:b w:val="0"/>
-          <w:sz w:val="24"/>
-          <w:szCs w:val="24"/>
-        </w:rPr>
-        <w:t xml:space="preserve"> widget, driving $1</w:t>
-      </w:r>
-      <w:r>
-        <w:rPr>
-          <w:b w:val="0"/>
-          <w:sz w:val="24"/>
-          <w:szCs w:val="24"/>
-        </w:rPr>
-        <w:t>0</w:t>
-      </w:r>
-      <w:r>
-        <w:rPr>
-          <w:b w:val="0"/>
-          <w:sz w:val="24"/>
-          <w:szCs w:val="24"/>
-        </w:rPr>
-        <w:t>0K+ in revenue</w:t>
-      </w:r>
-      <w:r>
-        <w:rPr>
-          <w:b w:val="0"/>
-          <w:sz w:val="24"/>
-          <w:szCs w:val="24"/>
-        </w:rPr>
-        <w:t>.</w:t>
+        <w:t xml:space="preserve">Spearheaded the development of a high-throughput inventory catalog service, slashing ticket numbers </w:t>
+      </w:r>
+      <w:r>
+        <w:rPr>
+          <w:bCs w:val="0"/>
+          <w:sz w:val="24"/>
+          <w:szCs w:val="24"/>
+        </w:rPr>
+        <w:t xml:space="preserve">by 20% </w:t>
+      </w:r>
+      <w:r>
+        <w:rPr>
+          <w:b w:val="0"/>
+          <w:sz w:val="24"/>
+          <w:szCs w:val="24"/>
+        </w:rPr>
+        <w:t xml:space="preserve">and improving data freshness by over </w:t>
+      </w:r>
+      <w:r>
+        <w:rPr>
+          <w:bCs w:val="0"/>
+          <w:sz w:val="24"/>
+          <w:szCs w:val="24"/>
+        </w:rPr>
+        <w:t>10 hours.</w:t>
       </w:r>
     </w:p>
     <w:p>
@@ -1860,31 +1904,31 @@
           <w:sz w:val="24"/>
           <w:szCs w:val="24"/>
         </w:rPr>
-        <w:t xml:space="preserve">Spearheaded the development of a high-throughput inventory catalog service, slashing ticket numbers </w:t>
-      </w:r>
-      <w:r>
-        <w:rPr>
-          <w:bCs w:val="0"/>
-          <w:sz w:val="24"/>
-          <w:szCs w:val="24"/>
-        </w:rPr>
-        <w:t xml:space="preserve">by 20% </w:t>
-      </w:r>
-      <w:r>
-        <w:rPr>
-          <w:b w:val="0"/>
-          <w:sz w:val="24"/>
-          <w:szCs w:val="24"/>
-        </w:rPr>
-        <w:t xml:space="preserve">and improving data freshness by over </w:t>
-      </w:r>
-      <w:r>
-        <w:rPr>
-          <w:bCs w:val="0"/>
-          <w:sz w:val="24"/>
-          <w:szCs w:val="24"/>
-        </w:rPr>
-        <w:t>10 hours.</w:t>
+        <w:t>Engineered</w:t>
+      </w:r>
+      <w:r>
+        <w:rPr>
+          <w:b w:val="0"/>
+          <w:sz w:val="24"/>
+          <w:szCs w:val="24"/>
+        </w:rPr>
+        <w:t xml:space="preserve"> CI/CD infrastructure design, complete with monitoring, </w:t>
+      </w:r>
+      <w:r>
+        <w:rPr>
+          <w:bCs w:val="0"/>
+          <w:sz w:val="24"/>
+          <w:szCs w:val="24"/>
+        </w:rPr>
+        <w:t>anomaly detection</w:t>
+      </w:r>
+      <w:r>
+        <w:rPr>
+          <w:b w:val="0"/>
+          <w:sz w:val="24"/>
+          <w:szCs w:val="24"/>
+        </w:rPr>
+        <w:t>, and alarms.</w:t>
       </w:r>
     </w:p>
     <w:p>
@@ -1909,31 +1953,7 @@
           <w:sz w:val="24"/>
           <w:szCs w:val="24"/>
         </w:rPr>
-        <w:t>Engineered</w:t>
-      </w:r>
-      <w:r>
-        <w:rPr>
-          <w:b w:val="0"/>
-          <w:sz w:val="24"/>
-          <w:szCs w:val="24"/>
-        </w:rPr>
-        <w:t xml:space="preserve"> CI/CD infrastructure design, complete with monitoring, </w:t>
-      </w:r>
-      <w:r>
-        <w:rPr>
-          <w:bCs w:val="0"/>
-          <w:sz w:val="24"/>
-          <w:szCs w:val="24"/>
-        </w:rPr>
-        <w:t>anomaly detection</w:t>
-      </w:r>
-      <w:r>
-        <w:rPr>
-          <w:b w:val="0"/>
-          <w:sz w:val="24"/>
-          <w:szCs w:val="24"/>
-        </w:rPr>
-        <w:t>, and alarms.</w:t>
+        <w:t>Played a pivotal role in 24/7 on-call rotations, addressing cross-team production challenges.</w:t>
       </w:r>
     </w:p>
     <w:p>
@@ -1948,17 +1968,20 @@
         <w:jc w:val="both"/>
         <w:rPr>
           <w:b w:val="0"/>
-          <w:sz w:val="24"/>
-          <w:szCs w:val="24"/>
-        </w:rPr>
-      </w:pPr>
-      <w:r>
-        <w:rPr>
-          <w:b w:val="0"/>
-          <w:sz w:val="24"/>
-          <w:szCs w:val="24"/>
-        </w:rPr>
-        <w:t>Played a pivotal role in 24/7 on-call rotations, addressing cross-team production challenges.</w:t>
+          <w:bCs w:val="0"/>
+          <w:sz w:val="24"/>
+          <w:szCs w:val="24"/>
+        </w:rPr>
+      </w:pPr>
+      <w:r>
+        <w:rPr>
+          <w:b w:val="0"/>
+          <w:bCs w:val="0"/>
+          <w:sz w:val="24"/>
+          <w:szCs w:val="24"/>
+        </w:rPr>
+        <w:lastRenderedPageBreak/>
+        <w:t>Oversaw extensive online feature experiments, leveraging feature flags (A/B tests) and production traffic.</w:t>
       </w:r>
     </w:p>
     <w:p>
@@ -1973,17 +1996,76 @@
         <w:jc w:val="both"/>
         <w:rPr>
           <w:b w:val="0"/>
-          <w:sz w:val="24"/>
-          <w:szCs w:val="24"/>
-        </w:rPr>
-      </w:pPr>
-      <w:r>
-        <w:rPr>
-          <w:b w:val="0"/>
-          <w:sz w:val="24"/>
-          <w:szCs w:val="24"/>
-        </w:rPr>
-        <w:t>Oversaw extensive online feature experiments, leveraging feature flags (A/B tests) and production traffic.</w:t>
+          <w:bCs w:val="0"/>
+          <w:sz w:val="24"/>
+          <w:szCs w:val="24"/>
+        </w:rPr>
+      </w:pPr>
+      <w:r>
+        <w:rPr>
+          <w:b w:val="0"/>
+          <w:bCs w:val="0"/>
+          <w:sz w:val="24"/>
+          <w:szCs w:val="24"/>
+        </w:rPr>
+        <w:t>Built automated ETL pipelines to deliver ML-driven data to Amazon widgets.</w:t>
+      </w:r>
+    </w:p>
+    <w:p>
+      <w:pPr>
+        <w:pStyle w:val="Heading2"/>
+        <w:tabs>
+          <w:tab w:val="right" w:pos="10440"/>
+        </w:tabs>
+        <w:spacing w:before="120" w:after="60"/>
+        <w:ind w:left="0"/>
+        <w:rPr>
+          <w:sz w:val="25"/>
+          <w:szCs w:val="25"/>
+        </w:rPr>
+      </w:pPr>
+      <w:r>
+        <w:rPr>
+          <w:sz w:val="25"/>
+          <w:szCs w:val="25"/>
+        </w:rPr>
+        <w:t>MICROSOFT</w:t>
+      </w:r>
+      <w:r>
+        <w:rPr>
+          <w:sz w:val="25"/>
+          <w:szCs w:val="25"/>
+        </w:rPr>
+        <w:t>, Redmond, WA</w:t>
+      </w:r>
+      <w:r>
+        <w:rPr>
+          <w:sz w:val="25"/>
+          <w:szCs w:val="25"/>
+        </w:rPr>
+        <w:t xml:space="preserve"> - </w:t>
+      </w:r>
+      <w:r>
+        <w:rPr>
+          <w:sz w:val="25"/>
+          <w:szCs w:val="25"/>
+        </w:rPr>
+        <w:t>Software Development Engineer</w:t>
+      </w:r>
+      <w:r>
+        <w:rPr>
+          <w:sz w:val="25"/>
+          <w:szCs w:val="25"/>
+        </w:rPr>
+        <w:tab/>
+        <w:t xml:space="preserve">June 2021 – </w:t>
+      </w:r>
+      <w:r>
+        <w:rPr>
+          <w:sz w:val="25"/>
+          <w:szCs w:val="25"/>
+        </w:rPr>
+        <w:t>June 2022</w:t>
       </w:r>
     </w:p>
     <w:p>
@@ -1997,67 +2079,26 @@
         <w:ind w:left="273" w:hanging="187"/>
         <w:jc w:val="both"/>
         <w:rPr>
-          <w:sz w:val="25"/>
-          <w:szCs w:val="25"/>
-        </w:rPr>
-      </w:pPr>
-      <w:r>
-        <w:rPr>
-          <w:b w:val="0"/>
-          <w:sz w:val="24"/>
-          <w:szCs w:val="24"/>
-        </w:rPr>
-        <w:t>Built automated ETL pipelines to deliver ML-driven data to Amazon widgets.</w:t>
-      </w:r>
-      <w:r>
-        <w:rPr>
-          <w:sz w:val="25"/>
-          <w:szCs w:val="25"/>
-        </w:rPr>
-        <w:br w:type="page"/>
-      </w:r>
-    </w:p>
-    <w:p>
-      <w:pPr>
-        <w:pStyle w:val="Heading2"/>
-        <w:tabs>
-          <w:tab w:val="right" w:pos="10440"/>
-        </w:tabs>
-        <w:spacing w:before="120" w:after="60"/>
-        <w:ind w:left="0"/>
-        <w:rPr>
-          <w:sz w:val="25"/>
-          <w:szCs w:val="25"/>
-        </w:rPr>
-      </w:pPr>
-      <w:r>
-        <w:rPr>
-          <w:sz w:val="25"/>
-          <w:szCs w:val="25"/>
-        </w:rPr>
-        <w:t>MICROSOFT</w:t>
-      </w:r>
-      <w:r>
-        <w:rPr>
-          <w:sz w:val="25"/>
-          <w:szCs w:val="25"/>
-        </w:rPr>
-        <w:t>, Redmond, WA, Software Development Engineer</w:t>
-      </w:r>
-      <w:r>
-        <w:rPr>
-          <w:sz w:val="25"/>
-          <w:szCs w:val="25"/>
-        </w:rPr>
-        <w:tab/>
-        <w:t xml:space="preserve">June 2021 – </w:t>
-      </w:r>
-      <w:r>
-        <w:rPr>
-          <w:sz w:val="25"/>
-          <w:szCs w:val="25"/>
-        </w:rPr>
-        <w:t>June 2022</w:t>
+          <w:b w:val="0"/>
+          <w:sz w:val="24"/>
+          <w:szCs w:val="24"/>
+        </w:rPr>
+      </w:pPr>
+      <w:r>
+        <w:rPr>
+          <w:b w:val="0"/>
+          <w:sz w:val="24"/>
+          <w:szCs w:val="24"/>
+        </w:rPr>
+        <w:t>Spearheaded the global device management microservice, enhancing seamless device interactions</w:t>
+      </w:r>
+      <w:r>
+        <w:rPr>
+          <w:b w:val="0"/>
+          <w:sz w:val="24"/>
+          <w:szCs w:val="24"/>
+        </w:rPr>
+        <w:t>.</w:t>
       </w:r>
     </w:p>
     <w:p>
@@ -2082,15 +2123,7 @@
           <w:sz w:val="24"/>
           <w:szCs w:val="24"/>
         </w:rPr>
-        <w:t>Spearheaded the global device management microservice, enhancing seamless device interactions</w:t>
-      </w:r>
-      <w:r>
-        <w:rPr>
-          <w:b w:val="0"/>
-          <w:sz w:val="24"/>
-          <w:szCs w:val="24"/>
-        </w:rPr>
-        <w:t>.</w:t>
+        <w:t>Developed and implemented a system to dynamically execute Python scripts and manage dependencies for a vast network of routers.</w:t>
       </w:r>
     </w:p>
     <w:p>
@@ -2115,7 +2148,23 @@
           <w:sz w:val="24"/>
           <w:szCs w:val="24"/>
         </w:rPr>
-        <w:t>Developed and implemented a system to dynamically execute Python scripts and manage dependencies for a vast network of routers.</w:t>
+        <w:t xml:space="preserve">Established </w:t>
+      </w:r>
+      <w:r>
+        <w:rPr>
+          <w:b w:val="0"/>
+          <w:sz w:val="24"/>
+          <w:szCs w:val="24"/>
+        </w:rPr>
+        <w:t xml:space="preserve">KPIs </w:t>
+      </w:r>
+      <w:r>
+        <w:rPr>
+          <w:b w:val="0"/>
+          <w:sz w:val="24"/>
+          <w:szCs w:val="24"/>
+        </w:rPr>
+        <w:t>and monitoring tools for emerging services overseeing thousands of devices.</w:t>
       </w:r>
     </w:p>
     <w:p>
@@ -2140,23 +2189,23 @@
           <w:sz w:val="24"/>
           <w:szCs w:val="24"/>
         </w:rPr>
-        <w:t xml:space="preserve">Established </w:t>
-      </w:r>
-      <w:r>
-        <w:rPr>
-          <w:b w:val="0"/>
-          <w:sz w:val="24"/>
-          <w:szCs w:val="24"/>
-        </w:rPr>
-        <w:t xml:space="preserve">KPIs </w:t>
-      </w:r>
-      <w:r>
-        <w:rPr>
-          <w:b w:val="0"/>
-          <w:sz w:val="24"/>
-          <w:szCs w:val="24"/>
-        </w:rPr>
-        <w:t>and monitoring tools for emerging services overseeing thousands of devices.</w:t>
+        <w:t xml:space="preserve">Participated in </w:t>
+      </w:r>
+      <w:r>
+        <w:rPr>
+          <w:bCs w:val="0"/>
+          <w:sz w:val="24"/>
+          <w:szCs w:val="24"/>
+        </w:rPr>
+        <w:t>24/7 on-call rotations</w:t>
+      </w:r>
+      <w:r>
+        <w:rPr>
+          <w:b w:val="0"/>
+          <w:sz w:val="24"/>
+          <w:szCs w:val="24"/>
+        </w:rPr>
+        <w:t xml:space="preserve"> to troubleshoot production issues across cross-functional teams.</w:t>
       </w:r>
     </w:p>
     <w:p>
@@ -2171,33 +2220,37 @@
         <w:jc w:val="both"/>
         <w:rPr>
           <w:b w:val="0"/>
-          <w:sz w:val="24"/>
-          <w:szCs w:val="24"/>
-        </w:rPr>
-      </w:pPr>
-      <w:r>
-        <w:rPr>
-          <w:b w:val="0"/>
-          <w:sz w:val="24"/>
-          <w:szCs w:val="24"/>
-        </w:rPr>
-        <w:t xml:space="preserve">Participated in </w:t>
-      </w:r>
-      <w:r>
-        <w:rPr>
-          <w:bCs w:val="0"/>
-          <w:sz w:val="24"/>
-          <w:szCs w:val="24"/>
-        </w:rPr>
-        <w:t>24/7 on-call rotations</w:t>
-      </w:r>
-      <w:r>
-        <w:rPr>
-          <w:b w:val="0"/>
-          <w:sz w:val="24"/>
-          <w:szCs w:val="24"/>
-        </w:rPr>
-        <w:t xml:space="preserve"> to troubleshoot production issues across cross-functional teams.</w:t>
+          <w:bCs w:val="0"/>
+          <w:sz w:val="24"/>
+          <w:szCs w:val="24"/>
+        </w:rPr>
+      </w:pPr>
+      <w:r>
+        <w:rPr>
+          <w:b w:val="0"/>
+          <w:bCs w:val="0"/>
+          <w:sz w:val="24"/>
+          <w:szCs w:val="24"/>
+        </w:rPr>
+        <w:t xml:space="preserve">Conducted deep-dive root cause analyses for production incidents, </w:t>
+      </w:r>
+      <w:r>
+        <w:rPr>
+          <w:b w:val="0"/>
+          <w:bCs w:val="0"/>
+          <w:sz w:val="24"/>
+          <w:szCs w:val="24"/>
+        </w:rPr>
+        <w:t xml:space="preserve">for </w:t>
+      </w:r>
+      <w:r>
+        <w:rPr>
+          <w:b w:val="0"/>
+          <w:bCs w:val="0"/>
+          <w:sz w:val="24"/>
+          <w:szCs w:val="24"/>
+        </w:rPr>
+        <w:t>long-term stability improvements.</w:t>
       </w:r>
     </w:p>
     <w:p>
@@ -2212,37 +2265,33 @@
         <w:jc w:val="both"/>
         <w:rPr>
           <w:b w:val="0"/>
-          <w:bCs w:val="0"/>
-          <w:sz w:val="24"/>
-          <w:szCs w:val="24"/>
-        </w:rPr>
-      </w:pPr>
-      <w:r>
-        <w:rPr>
-          <w:b w:val="0"/>
-          <w:bCs w:val="0"/>
-          <w:sz w:val="24"/>
-          <w:szCs w:val="24"/>
-        </w:rPr>
-        <w:t xml:space="preserve">Conducted deep-dive root cause analyses for production incidents, </w:t>
-      </w:r>
-      <w:r>
-        <w:rPr>
-          <w:b w:val="0"/>
-          <w:bCs w:val="0"/>
-          <w:sz w:val="24"/>
-          <w:szCs w:val="24"/>
-        </w:rPr>
-        <w:t xml:space="preserve">for </w:t>
-      </w:r>
-      <w:r>
-        <w:rPr>
-          <w:b w:val="0"/>
-          <w:bCs w:val="0"/>
-          <w:sz w:val="24"/>
-          <w:szCs w:val="24"/>
-        </w:rPr>
-        <w:t>long-term stability improvements.</w:t>
+          <w:sz w:val="24"/>
+          <w:szCs w:val="24"/>
+        </w:rPr>
+      </w:pPr>
+      <w:r>
+        <w:rPr>
+          <w:b w:val="0"/>
+          <w:sz w:val="24"/>
+          <w:szCs w:val="24"/>
+        </w:rPr>
+        <w:t xml:space="preserve">Reduced new device configuration time </w:t>
+      </w:r>
+      <w:r>
+        <w:rPr>
+          <w:bCs w:val="0"/>
+          <w:sz w:val="24"/>
+          <w:szCs w:val="24"/>
+        </w:rPr>
+        <w:t>by 50%</w:t>
+      </w:r>
+      <w:r>
+        <w:rPr>
+          <w:b w:val="0"/>
+          <w:sz w:val="24"/>
+          <w:szCs w:val="24"/>
+        </w:rPr>
+        <w:t xml:space="preserve"> through advanced caching optimizations.</w:t>
       </w:r>
     </w:p>
     <w:p>
@@ -2267,60 +2316,8 @@
           <w:sz w:val="24"/>
           <w:szCs w:val="24"/>
         </w:rPr>
-        <w:lastRenderedPageBreak/>
-        <w:t xml:space="preserve">Reduced new device configuration time </w:t>
-      </w:r>
-      <w:r>
-        <w:rPr>
-          <w:bCs w:val="0"/>
-          <w:sz w:val="24"/>
-          <w:szCs w:val="24"/>
-        </w:rPr>
-        <w:t>by 50%</w:t>
-      </w:r>
-      <w:r>
-        <w:rPr>
-          <w:b w:val="0"/>
-          <w:sz w:val="24"/>
-          <w:szCs w:val="24"/>
-        </w:rPr>
-        <w:t xml:space="preserve"> through advanced caching optimizations.</w:t>
-      </w:r>
-    </w:p>
-    <w:p>
-      <w:pPr>
-        <w:pStyle w:val="Heading2"/>
-        <w:numPr>
-          <w:ilvl w:val="0"/>
-          <w:numId w:val="6"/>
-        </w:numPr>
-        <w:spacing w:before="0"/>
-        <w:ind w:left="273" w:hanging="187"/>
-        <w:jc w:val="both"/>
-        <w:rPr>
-          <w:b w:val="0"/>
-          <w:sz w:val="24"/>
-          <w:szCs w:val="24"/>
-        </w:rPr>
-      </w:pPr>
-      <w:r>
-        <w:rPr>
-          <w:b w:val="0"/>
-          <w:sz w:val="24"/>
-          <w:szCs w:val="24"/>
-        </w:rPr>
         <w:t>Migrated internal APIs to a new in-house platform, enhancing maintainability, performance, and integration consistency across services.</w:t>
       </w:r>
-    </w:p>
-    <w:p>
-      <w:pPr>
-        <w:rPr>
-          <w:b/>
-          <w:bCs/>
-          <w:sz w:val="24"/>
-          <w:szCs w:val="24"/>
-        </w:rPr>
-      </w:pPr>
     </w:p>
     <w:p>
       <w:pPr>
@@ -2348,7 +2345,21 @@
           <w:sz w:val="24"/>
           <w:szCs w:val="24"/>
         </w:rPr>
-        <w:t>, Oregon, Software Development Engineer</w:t>
+        <w:t>, Oregon</w:t>
+      </w:r>
+      <w:r>
+        <w:rPr>
+          <w:sz w:val="24"/>
+          <w:szCs w:val="24"/>
+        </w:rPr>
+        <w:t xml:space="preserve"> -</w:t>
+      </w:r>
+      <w:r>
+        <w:rPr>
+          <w:sz w:val="24"/>
+          <w:szCs w:val="24"/>
+        </w:rPr>
+        <w:t xml:space="preserve"> Software Development Engineer</w:t>
       </w:r>
       <w:r>
         <w:rPr>
@@ -2647,6 +2658,13 @@
           <w:sz w:val="24"/>
           <w:szCs w:val="24"/>
         </w:rPr>
+        <w:t xml:space="preserve">Cary, NC - </w:t>
+      </w:r>
+      <w:r>
+        <w:rPr>
+          <w:sz w:val="24"/>
+          <w:szCs w:val="24"/>
+        </w:rPr>
         <w:t xml:space="preserve">Software Engineering </w:t>
       </w:r>
       <w:r>
@@ -2717,7 +2735,6 @@
           <w:sz w:val="24"/>
           <w:szCs w:val="24"/>
         </w:rPr>
-        <w:lastRenderedPageBreak/>
         <w:t>Engineered Intel Saffron’s Java-based REST API for AI services, integrating advanced security protocols and complex classification and recommendation modules.</w:t>
       </w:r>
     </w:p>
@@ -3617,6 +3634,118 @@
     </w:lvl>
   </w:abstractNum>
   <w:abstractNum w:abstractNumId="4" w15:restartNumberingAfterBreak="0">
+    <w:nsid w:val="21172827"/>
+    <w:multiLevelType w:val="hybridMultilevel"/>
+    <w:tmpl w:val="CF30DD46"/>
+    <w:lvl w:ilvl="0" w:tplc="0C9C42AA">
+      <w:numFmt w:val="bullet"/>
+      <w:lvlText w:val=""/>
+      <w:lvlJc w:val="left"/>
+      <w:pPr>
+        <w:ind w:left="720" w:hanging="360"/>
+      </w:pPr>
+      <w:rPr>
+        <w:rFonts w:ascii="Symbol" w:eastAsia="Calibri" w:hAnsi="Symbol" w:cs="Calibri" w:hint="default"/>
+      </w:rPr>
+    </w:lvl>
+    <w:lvl w:ilvl="1" w:tplc="04090003" w:tentative="1">
+      <w:start w:val="1"/>
+      <w:numFmt w:val="bullet"/>
+      <w:lvlText w:val="o"/>
+      <w:lvlJc w:val="left"/>
+      <w:pPr>
+        <w:ind w:left="1440" w:hanging="360"/>
+      </w:pPr>
+      <w:rPr>
+        <w:rFonts w:ascii="Courier New" w:hAnsi="Courier New" w:cs="Courier New" w:hint="default"/>
+      </w:rPr>
+    </w:lvl>
+    <w:lvl w:ilvl="2" w:tplc="04090005" w:tentative="1">
+      <w:start w:val="1"/>
+      <w:numFmt w:val="bullet"/>
+      <w:lvlText w:val=""/>
+      <w:lvlJc w:val="left"/>
+      <w:pPr>
+        <w:ind w:left="2160" w:hanging="360"/>
+      </w:pPr>
+      <w:rPr>
+        <w:rFonts w:ascii="Wingdings" w:hAnsi="Wingdings" w:hint="default"/>
+      </w:rPr>
+    </w:lvl>
+    <w:lvl w:ilvl="3" w:tplc="04090001" w:tentative="1">
+      <w:start w:val="1"/>
+      <w:numFmt w:val="bullet"/>
+      <w:lvlText w:val=""/>
+      <w:lvlJc w:val="left"/>
+      <w:pPr>
+        <w:ind w:left="2880" w:hanging="360"/>
+      </w:pPr>
+      <w:rPr>
+        <w:rFonts w:ascii="Symbol" w:hAnsi="Symbol" w:hint="default"/>
+      </w:rPr>
+    </w:lvl>
+    <w:lvl w:ilvl="4" w:tplc="04090003" w:tentative="1">
+      <w:start w:val="1"/>
+      <w:numFmt w:val="bullet"/>
+      <w:lvlText w:val="o"/>
+      <w:lvlJc w:val="left"/>
+      <w:pPr>
+        <w:ind w:left="3600" w:hanging="360"/>
+      </w:pPr>
+      <w:rPr>
+        <w:rFonts w:ascii="Courier New" w:hAnsi="Courier New" w:cs="Courier New" w:hint="default"/>
+      </w:rPr>
+    </w:lvl>
+    <w:lvl w:ilvl="5" w:tplc="04090005" w:tentative="1">
+      <w:start w:val="1"/>
+      <w:numFmt w:val="bullet"/>
+      <w:lvlText w:val=""/>
+      <w:lvlJc w:val="left"/>
+      <w:pPr>
+        <w:ind w:left="4320" w:hanging="360"/>
+      </w:pPr>
+      <w:rPr>
+        <w:rFonts w:ascii="Wingdings" w:hAnsi="Wingdings" w:hint="default"/>
+      </w:rPr>
+    </w:lvl>
+    <w:lvl w:ilvl="6" w:tplc="04090001" w:tentative="1">
+      <w:start w:val="1"/>
+      <w:numFmt w:val="bullet"/>
+      <w:lvlText w:val=""/>
+      <w:lvlJc w:val="left"/>
+      <w:pPr>
+        <w:ind w:left="5040" w:hanging="360"/>
+      </w:pPr>
+      <w:rPr>
+        <w:rFonts w:ascii="Symbol" w:hAnsi="Symbol" w:hint="default"/>
+      </w:rPr>
+    </w:lvl>
+    <w:lvl w:ilvl="7" w:tplc="04090003" w:tentative="1">
+      <w:start w:val="1"/>
+      <w:numFmt w:val="bullet"/>
+      <w:lvlText w:val="o"/>
+      <w:lvlJc w:val="left"/>
+      <w:pPr>
+        <w:ind w:left="5760" w:hanging="360"/>
+      </w:pPr>
+      <w:rPr>
+        <w:rFonts w:ascii="Courier New" w:hAnsi="Courier New" w:cs="Courier New" w:hint="default"/>
+      </w:rPr>
+    </w:lvl>
+    <w:lvl w:ilvl="8" w:tplc="04090005" w:tentative="1">
+      <w:start w:val="1"/>
+      <w:numFmt w:val="bullet"/>
+      <w:lvlText w:val=""/>
+      <w:lvlJc w:val="left"/>
+      <w:pPr>
+        <w:ind w:left="6480" w:hanging="360"/>
+      </w:pPr>
+      <w:rPr>
+        <w:rFonts w:ascii="Wingdings" w:hAnsi="Wingdings" w:hint="default"/>
+      </w:rPr>
+    </w:lvl>
+  </w:abstractNum>
+  <w:abstractNum w:abstractNumId="5" w15:restartNumberingAfterBreak="0">
     <w:nsid w:val="27424990"/>
     <w:multiLevelType w:val="hybridMultilevel"/>
     <w:tmpl w:val="A192DF6C"/>
@@ -3728,7 +3857,7 @@
       </w:rPr>
     </w:lvl>
   </w:abstractNum>
-  <w:abstractNum w:abstractNumId="5" w15:restartNumberingAfterBreak="0">
+  <w:abstractNum w:abstractNumId="6" w15:restartNumberingAfterBreak="0">
     <w:nsid w:val="2B6C0847"/>
     <w:multiLevelType w:val="hybridMultilevel"/>
     <w:tmpl w:val="A77EFC9E"/>
@@ -3841,7 +3970,7 @@
       </w:rPr>
     </w:lvl>
   </w:abstractNum>
-  <w:abstractNum w:abstractNumId="6" w15:restartNumberingAfterBreak="0">
+  <w:abstractNum w:abstractNumId="7" w15:restartNumberingAfterBreak="0">
     <w:nsid w:val="377E0CEB"/>
     <w:multiLevelType w:val="multilevel"/>
     <w:tmpl w:val="A66629DC"/>
@@ -3990,7 +4119,7 @@
       </w:rPr>
     </w:lvl>
   </w:abstractNum>
-  <w:abstractNum w:abstractNumId="7" w15:restartNumberingAfterBreak="0">
+  <w:abstractNum w:abstractNumId="8" w15:restartNumberingAfterBreak="0">
     <w:nsid w:val="40C16F4B"/>
     <w:multiLevelType w:val="hybridMultilevel"/>
     <w:tmpl w:val="D6A4E44E"/>
@@ -4103,7 +4232,7 @@
       </w:rPr>
     </w:lvl>
   </w:abstractNum>
-  <w:abstractNum w:abstractNumId="8" w15:restartNumberingAfterBreak="0">
+  <w:abstractNum w:abstractNumId="9" w15:restartNumberingAfterBreak="0">
     <w:nsid w:val="4EB544C2"/>
     <w:multiLevelType w:val="hybridMultilevel"/>
     <w:tmpl w:val="F6445294"/>
@@ -4216,7 +4345,7 @@
       </w:rPr>
     </w:lvl>
   </w:abstractNum>
-  <w:abstractNum w:abstractNumId="9" w15:restartNumberingAfterBreak="0">
+  <w:abstractNum w:abstractNumId="10" w15:restartNumberingAfterBreak="0">
     <w:nsid w:val="71286132"/>
     <w:multiLevelType w:val="hybridMultilevel"/>
     <w:tmpl w:val="C332FF1A"/>
@@ -4329,7 +4458,7 @@
       </w:rPr>
     </w:lvl>
   </w:abstractNum>
-  <w:abstractNum w:abstractNumId="10" w15:restartNumberingAfterBreak="0">
+  <w:abstractNum w:abstractNumId="11" w15:restartNumberingAfterBreak="0">
     <w:nsid w:val="7B21624A"/>
     <w:multiLevelType w:val="hybridMultilevel"/>
     <w:tmpl w:val="D9682C58"/>
@@ -4444,7 +4573,7 @@
     </w:lvl>
   </w:abstractNum>
   <w:num w:numId="1" w16cid:durableId="429475535">
-    <w:abstractNumId w:val="10"/>
+    <w:abstractNumId w:val="11"/>
   </w:num>
   <w:num w:numId="2" w16cid:durableId="2011827015">
     <w:abstractNumId w:val="1"/>
@@ -4453,13 +4582,13 @@
     <w:abstractNumId w:val="0"/>
   </w:num>
   <w:num w:numId="4" w16cid:durableId="1135682530">
-    <w:abstractNumId w:val="5"/>
+    <w:abstractNumId w:val="6"/>
   </w:num>
   <w:num w:numId="5" w16cid:durableId="62484708">
-    <w:abstractNumId w:val="7"/>
+    <w:abstractNumId w:val="8"/>
   </w:num>
   <w:num w:numId="6" w16cid:durableId="811825007">
-    <w:abstractNumId w:val="4"/>
+    <w:abstractNumId w:val="5"/>
   </w:num>
   <w:num w:numId="7" w16cid:durableId="1452549051">
     <w:abstractNumId w:val="2"/>
@@ -4468,13 +4597,16 @@
     <w:abstractNumId w:val="3"/>
   </w:num>
   <w:num w:numId="9" w16cid:durableId="838083671">
-    <w:abstractNumId w:val="8"/>
+    <w:abstractNumId w:val="9"/>
   </w:num>
   <w:num w:numId="10" w16cid:durableId="1923219457">
-    <w:abstractNumId w:val="9"/>
+    <w:abstractNumId w:val="10"/>
   </w:num>
   <w:num w:numId="11" w16cid:durableId="1133522199">
-    <w:abstractNumId w:val="6"/>
+    <w:abstractNumId w:val="7"/>
+  </w:num>
+  <w:num w:numId="12" w16cid:durableId="144593645">
+    <w:abstractNumId w:val="4"/>
   </w:num>
 </w:numbering>
 </file>
@@ -4923,7 +5055,6 @@
   <w:style w:type="character" w:default="1" w:styleId="DefaultParagraphFont">
     <w:name w:val="Default Paragraph Font"/>
     <w:uiPriority w:val="1"/>
-    <w:semiHidden/>
     <w:unhideWhenUsed/>
   </w:style>
   <w:style w:type="table" w:default="1" w:styleId="TableNormal">
@@ -5491,12 +5622,19 @@
 </file>
 
 <file path=customXml/item1.xml><?xml version="1.0" encoding="utf-8"?>
-<p:properties xmlns:p="http://schemas.microsoft.com/office/2006/metadata/properties" xmlns:xsi="http://www.w3.org/2001/XMLSchema-instance" xmlns:pc="http://schemas.microsoft.com/office/infopath/2007/PartnerControls">
-  <documentManagement/>
-</p:properties>
+<?mso-contentType ?>
+<FormTemplates xmlns="http://schemas.microsoft.com/sharepoint/v3/contenttype/forms">
+  <Display>DocumentLibraryForm</Display>
+  <Edit>DocumentLibraryForm</Edit>
+  <New>DocumentLibraryForm</New>
+</FormTemplates>
 </file>
 
 <file path=customXml/item2.xml><?xml version="1.0" encoding="utf-8"?>
+<b:Sources xmlns:b="http://schemas.openxmlformats.org/officeDocument/2006/bibliography" xmlns="http://schemas.openxmlformats.org/officeDocument/2006/bibliography" SelectedStyle="\APASixthEditionOfficeOnline.xsl" StyleName="APA" Version="6"/>
+</file>
+
+<file path=customXml/item3.xml><?xml version="1.0" encoding="utf-8"?>
 <ct:contentTypeSchema xmlns:ct="http://schemas.microsoft.com/office/2006/metadata/contentType" xmlns:ma="http://schemas.microsoft.com/office/2006/metadata/properties/metaAttributes" ct:_="" ma:_="" ma:contentTypeName="Document" ma:contentTypeID="0x010100C62E9F8080EF9045A3461589C8C739D0" ma:contentTypeVersion="12" ma:contentTypeDescription="Create a new document." ma:contentTypeScope="" ma:versionID="b82a4e0cfbba1a4e0025dcf5a4615212">
   <xsd:schema xmlns:xsd="http://www.w3.org/2001/XMLSchema" xmlns:xs="http://www.w3.org/2001/XMLSchema" xmlns:p="http://schemas.microsoft.com/office/2006/metadata/properties" xmlns:ns3="9237417f-6a90-4707-b345-f61fa45bd513" xmlns:ns4="9a6bc8ff-0751-4fb5-b019-c7731e2305e0" targetNamespace="http://schemas.microsoft.com/office/2006/metadata/properties" ma:root="true" ma:fieldsID="8962f9b60b26a87ae6d308e6e9d5b6bd" ns3:_="" ns4:_="">
     <xsd:import namespace="9237417f-6a90-4707-b345-f61fa45bd513"/>
@@ -5713,37 +5851,29 @@
 </ct:contentTypeSchema>
 </file>
 
-<file path=customXml/item3.xml><?xml version="1.0" encoding="utf-8"?>
-<b:Sources xmlns:b="http://schemas.openxmlformats.org/officeDocument/2006/bibliography" xmlns="http://schemas.openxmlformats.org/officeDocument/2006/bibliography" SelectedStyle="\APASixthEditionOfficeOnline.xsl" StyleName="APA" Version="6"/>
-</file>
-
 <file path=customXml/item4.xml><?xml version="1.0" encoding="utf-8"?>
-<?mso-contentType ?>
-<FormTemplates xmlns="http://schemas.microsoft.com/sharepoint/v3/contenttype/forms">
-  <Display>DocumentLibraryForm</Display>
-  <Edit>DocumentLibraryForm</Edit>
-  <New>DocumentLibraryForm</New>
-</FormTemplates>
+<p:properties xmlns:p="http://schemas.microsoft.com/office/2006/metadata/properties" xmlns:xsi="http://www.w3.org/2001/XMLSchema-instance" xmlns:pc="http://schemas.microsoft.com/office/infopath/2007/PartnerControls">
+  <documentManagement/>
+</p:properties>
 </file>
 
 <file path=customXml/itemProps1.xml><?xml version="1.0" encoding="utf-8"?>
-<ds:datastoreItem xmlns:ds="http://schemas.openxmlformats.org/officeDocument/2006/customXml" ds:itemID="{83F54608-22A7-4AF5-943D-E29461CC7B4C}">
+<ds:datastoreItem xmlns:ds="http://schemas.openxmlformats.org/officeDocument/2006/customXml" ds:itemID="{A6C65B34-06ED-41A8-A3F3-05A1F92025D0}">
   <ds:schemaRefs>
-    <ds:schemaRef ds:uri="http://purl.org/dc/elements/1.1/"/>
-    <ds:schemaRef ds:uri="http://purl.org/dc/dcmitype/"/>
-    <ds:schemaRef ds:uri="http://purl.org/dc/terms/"/>
-    <ds:schemaRef ds:uri="http://schemas.microsoft.com/office/2006/metadata/properties"/>
-    <ds:schemaRef ds:uri="9237417f-6a90-4707-b345-f61fa45bd513"/>
-    <ds:schemaRef ds:uri="http://schemas.microsoft.com/office/2006/documentManagement/types"/>
-    <ds:schemaRef ds:uri="http://schemas.openxmlformats.org/package/2006/metadata/core-properties"/>
-    <ds:schemaRef ds:uri="http://schemas.microsoft.com/office/infopath/2007/PartnerControls"/>
-    <ds:schemaRef ds:uri="9a6bc8ff-0751-4fb5-b019-c7731e2305e0"/>
-    <ds:schemaRef ds:uri="http://www.w3.org/XML/1998/namespace"/>
+    <ds:schemaRef ds:uri="http://schemas.microsoft.com/sharepoint/v3/contenttype/forms"/>
   </ds:schemaRefs>
 </ds:datastoreItem>
 </file>
 
 <file path=customXml/itemProps2.xml><?xml version="1.0" encoding="utf-8"?>
+<ds:datastoreItem xmlns:ds="http://schemas.openxmlformats.org/officeDocument/2006/customXml" ds:itemID="{CC3DF9CB-EAE3-4358-B00B-AEDD1725FC02}">
+  <ds:schemaRefs>
+    <ds:schemaRef ds:uri="http://schemas.openxmlformats.org/officeDocument/2006/bibliography"/>
+  </ds:schemaRefs>
+</ds:datastoreItem>
+</file>
+
+<file path=customXml/itemProps3.xml><?xml version="1.0" encoding="utf-8"?>
 <ds:datastoreItem xmlns:ds="http://schemas.openxmlformats.org/officeDocument/2006/customXml" ds:itemID="{2993B305-E746-423D-81B7-32926B0D6054}">
   <ds:schemaRefs>
     <ds:schemaRef ds:uri="http://schemas.microsoft.com/office/2006/metadata/contentType"/>
@@ -5762,18 +5892,19 @@
 </ds:datastoreItem>
 </file>
 
-<file path=customXml/itemProps3.xml><?xml version="1.0" encoding="utf-8"?>
-<ds:datastoreItem xmlns:ds="http://schemas.openxmlformats.org/officeDocument/2006/customXml" ds:itemID="{CC3DF9CB-EAE3-4358-B00B-AEDD1725FC02}">
+<file path=customXml/itemProps4.xml><?xml version="1.0" encoding="utf-8"?>
+<ds:datastoreItem xmlns:ds="http://schemas.openxmlformats.org/officeDocument/2006/customXml" ds:itemID="{83F54608-22A7-4AF5-943D-E29461CC7B4C}">
   <ds:schemaRefs>
-    <ds:schemaRef ds:uri="http://schemas.openxmlformats.org/officeDocument/2006/bibliography"/>
-  </ds:schemaRefs>
-</ds:datastoreItem>
-</file>
-
-<file path=customXml/itemProps4.xml><?xml version="1.0" encoding="utf-8"?>
-<ds:datastoreItem xmlns:ds="http://schemas.openxmlformats.org/officeDocument/2006/customXml" ds:itemID="{A6C65B34-06ED-41A8-A3F3-05A1F92025D0}">
-  <ds:schemaRefs>
-    <ds:schemaRef ds:uri="http://schemas.microsoft.com/sharepoint/v3/contenttype/forms"/>
+    <ds:schemaRef ds:uri="9a6bc8ff-0751-4fb5-b019-c7731e2305e0"/>
+    <ds:schemaRef ds:uri="http://schemas.microsoft.com/office/infopath/2007/PartnerControls"/>
+    <ds:schemaRef ds:uri="http://schemas.microsoft.com/office/2006/metadata/properties"/>
+    <ds:schemaRef ds:uri="http://www.w3.org/XML/1998/namespace"/>
+    <ds:schemaRef ds:uri="9237417f-6a90-4707-b345-f61fa45bd513"/>
+    <ds:schemaRef ds:uri="http://purl.org/dc/dcmitype/"/>
+    <ds:schemaRef ds:uri="http://schemas.openxmlformats.org/package/2006/metadata/core-properties"/>
+    <ds:schemaRef ds:uri="http://schemas.microsoft.com/office/2006/documentManagement/types"/>
+    <ds:schemaRef ds:uri="http://purl.org/dc/terms/"/>
+    <ds:schemaRef ds:uri="http://purl.org/dc/elements/1.1/"/>
   </ds:schemaRefs>
 </ds:datastoreItem>
 </file>
</xml_diff>